<commit_message>
Version 2.0.2 User Guide
</commit_message>
<xml_diff>
--- a/Using the Electra One Continuum Controller Application.docx
+++ b/Using the Electra One Continuum Controller Application.docx
@@ -1,6 +1,6 @@
 
 <file path=word/document.xml><?xml version="1.0" encoding="utf-8"?>
-<w:document xmlns:wpc="http://schemas.microsoft.com/office/word/2010/wordprocessingCanvas" xmlns:cx="http://schemas.microsoft.com/office/drawing/2014/chartex" xmlns:cx1="http://schemas.microsoft.com/office/drawing/2015/9/8/chartex" xmlns:cx2="http://schemas.microsoft.com/office/drawing/2015/10/21/chartex" xmlns:cx3="http://schemas.microsoft.com/office/drawing/2016/5/9/chartex" xmlns:cx4="http://schemas.microsoft.com/office/drawing/2016/5/10/chartex" xmlns:cx5="http://schemas.microsoft.com/office/drawing/2016/5/11/chartex" xmlns:cx6="http://schemas.microsoft.com/office/drawing/2016/5/12/chartex" xmlns:cx7="http://schemas.microsoft.com/office/drawing/2016/5/13/chartex" xmlns:cx8="http://schemas.microsoft.com/office/drawing/2016/5/14/chartex" xmlns:mc="http://schemas.openxmlformats.org/markup-compatibility/2006" xmlns:aink="http://schemas.microsoft.com/office/drawing/2016/ink" xmlns:am3d="http://schemas.microsoft.com/office/drawing/2017/model3d" xmlns:o="urn:schemas-microsoft-com:office:office" xmlns:oel="http://schemas.microsoft.com/office/2019/extlst" xmlns:r="http://schemas.openxmlformats.org/officeDocument/2006/relationships" xmlns:m="http://schemas.openxmlformats.org/officeDocument/2006/math" xmlns:v="urn:schemas-microsoft-com:vml" xmlns:wp14="http://schemas.microsoft.com/office/word/2010/wordprocessingDrawing" xmlns:wp="http://schemas.openxmlformats.org/drawingml/2006/wordprocessingDrawing" xmlns:w10="urn:schemas-microsoft-com:office:word" xmlns:w="http://schemas.openxmlformats.org/wordprocessingml/2006/main" xmlns:w14="http://schemas.microsoft.com/office/word/2010/wordml" xmlns:w15="http://schemas.microsoft.com/office/word/2012/wordml" xmlns:w16cex="http://schemas.microsoft.com/office/word/2018/wordml/cex" xmlns:w16cid="http://schemas.microsoft.com/office/word/2016/wordml/cid" xmlns:w16="http://schemas.microsoft.com/office/word/2018/wordml" xmlns:w16du="http://schemas.microsoft.com/office/word/2023/wordml/word16du" xmlns:w16sdtdh="http://schemas.microsoft.com/office/word/2020/wordml/sdtdatahash" xmlns:w16sdtfl="http://schemas.microsoft.com/office/word/2024/wordml/sdtformatlock" xmlns:w16se="http://schemas.microsoft.com/office/word/2015/wordml/symex" xmlns:wpg="http://schemas.microsoft.com/office/word/2010/wordprocessingGroup" xmlns:wpi="http://schemas.microsoft.com/office/word/2010/wordprocessingInk" xmlns:wne="http://schemas.microsoft.com/office/word/2006/wordml" xmlns:wps="http://schemas.microsoft.com/office/word/2010/wordprocessingShape" mc:Ignorable="w14 w15 w16se w16cid w16 w16cex w16sdtdh w16sdtfl w16du wp14">
+<w:document xmlns:wpc="http://schemas.microsoft.com/office/word/2010/wordprocessingCanvas" xmlns:cx="http://schemas.microsoft.com/office/drawing/2014/chartex" xmlns:cx1="http://schemas.microsoft.com/office/drawing/2015/9/8/chartex" xmlns:cx2="http://schemas.microsoft.com/office/drawing/2015/10/21/chartex" xmlns:cx3="http://schemas.microsoft.com/office/drawing/2016/5/9/chartex" xmlns:cx4="http://schemas.microsoft.com/office/drawing/2016/5/10/chartex" xmlns:cx5="http://schemas.microsoft.com/office/drawing/2016/5/11/chartex" xmlns:cx6="http://schemas.microsoft.com/office/drawing/2016/5/12/chartex" xmlns:cx7="http://schemas.microsoft.com/office/drawing/2016/5/13/chartex" xmlns:cx8="http://schemas.microsoft.com/office/drawing/2016/5/14/chartex" xmlns:mc="http://schemas.openxmlformats.org/markup-compatibility/2006" xmlns:aink="http://schemas.microsoft.com/office/drawing/2016/ink" xmlns:am3d="http://schemas.microsoft.com/office/drawing/2017/model3d" xmlns:o="urn:schemas-microsoft-com:office:office" xmlns:oel="http://schemas.microsoft.com/office/2019/extlst" xmlns:r="http://schemas.openxmlformats.org/officeDocument/2006/relationships" xmlns:m="http://schemas.openxmlformats.org/officeDocument/2006/math" xmlns:v="urn:schemas-microsoft-com:vml" xmlns:wp14="http://schemas.microsoft.com/office/word/2010/wordprocessingDrawing" xmlns:wp="http://schemas.openxmlformats.org/drawingml/2006/wordprocessingDrawing" xmlns:w10="urn:schemas-microsoft-com:office:word" xmlns:w="http://schemas.openxmlformats.org/wordprocessingml/2006/main" xmlns:w14="http://schemas.microsoft.com/office/word/2010/wordml" xmlns:w15="http://schemas.microsoft.com/office/word/2012/wordml" xmlns:w16cei="http://schemas.microsoft.com/office/word/2026/wordml/cei" xmlns:w16cex="http://schemas.microsoft.com/office/word/2018/wordml/cex" xmlns:w16cid="http://schemas.microsoft.com/office/word/2016/wordml/cid" xmlns:w16="http://schemas.microsoft.com/office/word/2018/wordml" xmlns:w16du="http://schemas.microsoft.com/office/word/2023/wordml/word16du" xmlns:w16sdtdh="http://schemas.microsoft.com/office/word/2020/wordml/sdtdatahash" xmlns:w16sdtfl="http://schemas.microsoft.com/office/word/2024/wordml/sdtformatlock" xmlns:w16se="http://schemas.microsoft.com/office/word/2015/wordml/symex" xmlns:wpg="http://schemas.microsoft.com/office/word/2010/wordprocessingGroup" xmlns:wpi="http://schemas.microsoft.com/office/word/2010/wordprocessingInk" xmlns:wne="http://schemas.microsoft.com/office/word/2006/wordml" xmlns:wps="http://schemas.microsoft.com/office/word/2010/wordprocessingShape" mc:Ignorable="w14 w15 w16se w16cid w16 w16cex w16sdtdh w16sdtfl w16du wp14">
   <w:body>
     <w:p>
       <w:pPr>
@@ -64,27 +64,27 @@
         </w:rPr>
         <w:t>.0</w:t>
       </w:r>
-    </w:p>
-    <w:p>
-      <w:pPr>
-        <w:spacing w:after="0"/>
-        <w:jc w:val="center"/>
+      <w:r>
         <w:rPr>
           <w:b/>
           <w:bCs/>
           <w:sz w:val="24"/>
           <w:szCs w:val="24"/>
         </w:rPr>
-      </w:pPr>
-      <w:r>
+        <w:t>.2</w:t>
+      </w:r>
+    </w:p>
+    <w:p>
+      <w:pPr>
+        <w:spacing w:after="0"/>
+        <w:jc w:val="center"/>
         <w:rPr>
           <w:b/>
           <w:bCs/>
           <w:sz w:val="24"/>
           <w:szCs w:val="24"/>
         </w:rPr>
-        <w:t xml:space="preserve">February </w:t>
-      </w:r>
+      </w:pPr>
       <w:r>
         <w:rPr>
           <w:b/>
@@ -92,7 +92,34 @@
           <w:sz w:val="24"/>
           <w:szCs w:val="24"/>
         </w:rPr>
-        <w:t>21</w:t>
+        <w:t>August</w:t>
+      </w:r>
+      <w:r>
+        <w:rPr>
+          <w:b/>
+          <w:bCs/>
+          <w:sz w:val="24"/>
+          <w:szCs w:val="24"/>
+        </w:rPr>
+        <w:t xml:space="preserve"> </w:t>
+      </w:r>
+      <w:r>
+        <w:rPr>
+          <w:b/>
+          <w:bCs/>
+          <w:sz w:val="24"/>
+          <w:szCs w:val="24"/>
+        </w:rPr>
+        <w:t>2</w:t>
+      </w:r>
+      <w:r>
+        <w:rPr>
+          <w:b/>
+          <w:bCs/>
+          <w:sz w:val="24"/>
+          <w:szCs w:val="24"/>
+        </w:rPr>
+        <w:t>3</w:t>
       </w:r>
       <w:r>
         <w:rPr>
@@ -189,7 +216,7 @@
               <w:noProof/>
               <w:sz w:val="24"/>
               <w:szCs w:val="24"/>
-              <w:lang w:val="en-GB" w:eastAsia="en-GB"/>
+              <w:lang w:val="en-NZ" w:eastAsia="en-NZ"/>
             </w:rPr>
           </w:pPr>
           <w:r>
@@ -201,7 +228,7 @@
           <w:r>
             <w:fldChar w:fldCharType="separate"/>
           </w:r>
-          <w:hyperlink w:anchor="_Toc222557532" w:history="1">
+          <w:hyperlink w:anchor="_Toc238395131" w:history="1">
             <w:r>
               <w:rPr>
                 <w:rStyle w:val="Hyperlink"/>
@@ -209,7 +236,7 @@
                 <w:bCs/>
                 <w:noProof/>
               </w:rPr>
-              <w:t>What's New in Version 2.0</w:t>
+              <w:t>What's New in Version 2.0.2</w:t>
             </w:r>
             <w:r>
               <w:rPr>
@@ -230,7 +257,7 @@
                 <w:noProof/>
                 <w:webHidden/>
               </w:rPr>
-              <w:instrText xml:space="preserve"> PAGEREF _Toc222557532 \h </w:instrText>
+              <w:instrText xml:space="preserve"> PAGEREF _Toc238395131 \h </w:instrText>
             </w:r>
             <w:r>
               <w:rPr>
@@ -272,10 +299,10 @@
               <w:noProof/>
               <w:sz w:val="24"/>
               <w:szCs w:val="24"/>
-              <w:lang w:val="en-GB" w:eastAsia="en-GB"/>
+              <w:lang w:val="en-NZ" w:eastAsia="en-NZ"/>
             </w:rPr>
           </w:pPr>
-          <w:hyperlink w:anchor="_Toc222557533" w:history="1">
+          <w:hyperlink w:anchor="_Toc238395132" w:history="1">
             <w:r>
               <w:rPr>
                 <w:rStyle w:val="Hyperlink"/>
@@ -283,7 +310,7 @@
                 <w:bCs/>
                 <w:noProof/>
               </w:rPr>
-              <w:t>Overview</w:t>
+              <w:t>What's New in Version 2.0</w:t>
             </w:r>
             <w:r>
               <w:rPr>
@@ -304,7 +331,7 @@
                 <w:noProof/>
                 <w:webHidden/>
               </w:rPr>
-              <w:instrText xml:space="preserve"> PAGEREF _Toc222557533 \h </w:instrText>
+              <w:instrText xml:space="preserve"> PAGEREF _Toc238395132 \h </w:instrText>
             </w:r>
             <w:r>
               <w:rPr>
@@ -346,10 +373,84 @@
               <w:noProof/>
               <w:sz w:val="24"/>
               <w:szCs w:val="24"/>
-              <w:lang w:val="en-GB" w:eastAsia="en-GB"/>
+              <w:lang w:val="en-NZ" w:eastAsia="en-NZ"/>
             </w:rPr>
           </w:pPr>
-          <w:hyperlink w:anchor="_Toc222557534" w:history="1">
+          <w:hyperlink w:anchor="_Toc238395133" w:history="1">
+            <w:r>
+              <w:rPr>
+                <w:rStyle w:val="Hyperlink"/>
+                <w:b/>
+                <w:bCs/>
+                <w:noProof/>
+              </w:rPr>
+              <w:t>Overview</w:t>
+            </w:r>
+            <w:r>
+              <w:rPr>
+                <w:noProof/>
+                <w:webHidden/>
+              </w:rPr>
+              <w:tab/>
+            </w:r>
+            <w:r>
+              <w:rPr>
+                <w:noProof/>
+                <w:webHidden/>
+              </w:rPr>
+              <w:fldChar w:fldCharType="begin"/>
+            </w:r>
+            <w:r>
+              <w:rPr>
+                <w:noProof/>
+                <w:webHidden/>
+              </w:rPr>
+              <w:instrText xml:space="preserve"> PAGEREF _Toc238395133 \h </w:instrText>
+            </w:r>
+            <w:r>
+              <w:rPr>
+                <w:noProof/>
+                <w:webHidden/>
+              </w:rPr>
+            </w:r>
+            <w:r>
+              <w:rPr>
+                <w:noProof/>
+                <w:webHidden/>
+              </w:rPr>
+              <w:fldChar w:fldCharType="separate"/>
+            </w:r>
+            <w:r>
+              <w:rPr>
+                <w:noProof/>
+                <w:webHidden/>
+              </w:rPr>
+              <w:t>2</w:t>
+            </w:r>
+            <w:r>
+              <w:rPr>
+                <w:noProof/>
+                <w:webHidden/>
+              </w:rPr>
+              <w:fldChar w:fldCharType="end"/>
+            </w:r>
+          </w:hyperlink>
+        </w:p>
+        <w:p>
+          <w:pPr>
+            <w:pStyle w:val="TOC1"/>
+            <w:tabs>
+              <w:tab w:val="right" w:leader="dot" w:pos="9350"/>
+            </w:tabs>
+            <w:rPr>
+              <w:rFonts w:eastAsiaTheme="minorEastAsia"/>
+              <w:noProof/>
+              <w:sz w:val="24"/>
+              <w:szCs w:val="24"/>
+              <w:lang w:val="en-NZ" w:eastAsia="en-NZ"/>
+            </w:rPr>
+          </w:pPr>
+          <w:hyperlink w:anchor="_Toc238395134" w:history="1">
             <w:r>
               <w:rPr>
                 <w:rStyle w:val="Hyperlink"/>
@@ -378,7 +479,7 @@
                 <w:noProof/>
                 <w:webHidden/>
               </w:rPr>
-              <w:instrText xml:space="preserve"> PAGEREF _Toc222557534 \h </w:instrText>
+              <w:instrText xml:space="preserve"> PAGEREF _Toc238395134 \h </w:instrText>
             </w:r>
             <w:r>
               <w:rPr>
@@ -420,10 +521,10 @@
               <w:noProof/>
               <w:sz w:val="24"/>
               <w:szCs w:val="24"/>
-              <w:lang w:val="en-GB" w:eastAsia="en-GB"/>
+              <w:lang w:val="en-NZ" w:eastAsia="en-NZ"/>
             </w:rPr>
           </w:pPr>
-          <w:hyperlink w:anchor="_Toc222557535" w:history="1">
+          <w:hyperlink w:anchor="_Toc238395135" w:history="1">
             <w:r>
               <w:rPr>
                 <w:rStyle w:val="Hyperlink"/>
@@ -452,7 +553,7 @@
                 <w:noProof/>
                 <w:webHidden/>
               </w:rPr>
-              <w:instrText xml:space="preserve"> PAGEREF _Toc222557535 \h </w:instrText>
+              <w:instrText xml:space="preserve"> PAGEREF _Toc238395135 \h </w:instrText>
             </w:r>
             <w:r>
               <w:rPr>
@@ -494,10 +595,10 @@
               <w:noProof/>
               <w:sz w:val="24"/>
               <w:szCs w:val="24"/>
-              <w:lang w:val="en-GB" w:eastAsia="en-GB"/>
+              <w:lang w:val="en-NZ" w:eastAsia="en-NZ"/>
             </w:rPr>
           </w:pPr>
-          <w:hyperlink w:anchor="_Toc222557536" w:history="1">
+          <w:hyperlink w:anchor="_Toc238395136" w:history="1">
             <w:r>
               <w:rPr>
                 <w:rStyle w:val="Hyperlink"/>
@@ -526,7 +627,7 @@
                 <w:noProof/>
                 <w:webHidden/>
               </w:rPr>
-              <w:instrText xml:space="preserve"> PAGEREF _Toc222557536 \h </w:instrText>
+              <w:instrText xml:space="preserve"> PAGEREF _Toc238395136 \h </w:instrText>
             </w:r>
             <w:r>
               <w:rPr>
@@ -568,10 +669,10 @@
               <w:noProof/>
               <w:sz w:val="24"/>
               <w:szCs w:val="24"/>
-              <w:lang w:val="en-GB" w:eastAsia="en-GB"/>
+              <w:lang w:val="en-NZ" w:eastAsia="en-NZ"/>
             </w:rPr>
           </w:pPr>
-          <w:hyperlink w:anchor="_Toc222557537" w:history="1">
+          <w:hyperlink w:anchor="_Toc238395137" w:history="1">
             <w:r>
               <w:rPr>
                 <w:rStyle w:val="Hyperlink"/>
@@ -600,7 +701,7 @@
                 <w:noProof/>
                 <w:webHidden/>
               </w:rPr>
-              <w:instrText xml:space="preserve"> PAGEREF _Toc222557537 \h </w:instrText>
+              <w:instrText xml:space="preserve"> PAGEREF _Toc238395137 \h </w:instrText>
             </w:r>
             <w:r>
               <w:rPr>
@@ -642,10 +743,10 @@
               <w:noProof/>
               <w:sz w:val="24"/>
               <w:szCs w:val="24"/>
-              <w:lang w:val="en-GB" w:eastAsia="en-GB"/>
+              <w:lang w:val="en-NZ" w:eastAsia="en-NZ"/>
             </w:rPr>
           </w:pPr>
-          <w:hyperlink w:anchor="_Toc222557538" w:history="1">
+          <w:hyperlink w:anchor="_Toc238395138" w:history="1">
             <w:r>
               <w:rPr>
                 <w:rStyle w:val="Hyperlink"/>
@@ -674,7 +775,7 @@
                 <w:noProof/>
                 <w:webHidden/>
               </w:rPr>
-              <w:instrText xml:space="preserve"> PAGEREF _Toc222557538 \h </w:instrText>
+              <w:instrText xml:space="preserve"> PAGEREF _Toc238395138 \h </w:instrText>
             </w:r>
             <w:r>
               <w:rPr>
@@ -716,10 +817,10 @@
               <w:noProof/>
               <w:sz w:val="24"/>
               <w:szCs w:val="24"/>
-              <w:lang w:val="en-GB" w:eastAsia="en-GB"/>
+              <w:lang w:val="en-NZ" w:eastAsia="en-NZ"/>
             </w:rPr>
           </w:pPr>
-          <w:hyperlink w:anchor="_Toc222557539" w:history="1">
+          <w:hyperlink w:anchor="_Toc238395139" w:history="1">
             <w:r>
               <w:rPr>
                 <w:rStyle w:val="Hyperlink"/>
@@ -748,7 +849,7 @@
                 <w:noProof/>
                 <w:webHidden/>
               </w:rPr>
-              <w:instrText xml:space="preserve"> PAGEREF _Toc222557539 \h </w:instrText>
+              <w:instrText xml:space="preserve"> PAGEREF _Toc238395139 \h </w:instrText>
             </w:r>
             <w:r>
               <w:rPr>
@@ -790,10 +891,10 @@
               <w:noProof/>
               <w:sz w:val="24"/>
               <w:szCs w:val="24"/>
-              <w:lang w:val="en-GB" w:eastAsia="en-GB"/>
+              <w:lang w:val="en-NZ" w:eastAsia="en-NZ"/>
             </w:rPr>
           </w:pPr>
-          <w:hyperlink w:anchor="_Toc222557540" w:history="1">
+          <w:hyperlink w:anchor="_Toc238395140" w:history="1">
             <w:r>
               <w:rPr>
                 <w:rStyle w:val="Hyperlink"/>
@@ -821,7 +922,7 @@
                 <w:noProof/>
                 <w:webHidden/>
               </w:rPr>
-              <w:instrText xml:space="preserve"> PAGEREF _Toc222557540 \h </w:instrText>
+              <w:instrText xml:space="preserve"> PAGEREF _Toc238395140 \h </w:instrText>
             </w:r>
             <w:r>
               <w:rPr>
@@ -863,10 +964,10 @@
               <w:noProof/>
               <w:sz w:val="24"/>
               <w:szCs w:val="24"/>
-              <w:lang w:val="en-GB" w:eastAsia="en-GB"/>
+              <w:lang w:val="en-NZ" w:eastAsia="en-NZ"/>
             </w:rPr>
           </w:pPr>
-          <w:hyperlink w:anchor="_Toc222557541" w:history="1">
+          <w:hyperlink w:anchor="_Toc238395141" w:history="1">
             <w:r>
               <w:rPr>
                 <w:rStyle w:val="Hyperlink"/>
@@ -895,7 +996,7 @@
                 <w:noProof/>
                 <w:webHidden/>
               </w:rPr>
-              <w:instrText xml:space="preserve"> PAGEREF _Toc222557541 \h </w:instrText>
+              <w:instrText xml:space="preserve"> PAGEREF _Toc238395141 \h </w:instrText>
             </w:r>
             <w:r>
               <w:rPr>
@@ -937,10 +1038,10 @@
               <w:noProof/>
               <w:sz w:val="24"/>
               <w:szCs w:val="24"/>
-              <w:lang w:val="en-GB" w:eastAsia="en-GB"/>
+              <w:lang w:val="en-NZ" w:eastAsia="en-NZ"/>
             </w:rPr>
           </w:pPr>
-          <w:hyperlink w:anchor="_Toc222557542" w:history="1">
+          <w:hyperlink w:anchor="_Toc238395142" w:history="1">
             <w:r>
               <w:rPr>
                 <w:rStyle w:val="Hyperlink"/>
@@ -969,7 +1070,7 @@
                 <w:noProof/>
                 <w:webHidden/>
               </w:rPr>
-              <w:instrText xml:space="preserve"> PAGEREF _Toc222557542 \h </w:instrText>
+              <w:instrText xml:space="preserve"> PAGEREF _Toc238395142 \h </w:instrText>
             </w:r>
             <w:r>
               <w:rPr>
@@ -1011,10 +1112,10 @@
               <w:noProof/>
               <w:sz w:val="24"/>
               <w:szCs w:val="24"/>
-              <w:lang w:val="en-GB" w:eastAsia="en-GB"/>
+              <w:lang w:val="en-NZ" w:eastAsia="en-NZ"/>
             </w:rPr>
           </w:pPr>
-          <w:hyperlink w:anchor="_Toc222557543" w:history="1">
+          <w:hyperlink w:anchor="_Toc238395143" w:history="1">
             <w:r>
               <w:rPr>
                 <w:rStyle w:val="Hyperlink"/>
@@ -1043,7 +1144,7 @@
                 <w:noProof/>
                 <w:webHidden/>
               </w:rPr>
-              <w:instrText xml:space="preserve"> PAGEREF _Toc222557543 \h </w:instrText>
+              <w:instrText xml:space="preserve"> PAGEREF _Toc238395143 \h </w:instrText>
             </w:r>
             <w:r>
               <w:rPr>
@@ -1085,10 +1186,10 @@
               <w:noProof/>
               <w:sz w:val="24"/>
               <w:szCs w:val="24"/>
-              <w:lang w:val="en-GB" w:eastAsia="en-GB"/>
+              <w:lang w:val="en-NZ" w:eastAsia="en-NZ"/>
             </w:rPr>
           </w:pPr>
-          <w:hyperlink w:anchor="_Toc222557544" w:history="1">
+          <w:hyperlink w:anchor="_Toc238395144" w:history="1">
             <w:r>
               <w:rPr>
                 <w:rStyle w:val="Hyperlink"/>
@@ -1117,7 +1218,7 @@
                 <w:noProof/>
                 <w:webHidden/>
               </w:rPr>
-              <w:instrText xml:space="preserve"> PAGEREF _Toc222557544 \h </w:instrText>
+              <w:instrText xml:space="preserve"> PAGEREF _Toc238395144 \h </w:instrText>
             </w:r>
             <w:r>
               <w:rPr>
@@ -1159,10 +1260,10 @@
               <w:noProof/>
               <w:sz w:val="24"/>
               <w:szCs w:val="24"/>
-              <w:lang w:val="en-GB" w:eastAsia="en-GB"/>
+              <w:lang w:val="en-NZ" w:eastAsia="en-NZ"/>
             </w:rPr>
           </w:pPr>
-          <w:hyperlink w:anchor="_Toc222557545" w:history="1">
+          <w:hyperlink w:anchor="_Toc238395145" w:history="1">
             <w:r>
               <w:rPr>
                 <w:rStyle w:val="Hyperlink"/>
@@ -1191,7 +1292,7 @@
                 <w:noProof/>
                 <w:webHidden/>
               </w:rPr>
-              <w:instrText xml:space="preserve"> PAGEREF _Toc222557545 \h </w:instrText>
+              <w:instrText xml:space="preserve"> PAGEREF _Toc238395145 \h </w:instrText>
             </w:r>
             <w:r>
               <w:rPr>
@@ -1233,10 +1334,10 @@
               <w:noProof/>
               <w:sz w:val="24"/>
               <w:szCs w:val="24"/>
-              <w:lang w:val="en-GB" w:eastAsia="en-GB"/>
+              <w:lang w:val="en-NZ" w:eastAsia="en-NZ"/>
             </w:rPr>
           </w:pPr>
-          <w:hyperlink w:anchor="_Toc222557546" w:history="1">
+          <w:hyperlink w:anchor="_Toc238395146" w:history="1">
             <w:r>
               <w:rPr>
                 <w:rStyle w:val="Hyperlink"/>
@@ -1265,7 +1366,7 @@
                 <w:noProof/>
                 <w:webHidden/>
               </w:rPr>
-              <w:instrText xml:space="preserve"> PAGEREF _Toc222557546 \h </w:instrText>
+              <w:instrText xml:space="preserve"> PAGEREF _Toc238395146 \h </w:instrText>
             </w:r>
             <w:r>
               <w:rPr>
@@ -1307,10 +1408,10 @@
               <w:noProof/>
               <w:sz w:val="24"/>
               <w:szCs w:val="24"/>
-              <w:lang w:val="en-GB" w:eastAsia="en-GB"/>
+              <w:lang w:val="en-NZ" w:eastAsia="en-NZ"/>
             </w:rPr>
           </w:pPr>
-          <w:hyperlink w:anchor="_Toc222557547" w:history="1">
+          <w:hyperlink w:anchor="_Toc238395147" w:history="1">
             <w:r>
               <w:rPr>
                 <w:rStyle w:val="Hyperlink"/>
@@ -1339,7 +1440,7 @@
                 <w:noProof/>
                 <w:webHidden/>
               </w:rPr>
-              <w:instrText xml:space="preserve"> PAGEREF _Toc222557547 \h </w:instrText>
+              <w:instrText xml:space="preserve"> PAGEREF _Toc238395147 \h </w:instrText>
             </w:r>
             <w:r>
               <w:rPr>
@@ -1381,10 +1482,10 @@
               <w:noProof/>
               <w:sz w:val="24"/>
               <w:szCs w:val="24"/>
-              <w:lang w:val="en-GB" w:eastAsia="en-GB"/>
+              <w:lang w:val="en-NZ" w:eastAsia="en-NZ"/>
             </w:rPr>
           </w:pPr>
-          <w:hyperlink w:anchor="_Toc222557548" w:history="1">
+          <w:hyperlink w:anchor="_Toc238395148" w:history="1">
             <w:r>
               <w:rPr>
                 <w:rStyle w:val="Hyperlink"/>
@@ -1413,7 +1514,7 @@
                 <w:noProof/>
                 <w:webHidden/>
               </w:rPr>
-              <w:instrText xml:space="preserve"> PAGEREF _Toc222557548 \h </w:instrText>
+              <w:instrText xml:space="preserve"> PAGEREF _Toc238395148 \h </w:instrText>
             </w:r>
             <w:r>
               <w:rPr>
@@ -1455,10 +1556,10 @@
               <w:noProof/>
               <w:sz w:val="24"/>
               <w:szCs w:val="24"/>
-              <w:lang w:val="en-GB" w:eastAsia="en-GB"/>
+              <w:lang w:val="en-NZ" w:eastAsia="en-NZ"/>
             </w:rPr>
           </w:pPr>
-          <w:hyperlink w:anchor="_Toc222557549" w:history="1">
+          <w:hyperlink w:anchor="_Toc238395149" w:history="1">
             <w:r>
               <w:rPr>
                 <w:rStyle w:val="Hyperlink"/>
@@ -1495,7 +1596,7 @@
                 <w:noProof/>
                 <w:webHidden/>
               </w:rPr>
-              <w:instrText xml:space="preserve"> PAGEREF _Toc222557549 \h </w:instrText>
+              <w:instrText xml:space="preserve"> PAGEREF _Toc238395149 \h </w:instrText>
             </w:r>
             <w:r>
               <w:rPr>
@@ -1537,10 +1638,10 @@
               <w:noProof/>
               <w:sz w:val="24"/>
               <w:szCs w:val="24"/>
-              <w:lang w:val="en-GB" w:eastAsia="en-GB"/>
+              <w:lang w:val="en-NZ" w:eastAsia="en-NZ"/>
             </w:rPr>
           </w:pPr>
-          <w:hyperlink w:anchor="_Toc222557550" w:history="1">
+          <w:hyperlink w:anchor="_Toc238395150" w:history="1">
             <w:r>
               <w:rPr>
                 <w:rStyle w:val="Hyperlink"/>
@@ -1569,7 +1670,7 @@
                 <w:noProof/>
                 <w:webHidden/>
               </w:rPr>
-              <w:instrText xml:space="preserve"> PAGEREF _Toc222557550 \h </w:instrText>
+              <w:instrText xml:space="preserve"> PAGEREF _Toc238395150 \h </w:instrText>
             </w:r>
             <w:r>
               <w:rPr>
@@ -1611,10 +1712,10 @@
               <w:noProof/>
               <w:sz w:val="24"/>
               <w:szCs w:val="24"/>
-              <w:lang w:val="en-GB" w:eastAsia="en-GB"/>
+              <w:lang w:val="en-NZ" w:eastAsia="en-NZ"/>
             </w:rPr>
           </w:pPr>
-          <w:hyperlink w:anchor="_Toc222557551" w:history="1">
+          <w:hyperlink w:anchor="_Toc238395151" w:history="1">
             <w:r>
               <w:rPr>
                 <w:rStyle w:val="Hyperlink"/>
@@ -1643,7 +1744,7 @@
                 <w:noProof/>
                 <w:webHidden/>
               </w:rPr>
-              <w:instrText xml:space="preserve"> PAGEREF _Toc222557551 \h </w:instrText>
+              <w:instrText xml:space="preserve"> PAGEREF _Toc238395151 \h </w:instrText>
             </w:r>
             <w:r>
               <w:rPr>
@@ -1749,7 +1850,7 @@
           <w:szCs w:val="28"/>
         </w:rPr>
       </w:pPr>
-      <w:bookmarkStart w:id="0" w:name="_Toc222557532"/>
+      <w:bookmarkStart w:id="0" w:name="_Toc238395131"/>
       <w:r>
         <w:rPr>
           <w:b/>
@@ -1759,7 +1860,7 @@
           <w:szCs w:val="28"/>
         </w:rPr>
         <w:lastRenderedPageBreak/>
-        <w:t>What's New</w:t>
+        <w:t>What's New in Version 2.0</w:t>
       </w:r>
       <w:r>
         <w:rPr>
@@ -1769,7 +1870,7 @@
           <w:sz w:val="28"/>
           <w:szCs w:val="28"/>
         </w:rPr>
-        <w:t xml:space="preserve"> in Version 2.0</w:t>
+        <w:t>.2</w:t>
       </w:r>
       <w:bookmarkEnd w:id="0"/>
     </w:p>
@@ -1795,162 +1896,46 @@
           <w:sz w:val="20"/>
           <w:szCs w:val="20"/>
         </w:rPr>
-        <w:t>The Electra One preset named "Continuum Controller" supersedes presets Continuum Ctrl 10.52 and EMM Ctrl 10.52.</w:t>
-      </w:r>
-      <w:r>
-        <w:rPr>
-          <w:sz w:val="20"/>
-          <w:szCs w:val="20"/>
-        </w:rPr>
-        <w:t xml:space="preserve"> Previous versions of the Electra One preset were specific to a Haken Audio firmware version and to either Continuum or EaganMatrix Eurorack module (EMM) hardware.</w:t>
-      </w:r>
-    </w:p>
-    <w:p>
-      <w:pPr>
-        <w:spacing w:after="0"/>
-        <w:rPr>
-          <w:sz w:val="20"/>
-          <w:szCs w:val="20"/>
-        </w:rPr>
-      </w:pPr>
-    </w:p>
-    <w:p>
-      <w:pPr>
-        <w:spacing w:after="0"/>
-        <w:rPr>
-          <w:sz w:val="20"/>
-          <w:szCs w:val="20"/>
-        </w:rPr>
-      </w:pPr>
-      <w:r>
-        <w:rPr>
-          <w:sz w:val="20"/>
-          <w:szCs w:val="20"/>
-        </w:rPr>
-        <w:t>All Haken Audio firmware versions</w:t>
-      </w:r>
-      <w:r>
-        <w:rPr>
-          <w:sz w:val="20"/>
-          <w:szCs w:val="20"/>
-        </w:rPr>
-        <w:t xml:space="preserve"> from 10.44</w:t>
-      </w:r>
-      <w:r>
-        <w:rPr>
-          <w:sz w:val="20"/>
-          <w:szCs w:val="20"/>
-        </w:rPr>
-        <w:t xml:space="preserve"> and both types of hardware</w:t>
-      </w:r>
-      <w:r>
-        <w:rPr>
-          <w:sz w:val="20"/>
-          <w:szCs w:val="20"/>
-        </w:rPr>
-        <w:t xml:space="preserve"> instrument</w:t>
-      </w:r>
-      <w:r>
-        <w:rPr>
-          <w:sz w:val="20"/>
-          <w:szCs w:val="20"/>
-        </w:rPr>
-        <w:t xml:space="preserve"> are now supported.</w:t>
-      </w:r>
-    </w:p>
-    <w:p>
-      <w:pPr>
-        <w:pStyle w:val="ListParagraph"/>
-        <w:numPr>
-          <w:ilvl w:val="0"/>
-          <w:numId w:val="35"/>
-        </w:numPr>
-        <w:spacing w:after="0"/>
-        <w:rPr>
-          <w:sz w:val="20"/>
-          <w:szCs w:val="20"/>
-        </w:rPr>
-      </w:pPr>
-      <w:r>
-        <w:rPr>
-          <w:sz w:val="20"/>
-          <w:szCs w:val="20"/>
-        </w:rPr>
-        <w:t>This is possible because the list of system presets is refreshed from the</w:t>
-      </w:r>
-      <w:r>
-        <w:rPr>
-          <w:sz w:val="20"/>
-          <w:szCs w:val="20"/>
-        </w:rPr>
-        <w:t xml:space="preserve"> instrument </w:t>
-      </w:r>
-      <w:r>
-        <w:rPr>
-          <w:sz w:val="20"/>
-          <w:szCs w:val="20"/>
-        </w:rPr>
-        <w:t>when</w:t>
-      </w:r>
-      <w:r>
-        <w:rPr>
-          <w:sz w:val="20"/>
-          <w:szCs w:val="20"/>
-        </w:rPr>
-        <w:t xml:space="preserve"> the firmware version or hardware</w:t>
-      </w:r>
-      <w:r>
-        <w:rPr>
-          <w:sz w:val="20"/>
-          <w:szCs w:val="20"/>
-        </w:rPr>
-        <w:t xml:space="preserve"> type</w:t>
-      </w:r>
-      <w:r>
-        <w:rPr>
-          <w:sz w:val="20"/>
-          <w:szCs w:val="20"/>
-        </w:rPr>
-        <w:t xml:space="preserve"> changes</w:t>
-      </w:r>
-    </w:p>
-    <w:p>
-      <w:pPr>
-        <w:spacing w:after="0"/>
-        <w:rPr>
-          <w:sz w:val="20"/>
-          <w:szCs w:val="20"/>
-        </w:rPr>
-      </w:pPr>
-    </w:p>
-    <w:p>
-      <w:pPr>
-        <w:spacing w:after="0"/>
-        <w:rPr>
-          <w:sz w:val="20"/>
-          <w:szCs w:val="20"/>
-        </w:rPr>
-      </w:pPr>
-      <w:r>
-        <w:rPr>
-          <w:sz w:val="20"/>
-          <w:szCs w:val="20"/>
-        </w:rPr>
-        <w:t>To make</w:t>
-      </w:r>
-      <w:r>
-        <w:rPr>
-          <w:sz w:val="20"/>
-          <w:szCs w:val="20"/>
-        </w:rPr>
-        <w:t xml:space="preserve"> browsing the system preset list to</w:t>
-      </w:r>
-      <w:r>
-        <w:rPr>
-          <w:sz w:val="20"/>
-          <w:szCs w:val="20"/>
-        </w:rPr>
-        <w:t xml:space="preserve"> load</w:t>
+        <w:t>For display on E1 buttons, added more short names for system presets with names longer than 14 characters.  The short system preset names are no</w:t>
+      </w:r>
+      <w:r>
+        <w:rPr>
+          <w:sz w:val="20"/>
+          <w:szCs w:val="20"/>
+        </w:rPr>
+        <w:t>w</w:t>
+      </w:r>
+      <w:r>
+        <w:rPr>
+          <w:sz w:val="20"/>
+          <w:szCs w:val="20"/>
+        </w:rPr>
+        <w:t xml:space="preserve"> up to date as at firmware version 10.77.</w:t>
+      </w:r>
+    </w:p>
+    <w:p>
+      <w:pPr>
+        <w:spacing w:after="0"/>
+        <w:rPr>
+          <w:sz w:val="20"/>
+          <w:szCs w:val="20"/>
+        </w:rPr>
+      </w:pPr>
+    </w:p>
+    <w:p>
+      <w:pPr>
+        <w:spacing w:after="0"/>
+        <w:rPr>
+          <w:sz w:val="20"/>
+          <w:szCs w:val="20"/>
+        </w:rPr>
+      </w:pPr>
+      <w:r>
+        <w:rPr>
+          <w:sz w:val="20"/>
+          <w:szCs w:val="20"/>
+        </w:rPr>
+        <w:t>Fixed firmware version 10.77</w:t>
       </w:r>
       <w:r>
         <w:rPr>
@@ -1964,117 +1949,7 @@
           <w:sz w:val="20"/>
           <w:szCs w:val="20"/>
         </w:rPr>
-        <w:t>presets easier, the Selected Category and System Preset Number controls indicate the currently or most</w:t>
-      </w:r>
-      <w:r>
-        <w:rPr>
-          <w:sz w:val="20"/>
-          <w:szCs w:val="20"/>
-        </w:rPr>
-        <w:t xml:space="preserve"> recently loaded system preset, instead of being reset to no selection when a system preset is loaded.</w:t>
-      </w:r>
-    </w:p>
-    <w:p>
-      <w:pPr>
-        <w:spacing w:after="0"/>
-        <w:rPr>
-          <w:sz w:val="20"/>
-          <w:szCs w:val="20"/>
-        </w:rPr>
-      </w:pPr>
-    </w:p>
-    <w:p>
-      <w:pPr>
-        <w:spacing w:after="0"/>
-        <w:rPr>
-          <w:sz w:val="20"/>
-          <w:szCs w:val="20"/>
-        </w:rPr>
-      </w:pPr>
-      <w:r>
-        <w:rPr>
-          <w:sz w:val="20"/>
-          <w:szCs w:val="20"/>
-        </w:rPr>
-        <w:t xml:space="preserve">To make saving a preset to a user preset slot easier, when a user preset is loaded, the </w:t>
-      </w:r>
-      <w:r>
-        <w:rPr>
-          <w:sz w:val="20"/>
-          <w:szCs w:val="20"/>
-        </w:rPr>
-        <w:t>Store User Position</w:t>
-      </w:r>
-      <w:r>
-        <w:rPr>
-          <w:sz w:val="20"/>
-          <w:szCs w:val="20"/>
-        </w:rPr>
-        <w:t xml:space="preserve"> control's value is set to the position of</w:t>
-      </w:r>
-      <w:r>
-        <w:rPr>
-          <w:sz w:val="20"/>
-          <w:szCs w:val="20"/>
-        </w:rPr>
-        <w:t xml:space="preserve"> the</w:t>
-      </w:r>
-      <w:r>
-        <w:rPr>
-          <w:sz w:val="20"/>
-          <w:szCs w:val="20"/>
-        </w:rPr>
-        <w:t xml:space="preserve"> loaded preset.</w:t>
-      </w:r>
-    </w:p>
-    <w:p>
-      <w:pPr>
-        <w:spacing w:after="0"/>
-        <w:rPr>
-          <w:sz w:val="20"/>
-          <w:szCs w:val="20"/>
-        </w:rPr>
-      </w:pPr>
-    </w:p>
-    <w:p>
-      <w:pPr>
-        <w:spacing w:after="0"/>
-        <w:rPr>
-          <w:sz w:val="20"/>
-          <w:szCs w:val="20"/>
-        </w:rPr>
-      </w:pPr>
-      <w:r>
-        <w:rPr>
-          <w:sz w:val="20"/>
-          <w:szCs w:val="20"/>
-        </w:rPr>
-        <w:t>Automatically receiving preset lists from the instrument on loading Continuum Controller is no longer supported. as this could cause some Electra Ones to get stuck on the splash screen, preventing Continuum Controller's load from completing.</w:t>
-      </w:r>
-    </w:p>
-    <w:p>
-      <w:pPr>
-        <w:spacing w:after="0"/>
-        <w:rPr>
-          <w:sz w:val="20"/>
-          <w:szCs w:val="20"/>
-        </w:rPr>
-      </w:pPr>
-    </w:p>
-    <w:p>
-      <w:pPr>
-        <w:spacing w:after="0"/>
-        <w:rPr>
-          <w:sz w:val="20"/>
-          <w:szCs w:val="20"/>
-        </w:rPr>
-      </w:pPr>
-      <w:r>
-        <w:rPr>
-          <w:sz w:val="20"/>
-          <w:szCs w:val="20"/>
-        </w:rPr>
-        <w:t>Bug fixes.</w:t>
+        <w:t>compatibility issues.</w:t>
       </w:r>
     </w:p>
     <w:p>
@@ -2098,7 +1973,7 @@
           <w:szCs w:val="28"/>
         </w:rPr>
       </w:pPr>
-      <w:bookmarkStart w:id="1" w:name="_Toc222557533"/>
+      <w:bookmarkStart w:id="1" w:name="_Toc238395132"/>
       <w:r>
         <w:rPr>
           <w:b/>
@@ -2107,9 +1982,357 @@
           <w:sz w:val="28"/>
           <w:szCs w:val="28"/>
         </w:rPr>
+        <w:t>What's New</w:t>
+      </w:r>
+      <w:r>
+        <w:rPr>
+          <w:b/>
+          <w:bCs/>
+          <w:color w:val="auto"/>
+          <w:sz w:val="28"/>
+          <w:szCs w:val="28"/>
+        </w:rPr>
+        <w:t xml:space="preserve"> in Version 2.0</w:t>
+      </w:r>
+      <w:bookmarkEnd w:id="1"/>
+    </w:p>
+    <w:p>
+      <w:pPr>
+        <w:spacing w:after="0"/>
+        <w:rPr>
+          <w:sz w:val="20"/>
+          <w:szCs w:val="20"/>
+        </w:rPr>
+      </w:pPr>
+    </w:p>
+    <w:p>
+      <w:pPr>
+        <w:spacing w:after="0"/>
+        <w:rPr>
+          <w:sz w:val="20"/>
+          <w:szCs w:val="20"/>
+        </w:rPr>
+      </w:pPr>
+      <w:r>
+        <w:rPr>
+          <w:sz w:val="20"/>
+          <w:szCs w:val="20"/>
+        </w:rPr>
+        <w:t>The Electra One preset named "Continuum Controller" supersedes presets Continuum Ctrl 10.52 and EMM Ctrl 10.52.</w:t>
+      </w:r>
+      <w:r>
+        <w:rPr>
+          <w:sz w:val="20"/>
+          <w:szCs w:val="20"/>
+        </w:rPr>
+        <w:t xml:space="preserve"> Previous versions of the Electra One preset were specific to a Haken Audio firmware version and to either Continuum or EaganMatrix Eurorack module (EMM) hardware.</w:t>
+      </w:r>
+    </w:p>
+    <w:p>
+      <w:pPr>
+        <w:spacing w:after="0"/>
+        <w:rPr>
+          <w:sz w:val="20"/>
+          <w:szCs w:val="20"/>
+        </w:rPr>
+      </w:pPr>
+    </w:p>
+    <w:p>
+      <w:pPr>
+        <w:spacing w:after="0"/>
+        <w:rPr>
+          <w:sz w:val="20"/>
+          <w:szCs w:val="20"/>
+        </w:rPr>
+      </w:pPr>
+      <w:r>
+        <w:rPr>
+          <w:sz w:val="20"/>
+          <w:szCs w:val="20"/>
+        </w:rPr>
+        <w:t>All Haken Audio firmware versions</w:t>
+      </w:r>
+      <w:r>
+        <w:rPr>
+          <w:sz w:val="20"/>
+          <w:szCs w:val="20"/>
+        </w:rPr>
+        <w:t xml:space="preserve"> from 10.44</w:t>
+      </w:r>
+      <w:r>
+        <w:rPr>
+          <w:sz w:val="20"/>
+          <w:szCs w:val="20"/>
+        </w:rPr>
+        <w:t xml:space="preserve"> and both types of hardware</w:t>
+      </w:r>
+      <w:r>
+        <w:rPr>
+          <w:sz w:val="20"/>
+          <w:szCs w:val="20"/>
+        </w:rPr>
+        <w:t xml:space="preserve"> instrument</w:t>
+      </w:r>
+      <w:r>
+        <w:rPr>
+          <w:sz w:val="20"/>
+          <w:szCs w:val="20"/>
+        </w:rPr>
+        <w:t xml:space="preserve"> are now supported.</w:t>
+      </w:r>
+    </w:p>
+    <w:p>
+      <w:pPr>
+        <w:pStyle w:val="ListParagraph"/>
+        <w:numPr>
+          <w:ilvl w:val="0"/>
+          <w:numId w:val="35"/>
+        </w:numPr>
+        <w:spacing w:after="0"/>
+        <w:rPr>
+          <w:sz w:val="20"/>
+          <w:szCs w:val="20"/>
+        </w:rPr>
+      </w:pPr>
+      <w:r>
+        <w:rPr>
+          <w:sz w:val="20"/>
+          <w:szCs w:val="20"/>
+        </w:rPr>
+        <w:t>This is possible because the list of system presets is refreshed from the</w:t>
+      </w:r>
+      <w:r>
+        <w:rPr>
+          <w:sz w:val="20"/>
+          <w:szCs w:val="20"/>
+        </w:rPr>
+        <w:t xml:space="preserve"> instrument </w:t>
+      </w:r>
+      <w:r>
+        <w:rPr>
+          <w:sz w:val="20"/>
+          <w:szCs w:val="20"/>
+        </w:rPr>
+        <w:t>when</w:t>
+      </w:r>
+      <w:r>
+        <w:rPr>
+          <w:sz w:val="20"/>
+          <w:szCs w:val="20"/>
+        </w:rPr>
+        <w:t xml:space="preserve"> the firmware version or hardware</w:t>
+      </w:r>
+      <w:r>
+        <w:rPr>
+          <w:sz w:val="20"/>
+          <w:szCs w:val="20"/>
+        </w:rPr>
+        <w:t xml:space="preserve"> type</w:t>
+      </w:r>
+      <w:r>
+        <w:rPr>
+          <w:sz w:val="20"/>
+          <w:szCs w:val="20"/>
+        </w:rPr>
+        <w:t xml:space="preserve"> changes</w:t>
+      </w:r>
+    </w:p>
+    <w:p>
+      <w:pPr>
+        <w:spacing w:after="0"/>
+        <w:rPr>
+          <w:sz w:val="20"/>
+          <w:szCs w:val="20"/>
+        </w:rPr>
+      </w:pPr>
+    </w:p>
+    <w:p>
+      <w:pPr>
+        <w:spacing w:after="0"/>
+        <w:rPr>
+          <w:sz w:val="20"/>
+          <w:szCs w:val="20"/>
+        </w:rPr>
+      </w:pPr>
+      <w:r>
+        <w:rPr>
+          <w:sz w:val="20"/>
+          <w:szCs w:val="20"/>
+        </w:rPr>
+        <w:t>To make</w:t>
+      </w:r>
+      <w:r>
+        <w:rPr>
+          <w:sz w:val="20"/>
+          <w:szCs w:val="20"/>
+        </w:rPr>
+        <w:t xml:space="preserve"> browsing the system preset list to</w:t>
+      </w:r>
+      <w:r>
+        <w:rPr>
+          <w:sz w:val="20"/>
+          <w:szCs w:val="20"/>
+        </w:rPr>
+        <w:t xml:space="preserve"> load</w:t>
+      </w:r>
+      <w:r>
+        <w:rPr>
+          <w:sz w:val="20"/>
+          <w:szCs w:val="20"/>
+        </w:rPr>
+        <w:t xml:space="preserve"> </w:t>
+      </w:r>
+      <w:r>
+        <w:rPr>
+          <w:sz w:val="20"/>
+          <w:szCs w:val="20"/>
+        </w:rPr>
+        <w:t>presets easier, the Selected Category and System Preset Number controls indicate the currently or most</w:t>
+      </w:r>
+      <w:r>
+        <w:rPr>
+          <w:sz w:val="20"/>
+          <w:szCs w:val="20"/>
+        </w:rPr>
+        <w:t xml:space="preserve"> recently loaded system preset, instead of being reset to no selection when a system preset is loaded.</w:t>
+      </w:r>
+    </w:p>
+    <w:p>
+      <w:pPr>
+        <w:spacing w:after="0"/>
+        <w:rPr>
+          <w:sz w:val="20"/>
+          <w:szCs w:val="20"/>
+        </w:rPr>
+      </w:pPr>
+    </w:p>
+    <w:p>
+      <w:pPr>
+        <w:spacing w:after="0"/>
+        <w:rPr>
+          <w:sz w:val="20"/>
+          <w:szCs w:val="20"/>
+        </w:rPr>
+      </w:pPr>
+      <w:r>
+        <w:rPr>
+          <w:sz w:val="20"/>
+          <w:szCs w:val="20"/>
+        </w:rPr>
+        <w:t xml:space="preserve">To make saving a preset to a user preset slot easier, when a user preset is loaded, the </w:t>
+      </w:r>
+      <w:r>
+        <w:rPr>
+          <w:sz w:val="20"/>
+          <w:szCs w:val="20"/>
+        </w:rPr>
+        <w:t>Store User Position</w:t>
+      </w:r>
+      <w:r>
+        <w:rPr>
+          <w:sz w:val="20"/>
+          <w:szCs w:val="20"/>
+        </w:rPr>
+        <w:t xml:space="preserve"> control's value is set to the position of</w:t>
+      </w:r>
+      <w:r>
+        <w:rPr>
+          <w:sz w:val="20"/>
+          <w:szCs w:val="20"/>
+        </w:rPr>
+        <w:t xml:space="preserve"> the</w:t>
+      </w:r>
+      <w:r>
+        <w:rPr>
+          <w:sz w:val="20"/>
+          <w:szCs w:val="20"/>
+        </w:rPr>
+        <w:t xml:space="preserve"> loaded preset.</w:t>
+      </w:r>
+    </w:p>
+    <w:p>
+      <w:pPr>
+        <w:spacing w:after="0"/>
+        <w:rPr>
+          <w:sz w:val="20"/>
+          <w:szCs w:val="20"/>
+        </w:rPr>
+      </w:pPr>
+    </w:p>
+    <w:p>
+      <w:pPr>
+        <w:spacing w:after="0"/>
+        <w:rPr>
+          <w:sz w:val="20"/>
+          <w:szCs w:val="20"/>
+        </w:rPr>
+      </w:pPr>
+      <w:r>
+        <w:rPr>
+          <w:sz w:val="20"/>
+          <w:szCs w:val="20"/>
+        </w:rPr>
+        <w:t>Automatically receiving preset lists from the instrument on loading Continuum Controller is no longer supported. as this could cause some Electra Ones to get stuck on the splash screen, preventing Continuum Controller's load from completing.</w:t>
+      </w:r>
+    </w:p>
+    <w:p>
+      <w:pPr>
+        <w:spacing w:after="0"/>
+        <w:rPr>
+          <w:sz w:val="20"/>
+          <w:szCs w:val="20"/>
+        </w:rPr>
+      </w:pPr>
+    </w:p>
+    <w:p>
+      <w:pPr>
+        <w:spacing w:after="0"/>
+        <w:rPr>
+          <w:sz w:val="20"/>
+          <w:szCs w:val="20"/>
+        </w:rPr>
+      </w:pPr>
+      <w:r>
+        <w:rPr>
+          <w:sz w:val="20"/>
+          <w:szCs w:val="20"/>
+        </w:rPr>
+        <w:t>Bug fixes.</w:t>
+      </w:r>
+    </w:p>
+    <w:p>
+      <w:pPr>
+        <w:spacing w:after="0"/>
+        <w:rPr>
+          <w:sz w:val="20"/>
+          <w:szCs w:val="20"/>
+        </w:rPr>
+      </w:pPr>
+    </w:p>
+    <w:p>
+      <w:pPr>
+        <w:pStyle w:val="Heading1"/>
+        <w:spacing w:before="0" w:after="0"/>
+        <w:rPr>
+          <w:b/>
+          <w:bCs/>
+          <w:color w:val="auto"/>
+          <w:sz w:val="28"/>
+          <w:szCs w:val="28"/>
+        </w:rPr>
+      </w:pPr>
+      <w:bookmarkStart w:id="2" w:name="_Toc238395133"/>
+      <w:r>
+        <w:rPr>
+          <w:b/>
+          <w:bCs/>
+          <w:color w:val="auto"/>
+          <w:sz w:val="28"/>
+          <w:szCs w:val="28"/>
+        </w:rPr>
         <w:t>Overview</w:t>
       </w:r>
-      <w:bookmarkEnd w:id="1"/>
+      <w:bookmarkEnd w:id="2"/>
     </w:p>
     <w:p>
       <w:pPr>
@@ -2320,12 +2543,465 @@
           <w:i/>
           <w:iCs/>
         </w:rPr>
+        <w:lastRenderedPageBreak/>
         <w:t>Continuum Controller is not a Haken Audio product. Please do not raise Haken Audio tickets.</w:t>
       </w:r>
     </w:p>
     <w:p>
       <w:pPr>
         <w:spacing w:after="0"/>
+      </w:pPr>
+    </w:p>
+    <w:p>
+      <w:pPr>
+        <w:pStyle w:val="Heading1"/>
+        <w:spacing w:before="0" w:after="0"/>
+        <w:rPr>
+          <w:b/>
+          <w:bCs/>
+          <w:color w:val="auto"/>
+          <w:sz w:val="28"/>
+          <w:szCs w:val="28"/>
+        </w:rPr>
+      </w:pPr>
+      <w:bookmarkStart w:id="3" w:name="_Toc238395134"/>
+      <w:r>
+        <w:rPr>
+          <w:b/>
+          <w:bCs/>
+          <w:color w:val="auto"/>
+          <w:sz w:val="28"/>
+          <w:szCs w:val="28"/>
+        </w:rPr>
+        <w:t>Version Compatibility</w:t>
+      </w:r>
+      <w:bookmarkEnd w:id="3"/>
+    </w:p>
+    <w:p>
+      <w:pPr>
+        <w:spacing w:after="0"/>
+        <w:rPr>
+          <w:sz w:val="20"/>
+          <w:szCs w:val="20"/>
+        </w:rPr>
+      </w:pPr>
+    </w:p>
+    <w:p>
+      <w:pPr>
+        <w:spacing w:after="0"/>
+      </w:pPr>
+      <w:r>
+        <w:rPr>
+          <w:b/>
+          <w:bCs/>
+        </w:rPr>
+        <w:t>Electra One</w:t>
+      </w:r>
+    </w:p>
+    <w:p>
+      <w:pPr>
+        <w:spacing w:after="0"/>
+      </w:pPr>
+    </w:p>
+    <w:p>
+      <w:pPr>
+        <w:spacing w:after="0"/>
+        <w:rPr>
+          <w:sz w:val="20"/>
+          <w:szCs w:val="20"/>
+        </w:rPr>
+      </w:pPr>
+      <w:bookmarkStart w:id="4" w:name="_Hlk218004482"/>
+      <w:r>
+        <w:rPr>
+          <w:sz w:val="20"/>
+          <w:szCs w:val="20"/>
+        </w:rPr>
+        <w:t>The current version of the Electra One Continuum Controller</w:t>
+      </w:r>
+      <w:r>
+        <w:rPr>
+          <w:sz w:val="20"/>
+          <w:szCs w:val="20"/>
+        </w:rPr>
+        <w:t xml:space="preserve"> requires</w:t>
+      </w:r>
+      <w:r>
+        <w:rPr>
+          <w:sz w:val="20"/>
+          <w:szCs w:val="20"/>
+        </w:rPr>
+        <w:t xml:space="preserve"> </w:t>
+      </w:r>
+      <w:r>
+        <w:rPr>
+          <w:sz w:val="20"/>
+          <w:szCs w:val="20"/>
+        </w:rPr>
+        <w:t>t</w:t>
+      </w:r>
+      <w:r>
+        <w:rPr>
+          <w:sz w:val="20"/>
+          <w:szCs w:val="20"/>
+        </w:rPr>
+        <w:t xml:space="preserve">he following Electra One hardware and firmware versions: </w:t>
+      </w:r>
+    </w:p>
+    <w:p>
+      <w:pPr>
+        <w:spacing w:after="0"/>
+        <w:rPr>
+          <w:sz w:val="20"/>
+          <w:szCs w:val="20"/>
+        </w:rPr>
+      </w:pPr>
+    </w:p>
+    <w:p>
+      <w:pPr>
+        <w:pStyle w:val="ListParagraph"/>
+        <w:numPr>
+          <w:ilvl w:val="0"/>
+          <w:numId w:val="4"/>
+        </w:numPr>
+        <w:spacing w:after="0"/>
+        <w:rPr>
+          <w:sz w:val="20"/>
+          <w:szCs w:val="20"/>
+        </w:rPr>
+      </w:pPr>
+      <w:r>
+        <w:rPr>
+          <w:sz w:val="20"/>
+          <w:szCs w:val="20"/>
+        </w:rPr>
+        <w:t>Hardware: Mk II (It will not run on Mk1 models.)</w:t>
+      </w:r>
+    </w:p>
+    <w:p>
+      <w:pPr>
+        <w:pStyle w:val="ListParagraph"/>
+        <w:numPr>
+          <w:ilvl w:val="0"/>
+          <w:numId w:val="4"/>
+        </w:numPr>
+        <w:spacing w:after="0"/>
+        <w:rPr>
+          <w:strike/>
+          <w:sz w:val="20"/>
+          <w:szCs w:val="20"/>
+        </w:rPr>
+      </w:pPr>
+      <w:r>
+        <w:rPr>
+          <w:sz w:val="20"/>
+          <w:szCs w:val="20"/>
+        </w:rPr>
+        <w:t>Firmware: 4.0 or later</w:t>
+      </w:r>
+    </w:p>
+    <w:bookmarkEnd w:id="4"/>
+    <w:p>
+      <w:pPr>
+        <w:spacing w:after="0"/>
+        <w:rPr>
+          <w:sz w:val="20"/>
+          <w:szCs w:val="20"/>
+        </w:rPr>
+      </w:pPr>
+    </w:p>
+    <w:p>
+      <w:pPr>
+        <w:spacing w:after="0"/>
+        <w:rPr>
+          <w:b/>
+        </w:rPr>
+      </w:pPr>
+      <w:r>
+        <w:rPr>
+          <w:b/>
+        </w:rPr>
+        <w:t>Haken Audio Firmware</w:t>
+      </w:r>
+    </w:p>
+    <w:p>
+      <w:pPr>
+        <w:spacing w:after="0"/>
+        <w:rPr>
+          <w:bCs/>
+        </w:rPr>
+      </w:pPr>
+    </w:p>
+    <w:p>
+      <w:pPr>
+        <w:spacing w:after="0"/>
+        <w:rPr>
+          <w:sz w:val="20"/>
+          <w:szCs w:val="20"/>
+        </w:rPr>
+      </w:pPr>
+      <w:r>
+        <w:rPr>
+          <w:sz w:val="20"/>
+          <w:szCs w:val="20"/>
+        </w:rPr>
+        <w:t>Connected instruments must be running Haken Audio firmware 10.44 or later.</w:t>
+      </w:r>
+    </w:p>
+    <w:p>
+      <w:pPr>
+        <w:spacing w:after="0"/>
+        <w:rPr>
+          <w:sz w:val="20"/>
+          <w:szCs w:val="20"/>
+        </w:rPr>
+      </w:pPr>
+    </w:p>
+    <w:p>
+      <w:pPr>
+        <w:spacing w:after="0"/>
+        <w:rPr>
+          <w:b/>
+          <w:bCs/>
+        </w:rPr>
+      </w:pPr>
+      <w:r>
+        <w:rPr>
+          <w:b/>
+          <w:bCs/>
+        </w:rPr>
+        <w:t>Haken Continuum</w:t>
+      </w:r>
+      <w:r>
+        <w:rPr>
+          <w:b/>
+          <w:bCs/>
+        </w:rPr>
+        <w:t>s</w:t>
+      </w:r>
+    </w:p>
+    <w:p>
+      <w:pPr>
+        <w:spacing w:after="0"/>
+        <w:rPr>
+          <w:sz w:val="20"/>
+          <w:szCs w:val="20"/>
+        </w:rPr>
+      </w:pPr>
+    </w:p>
+    <w:p>
+      <w:pPr>
+        <w:spacing w:after="0"/>
+        <w:rPr>
+          <w:sz w:val="20"/>
+          <w:szCs w:val="20"/>
+        </w:rPr>
+      </w:pPr>
+      <w:r>
+        <w:rPr>
+          <w:sz w:val="20"/>
+          <w:szCs w:val="20"/>
+        </w:rPr>
+        <w:t xml:space="preserve">The controller has been verified to operate on all Slim Continuum and at least 2x DSP Thick Continuums as well as EaganMatrix Module. </w:t>
+      </w:r>
+      <w:r>
+        <w:rPr>
+          <w:sz w:val="20"/>
+          <w:szCs w:val="20"/>
+        </w:rPr>
+        <w:t xml:space="preserve">(1x DSP Continuum cannot run the minimum required Haken Audio firmware version.) </w:t>
+      </w:r>
+    </w:p>
+    <w:p>
+      <w:pPr>
+        <w:spacing w:after="0"/>
+        <w:rPr>
+          <w:sz w:val="20"/>
+          <w:szCs w:val="20"/>
+        </w:rPr>
+      </w:pPr>
+    </w:p>
+    <w:p>
+      <w:pPr>
+        <w:spacing w:after="0"/>
+      </w:pPr>
+      <w:r>
+        <w:rPr>
+          <w:b/>
+          <w:bCs/>
+        </w:rPr>
+        <w:t>EaganMatrix</w:t>
+      </w:r>
+      <w:r>
+        <w:rPr>
+          <w:b/>
+          <w:bCs/>
+        </w:rPr>
+        <w:t xml:space="preserve"> </w:t>
+      </w:r>
+      <w:r>
+        <w:rPr>
+          <w:b/>
+        </w:rPr>
+        <w:t>Eurorack</w:t>
+      </w:r>
+      <w:r>
+        <w:rPr>
+          <w:b/>
+          <w:bCs/>
+        </w:rPr>
+        <w:t xml:space="preserve"> Module</w:t>
+      </w:r>
+      <w:r>
+        <w:t>:</w:t>
+      </w:r>
+      <w:r>
+        <w:t xml:space="preserve"> </w:t>
+      </w:r>
+    </w:p>
+    <w:p>
+      <w:pPr>
+        <w:spacing w:after="0"/>
+        <w:rPr>
+          <w:sz w:val="20"/>
+          <w:szCs w:val="20"/>
+        </w:rPr>
+      </w:pPr>
+    </w:p>
+    <w:p>
+      <w:pPr>
+        <w:spacing w:after="0"/>
+        <w:rPr>
+          <w:sz w:val="20"/>
+          <w:szCs w:val="20"/>
+        </w:rPr>
+      </w:pPr>
+      <w:r>
+        <w:rPr>
+          <w:sz w:val="20"/>
+          <w:szCs w:val="20"/>
+        </w:rPr>
+        <w:t xml:space="preserve">The Electra One Continuum Controller supports the  EaganMatrix module (EMM). </w:t>
+      </w:r>
+    </w:p>
+    <w:p>
+      <w:pPr>
+        <w:spacing w:after="0"/>
+        <w:rPr>
+          <w:sz w:val="20"/>
+          <w:szCs w:val="20"/>
+        </w:rPr>
+      </w:pPr>
+    </w:p>
+    <w:p>
+      <w:pPr>
+        <w:spacing w:after="0"/>
+      </w:pPr>
+      <w:r>
+        <w:rPr>
+          <w:b/>
+          <w:bCs/>
+          <w:noProof/>
+        </w:rPr>
+        <w:t>ContinuuMini</w:t>
+      </w:r>
+      <w:r>
+        <w:rPr>
+          <w:b/>
+          <w:bCs/>
+        </w:rPr>
+        <w:t>/EaganMatrix Micro</w:t>
+      </w:r>
+      <w:r>
+        <w:t>:</w:t>
+      </w:r>
+    </w:p>
+    <w:p>
+      <w:pPr>
+        <w:spacing w:after="0"/>
+      </w:pPr>
+    </w:p>
+    <w:p>
+      <w:pPr>
+        <w:spacing w:after="0"/>
+        <w:rPr>
+          <w:sz w:val="20"/>
+          <w:szCs w:val="20"/>
+        </w:rPr>
+      </w:pPr>
+      <w:r>
+        <w:rPr>
+          <w:sz w:val="20"/>
+          <w:szCs w:val="20"/>
+        </w:rPr>
+        <w:t>Currently Not Supported</w:t>
+      </w:r>
+      <w:r>
+        <w:rPr>
+          <w:sz w:val="20"/>
+          <w:szCs w:val="20"/>
+        </w:rPr>
+        <w:t xml:space="preserve">. </w:t>
+      </w:r>
+    </w:p>
+    <w:p>
+      <w:pPr>
+        <w:spacing w:after="0"/>
+        <w:rPr>
+          <w:sz w:val="20"/>
+          <w:szCs w:val="20"/>
+        </w:rPr>
+      </w:pPr>
+    </w:p>
+    <w:p>
+      <w:pPr>
+        <w:spacing w:after="0"/>
+      </w:pPr>
+      <w:r>
+        <w:rPr>
+          <w:b/>
+          <w:bCs/>
+        </w:rPr>
+        <w:t>Osmose</w:t>
+      </w:r>
+      <w:r>
+        <w:t>:</w:t>
+      </w:r>
+      <w:r>
+        <w:t xml:space="preserve"> (</w:t>
+      </w:r>
+      <w:r>
+        <w:t>See Separate Osmose Controller)</w:t>
+      </w:r>
+    </w:p>
+    <w:p>
+      <w:pPr>
+        <w:spacing w:after="0"/>
+      </w:pPr>
+    </w:p>
+    <w:p>
+      <w:pPr>
+        <w:spacing w:after="0"/>
+        <w:rPr>
+          <w:sz w:val="20"/>
+          <w:szCs w:val="20"/>
+        </w:rPr>
+      </w:pPr>
+      <w:r>
+        <w:rPr>
+          <w:sz w:val="20"/>
+          <w:szCs w:val="20"/>
+        </w:rPr>
+        <w:t>A separate Osmose EL1 Controller is available for Osmose 2.1.21/10.52 firmware. Because this does not support a Preset management interface, it has reduced functionality versus the Continuum version.</w:t>
+      </w:r>
+    </w:p>
+    <w:p>
+      <w:pPr>
+        <w:spacing w:after="0"/>
+        <w:rPr>
+          <w:sz w:val="20"/>
+          <w:szCs w:val="20"/>
+        </w:rPr>
       </w:pPr>
     </w:p>
     <w:p>
@@ -2360,7 +3036,7 @@
           <w:szCs w:val="28"/>
         </w:rPr>
       </w:pPr>
-      <w:bookmarkStart w:id="2" w:name="_Toc222557534"/>
+      <w:bookmarkStart w:id="5" w:name="_Toc238395135"/>
       <w:r>
         <w:rPr>
           <w:b/>
@@ -2370,482 +3046,9 @@
           <w:szCs w:val="28"/>
         </w:rPr>
         <w:lastRenderedPageBreak/>
-        <w:t>Version Compatibility</w:t>
-      </w:r>
-      <w:bookmarkEnd w:id="2"/>
-    </w:p>
-    <w:p>
-      <w:pPr>
-        <w:spacing w:after="0"/>
-        <w:rPr>
-          <w:sz w:val="20"/>
-          <w:szCs w:val="20"/>
-        </w:rPr>
-      </w:pPr>
-    </w:p>
-    <w:p>
-      <w:pPr>
-        <w:spacing w:after="0"/>
-      </w:pPr>
-      <w:r>
-        <w:rPr>
-          <w:b/>
-          <w:bCs/>
-        </w:rPr>
-        <w:t>Electra One</w:t>
-      </w:r>
-    </w:p>
-    <w:p>
-      <w:pPr>
-        <w:spacing w:after="0"/>
-      </w:pPr>
-    </w:p>
-    <w:p>
-      <w:pPr>
-        <w:spacing w:after="0"/>
-        <w:rPr>
-          <w:sz w:val="20"/>
-          <w:szCs w:val="20"/>
-        </w:rPr>
-      </w:pPr>
-      <w:bookmarkStart w:id="3" w:name="_Hlk218004482"/>
-      <w:r>
-        <w:rPr>
-          <w:sz w:val="20"/>
-          <w:szCs w:val="20"/>
-        </w:rPr>
-        <w:t>The current version of the Electra One Continuum Controller</w:t>
-      </w:r>
-      <w:r>
-        <w:rPr>
-          <w:sz w:val="20"/>
-          <w:szCs w:val="20"/>
-        </w:rPr>
-        <w:t xml:space="preserve"> requires</w:t>
-      </w:r>
-      <w:r>
-        <w:rPr>
-          <w:sz w:val="20"/>
-          <w:szCs w:val="20"/>
-        </w:rPr>
-        <w:t xml:space="preserve"> </w:t>
-      </w:r>
-      <w:r>
-        <w:rPr>
-          <w:sz w:val="20"/>
-          <w:szCs w:val="20"/>
-        </w:rPr>
-        <w:t>t</w:t>
-      </w:r>
-      <w:r>
-        <w:rPr>
-          <w:sz w:val="20"/>
-          <w:szCs w:val="20"/>
-        </w:rPr>
-        <w:t xml:space="preserve">he following Electra One hardware and firmware versions: </w:t>
-      </w:r>
-    </w:p>
-    <w:p>
-      <w:pPr>
-        <w:spacing w:after="0"/>
-        <w:rPr>
-          <w:sz w:val="20"/>
-          <w:szCs w:val="20"/>
-        </w:rPr>
-      </w:pPr>
-    </w:p>
-    <w:p>
-      <w:pPr>
-        <w:pStyle w:val="ListParagraph"/>
-        <w:numPr>
-          <w:ilvl w:val="0"/>
-          <w:numId w:val="4"/>
-        </w:numPr>
-        <w:spacing w:after="0"/>
-        <w:rPr>
-          <w:sz w:val="20"/>
-          <w:szCs w:val="20"/>
-        </w:rPr>
-      </w:pPr>
-      <w:r>
-        <w:rPr>
-          <w:sz w:val="20"/>
-          <w:szCs w:val="20"/>
-        </w:rPr>
-        <w:t>Hardware: Mk II (It will not run on Mk1 models.)</w:t>
-      </w:r>
-    </w:p>
-    <w:p>
-      <w:pPr>
-        <w:pStyle w:val="ListParagraph"/>
-        <w:numPr>
-          <w:ilvl w:val="0"/>
-          <w:numId w:val="4"/>
-        </w:numPr>
-        <w:spacing w:after="0"/>
-        <w:rPr>
-          <w:strike/>
-          <w:sz w:val="20"/>
-          <w:szCs w:val="20"/>
-        </w:rPr>
-      </w:pPr>
-      <w:r>
-        <w:rPr>
-          <w:sz w:val="20"/>
-          <w:szCs w:val="20"/>
-        </w:rPr>
-        <w:t>Firmware: 4.0 or later</w:t>
-      </w:r>
-    </w:p>
-    <w:bookmarkEnd w:id="3"/>
-    <w:p>
-      <w:pPr>
-        <w:spacing w:after="0"/>
-        <w:rPr>
-          <w:sz w:val="20"/>
-          <w:szCs w:val="20"/>
-        </w:rPr>
-      </w:pPr>
-    </w:p>
-    <w:p>
-      <w:pPr>
-        <w:spacing w:after="0"/>
-        <w:rPr>
-          <w:b/>
-        </w:rPr>
-      </w:pPr>
-      <w:r>
-        <w:rPr>
-          <w:b/>
-        </w:rPr>
-        <w:t>Haken Audio Firmware</w:t>
-      </w:r>
-    </w:p>
-    <w:p>
-      <w:pPr>
-        <w:spacing w:after="0"/>
-        <w:rPr>
-          <w:bCs/>
-        </w:rPr>
-      </w:pPr>
-    </w:p>
-    <w:p>
-      <w:pPr>
-        <w:spacing w:after="0"/>
-        <w:rPr>
-          <w:sz w:val="20"/>
-          <w:szCs w:val="20"/>
-        </w:rPr>
-      </w:pPr>
-      <w:r>
-        <w:rPr>
-          <w:sz w:val="20"/>
-          <w:szCs w:val="20"/>
-        </w:rPr>
-        <w:t>Connected instruments must be running Haken Audio firmware 10.44 or later.</w:t>
-      </w:r>
-    </w:p>
-    <w:p>
-      <w:pPr>
-        <w:spacing w:after="0"/>
-        <w:rPr>
-          <w:sz w:val="20"/>
-          <w:szCs w:val="20"/>
-        </w:rPr>
-      </w:pPr>
-    </w:p>
-    <w:p>
-      <w:pPr>
-        <w:spacing w:after="0"/>
-        <w:rPr>
-          <w:b/>
-          <w:bCs/>
-        </w:rPr>
-      </w:pPr>
-      <w:r>
-        <w:rPr>
-          <w:b/>
-          <w:bCs/>
-        </w:rPr>
-        <w:t>Haken Continuum</w:t>
-      </w:r>
-      <w:r>
-        <w:rPr>
-          <w:b/>
-          <w:bCs/>
-        </w:rPr>
-        <w:t>s</w:t>
-      </w:r>
-    </w:p>
-    <w:p>
-      <w:pPr>
-        <w:spacing w:after="0"/>
-        <w:rPr>
-          <w:sz w:val="20"/>
-          <w:szCs w:val="20"/>
-        </w:rPr>
-      </w:pPr>
-    </w:p>
-    <w:p>
-      <w:pPr>
-        <w:spacing w:after="0"/>
-        <w:rPr>
-          <w:sz w:val="20"/>
-          <w:szCs w:val="20"/>
-        </w:rPr>
-      </w:pPr>
-      <w:r>
-        <w:rPr>
-          <w:sz w:val="20"/>
-          <w:szCs w:val="20"/>
-        </w:rPr>
-        <w:t xml:space="preserve">The controller has been verified to operate on all Slim Continuum and at least 2x DSP Thick Continuums as well as EaganMatrix Module. </w:t>
-      </w:r>
-      <w:r>
-        <w:rPr>
-          <w:sz w:val="20"/>
-          <w:szCs w:val="20"/>
-        </w:rPr>
-        <w:t xml:space="preserve">(1x DSP Continuum cannot run the minimum required Haken Audio firmware version.) </w:t>
-      </w:r>
-    </w:p>
-    <w:p>
-      <w:pPr>
-        <w:spacing w:after="0"/>
-        <w:rPr>
-          <w:sz w:val="20"/>
-          <w:szCs w:val="20"/>
-        </w:rPr>
-      </w:pPr>
-    </w:p>
-    <w:p>
-      <w:pPr>
-        <w:spacing w:after="0"/>
-      </w:pPr>
-      <w:r>
-        <w:rPr>
-          <w:b/>
-          <w:bCs/>
-        </w:rPr>
-        <w:t>EaganMatrix</w:t>
-      </w:r>
-      <w:r>
-        <w:rPr>
-          <w:b/>
-          <w:bCs/>
-        </w:rPr>
-        <w:t xml:space="preserve"> </w:t>
-      </w:r>
-      <w:r>
-        <w:rPr>
-          <w:b/>
-        </w:rPr>
-        <w:t>Eurorack</w:t>
-      </w:r>
-      <w:r>
-        <w:rPr>
-          <w:b/>
-          <w:bCs/>
-        </w:rPr>
-        <w:t xml:space="preserve"> Module</w:t>
-      </w:r>
-      <w:r>
-        <w:t>:</w:t>
-      </w:r>
-      <w:r>
-        <w:t xml:space="preserve"> </w:t>
-      </w:r>
-    </w:p>
-    <w:p>
-      <w:pPr>
-        <w:spacing w:after="0"/>
-        <w:rPr>
-          <w:sz w:val="20"/>
-          <w:szCs w:val="20"/>
-        </w:rPr>
-      </w:pPr>
-    </w:p>
-    <w:p>
-      <w:pPr>
-        <w:spacing w:after="0"/>
-        <w:rPr>
-          <w:sz w:val="20"/>
-          <w:szCs w:val="20"/>
-        </w:rPr>
-      </w:pPr>
-      <w:r>
-        <w:rPr>
-          <w:sz w:val="20"/>
-          <w:szCs w:val="20"/>
-        </w:rPr>
-        <w:t xml:space="preserve">The Electra One Continuum Controller supports the  EaganMatrix module (EMM). </w:t>
-      </w:r>
-    </w:p>
-    <w:p>
-      <w:pPr>
-        <w:spacing w:after="0"/>
-        <w:rPr>
-          <w:sz w:val="20"/>
-          <w:szCs w:val="20"/>
-        </w:rPr>
-      </w:pPr>
-    </w:p>
-    <w:p>
-      <w:pPr>
-        <w:spacing w:after="0"/>
-      </w:pPr>
-      <w:r>
-        <w:rPr>
-          <w:b/>
-          <w:bCs/>
-          <w:noProof/>
-        </w:rPr>
-        <w:t>ContinuuMini</w:t>
-      </w:r>
-      <w:r>
-        <w:rPr>
-          <w:b/>
-          <w:bCs/>
-        </w:rPr>
-        <w:t>/EaganMatrix Micro</w:t>
-      </w:r>
-      <w:r>
-        <w:t>:</w:t>
-      </w:r>
-    </w:p>
-    <w:p>
-      <w:pPr>
-        <w:spacing w:after="0"/>
-      </w:pPr>
-    </w:p>
-    <w:p>
-      <w:pPr>
-        <w:spacing w:after="0"/>
-        <w:rPr>
-          <w:sz w:val="20"/>
-          <w:szCs w:val="20"/>
-        </w:rPr>
-      </w:pPr>
-      <w:r>
-        <w:rPr>
-          <w:sz w:val="20"/>
-          <w:szCs w:val="20"/>
-        </w:rPr>
-        <w:t>Currently Not Supported</w:t>
-      </w:r>
-      <w:r>
-        <w:rPr>
-          <w:sz w:val="20"/>
-          <w:szCs w:val="20"/>
-        </w:rPr>
-        <w:t xml:space="preserve">. </w:t>
-      </w:r>
-    </w:p>
-    <w:p>
-      <w:pPr>
-        <w:spacing w:after="0"/>
-        <w:rPr>
-          <w:sz w:val="20"/>
-          <w:szCs w:val="20"/>
-        </w:rPr>
-      </w:pPr>
-    </w:p>
-    <w:p>
-      <w:pPr>
-        <w:spacing w:after="0"/>
-      </w:pPr>
-      <w:r>
-        <w:rPr>
-          <w:b/>
-          <w:bCs/>
-        </w:rPr>
-        <w:t>Osmose</w:t>
-      </w:r>
-      <w:r>
-        <w:t>:</w:t>
-      </w:r>
-      <w:r>
-        <w:t xml:space="preserve"> (</w:t>
-      </w:r>
-      <w:r>
-        <w:t>See Separate Osmose Controller)</w:t>
-      </w:r>
-    </w:p>
-    <w:p>
-      <w:pPr>
-        <w:spacing w:after="0"/>
-      </w:pPr>
-    </w:p>
-    <w:p>
-      <w:pPr>
-        <w:spacing w:after="0"/>
-        <w:rPr>
-          <w:sz w:val="20"/>
-          <w:szCs w:val="20"/>
-        </w:rPr>
-      </w:pPr>
-      <w:r>
-        <w:rPr>
-          <w:sz w:val="20"/>
-          <w:szCs w:val="20"/>
-        </w:rPr>
-        <w:t>A separate Osmose EL1 Controller is available for Osmose 2.1.21/10.52 firmware. Because this does not support a Preset management interface, it has reduced functionality versus the Continuum version.</w:t>
-      </w:r>
-    </w:p>
-    <w:p>
-      <w:pPr>
-        <w:spacing w:after="0"/>
-        <w:rPr>
-          <w:sz w:val="20"/>
-          <w:szCs w:val="20"/>
-        </w:rPr>
-      </w:pPr>
-    </w:p>
-    <w:p>
-      <w:pPr>
-        <w:rPr>
-          <w:rFonts w:asciiTheme="majorHAnsi" w:eastAsiaTheme="majorEastAsia" w:hAnsiTheme="majorHAnsi" w:cstheme="majorBidi"/>
-          <w:b/>
-          <w:bCs/>
-          <w:sz w:val="28"/>
-          <w:szCs w:val="28"/>
-        </w:rPr>
-      </w:pPr>
-      <w:r>
-        <w:rPr>
-          <w:b/>
-          <w:bCs/>
-          <w:sz w:val="28"/>
-          <w:szCs w:val="28"/>
-        </w:rPr>
-        <w:br w:type="page"/>
-      </w:r>
-    </w:p>
-    <w:p>
-      <w:pPr>
-        <w:pStyle w:val="Heading1"/>
-        <w:spacing w:before="0" w:after="0"/>
-        <w:rPr>
-          <w:b/>
-          <w:bCs/>
-          <w:color w:val="auto"/>
-          <w:sz w:val="28"/>
-          <w:szCs w:val="28"/>
-        </w:rPr>
-      </w:pPr>
-      <w:bookmarkStart w:id="4" w:name="_Toc222557535"/>
-      <w:r>
-        <w:rPr>
-          <w:b/>
-          <w:bCs/>
-          <w:color w:val="auto"/>
-          <w:sz w:val="28"/>
-          <w:szCs w:val="28"/>
-        </w:rPr>
-        <w:lastRenderedPageBreak/>
         <w:t>Connecting the Electra One to the Haken Continuum</w:t>
       </w:r>
-      <w:bookmarkEnd w:id="4"/>
+      <w:bookmarkEnd w:id="5"/>
       <w:r>
         <w:rPr>
           <w:b/>
@@ -2981,7 +3184,7 @@
           <w:szCs w:val="20"/>
         </w:rPr>
       </w:pPr>
-      <w:bookmarkStart w:id="5" w:name="_Toc177205373"/>
+      <w:bookmarkStart w:id="6" w:name="_Toc177205373"/>
       <w:r>
         <w:t xml:space="preserve">Figure </w:t>
       </w:r>
@@ -2996,7 +3199,7 @@
       <w:r>
         <w:t>- Connecting the Electra One to the Haken Slim Continuum</w:t>
       </w:r>
-      <w:bookmarkEnd w:id="5"/>
+      <w:bookmarkEnd w:id="6"/>
     </w:p>
     <w:p>
       <w:pPr>
@@ -3054,7 +3257,7 @@
           <w:szCs w:val="24"/>
         </w:rPr>
       </w:pPr>
-      <w:bookmarkStart w:id="6" w:name="_Toc222557536"/>
+      <w:bookmarkStart w:id="7" w:name="_Toc238395136"/>
       <w:r>
         <w:rPr>
           <w:b/>
@@ -3085,7 +3288,7 @@
         </w:rPr>
         <w:t>Continuum Controller</w:t>
       </w:r>
-      <w:bookmarkEnd w:id="6"/>
+      <w:bookmarkEnd w:id="7"/>
     </w:p>
     <w:p>
       <w:pPr>
@@ -3378,7 +3581,7 @@
           <w:szCs w:val="28"/>
         </w:rPr>
       </w:pPr>
-      <w:bookmarkStart w:id="7" w:name="_Toc222557537"/>
+      <w:bookmarkStart w:id="8" w:name="_Toc238395137"/>
       <w:r>
         <w:rPr>
           <w:b/>
@@ -3390,7 +3593,7 @@
         <w:lastRenderedPageBreak/>
         <w:t>Electra One Controller Navigation</w:t>
       </w:r>
-      <w:bookmarkEnd w:id="7"/>
+      <w:bookmarkEnd w:id="8"/>
     </w:p>
     <w:p>
       <w:pPr>
@@ -3515,7 +3718,7 @@
           <w:szCs w:val="20"/>
         </w:rPr>
       </w:pPr>
-      <w:bookmarkStart w:id="8" w:name="_Toc177205374"/>
+      <w:bookmarkStart w:id="9" w:name="_Toc177205374"/>
       <w:r>
         <w:t xml:space="preserve">Figure </w:t>
       </w:r>
@@ -3530,7 +3733,7 @@
       <w:r>
         <w:t xml:space="preserve"> - Basic Electra One Navigation</w:t>
       </w:r>
-      <w:bookmarkEnd w:id="8"/>
+      <w:bookmarkEnd w:id="9"/>
     </w:p>
     <w:p>
       <w:pPr>
@@ -3553,7 +3756,7 @@
           <w:szCs w:val="28"/>
         </w:rPr>
       </w:pPr>
-      <w:bookmarkStart w:id="9" w:name="_Toc222557538"/>
+      <w:bookmarkStart w:id="10" w:name="_Toc238395138"/>
       <w:r>
         <w:rPr>
           <w:b/>
@@ -3564,7 +3767,7 @@
         </w:rPr>
         <w:t>Continuum Controller Pages</w:t>
       </w:r>
-      <w:bookmarkEnd w:id="9"/>
+      <w:bookmarkEnd w:id="10"/>
     </w:p>
     <w:p>
       <w:pPr>
@@ -4120,7 +4323,39 @@
           <w:sz w:val="20"/>
           <w:szCs w:val="20"/>
         </w:rPr>
-        <w:t>Change Recirculator settings and Recirculator type</w:t>
+        <w:t xml:space="preserve">Change </w:t>
+      </w:r>
+      <w:proofErr w:type="spellStart"/>
+      <w:r>
+        <w:rPr>
+          <w:sz w:val="20"/>
+          <w:szCs w:val="20"/>
+        </w:rPr>
+        <w:t>Recirculator</w:t>
+      </w:r>
+      <w:proofErr w:type="spellEnd"/>
+      <w:r>
+        <w:rPr>
+          <w:sz w:val="20"/>
+          <w:szCs w:val="20"/>
+        </w:rPr>
+        <w:t xml:space="preserve"> settings and </w:t>
+      </w:r>
+      <w:proofErr w:type="spellStart"/>
+      <w:r>
+        <w:rPr>
+          <w:sz w:val="20"/>
+          <w:szCs w:val="20"/>
+        </w:rPr>
+        <w:t>Recirculator</w:t>
+      </w:r>
+      <w:proofErr w:type="spellEnd"/>
+      <w:r>
+        <w:rPr>
+          <w:sz w:val="20"/>
+          <w:szCs w:val="20"/>
+        </w:rPr>
+        <w:t xml:space="preserve"> type</w:t>
       </w:r>
     </w:p>
     <w:p>
@@ -4141,7 +4376,39 @@
           <w:sz w:val="20"/>
           <w:szCs w:val="20"/>
         </w:rPr>
-        <w:t>Mute output in case of a increasing recirculator feedback loop</w:t>
+        <w:t xml:space="preserve">Mute output in case of </w:t>
+      </w:r>
+      <w:proofErr w:type="spellStart"/>
+      <w:r>
+        <w:rPr>
+          <w:sz w:val="20"/>
+          <w:szCs w:val="20"/>
+        </w:rPr>
+        <w:t>a</w:t>
+      </w:r>
+      <w:proofErr w:type="spellEnd"/>
+      <w:r>
+        <w:rPr>
+          <w:sz w:val="20"/>
+          <w:szCs w:val="20"/>
+        </w:rPr>
+        <w:t xml:space="preserve"> increasing </w:t>
+      </w:r>
+      <w:proofErr w:type="spellStart"/>
+      <w:r>
+        <w:rPr>
+          <w:sz w:val="20"/>
+          <w:szCs w:val="20"/>
+        </w:rPr>
+        <w:t>recirculator</w:t>
+      </w:r>
+      <w:proofErr w:type="spellEnd"/>
+      <w:r>
+        <w:rPr>
+          <w:sz w:val="20"/>
+          <w:szCs w:val="20"/>
+        </w:rPr>
+        <w:t xml:space="preserve"> feedback loop</w:t>
       </w:r>
     </w:p>
     <w:p>
@@ -4204,7 +4471,23 @@
           <w:sz w:val="20"/>
           <w:szCs w:val="20"/>
         </w:rPr>
-        <w:t>Turn Global Recirculator Off if you want to used external effects</w:t>
+        <w:t xml:space="preserve">Turn Global </w:t>
+      </w:r>
+      <w:proofErr w:type="spellStart"/>
+      <w:r>
+        <w:rPr>
+          <w:sz w:val="20"/>
+          <w:szCs w:val="20"/>
+        </w:rPr>
+        <w:t>Recirculator</w:t>
+      </w:r>
+      <w:proofErr w:type="spellEnd"/>
+      <w:r>
+        <w:rPr>
+          <w:sz w:val="20"/>
+          <w:szCs w:val="20"/>
+        </w:rPr>
+        <w:t xml:space="preserve"> Off if you want to used external effects</w:t>
       </w:r>
     </w:p>
     <w:p>
@@ -4784,7 +5067,7 @@
           <w:szCs w:val="24"/>
         </w:rPr>
       </w:pPr>
-      <w:bookmarkStart w:id="10" w:name="_Toc222557539"/>
+      <w:bookmarkStart w:id="11" w:name="_Toc238395139"/>
       <w:r>
         <w:rPr>
           <w:b/>
@@ -4816,7 +5099,7 @@
         </w:rPr>
         <w:t xml:space="preserve"> and Macros Page</w:t>
       </w:r>
-      <w:bookmarkEnd w:id="10"/>
+      <w:bookmarkEnd w:id="11"/>
     </w:p>
     <w:p>
       <w:pPr>
@@ -5329,7 +5612,7 @@
           <w:szCs w:val="20"/>
         </w:rPr>
       </w:pPr>
-      <w:bookmarkStart w:id="11" w:name="_Toc177205375"/>
+      <w:bookmarkStart w:id="12" w:name="_Toc177205375"/>
     </w:p>
     <w:p>
       <w:pPr>
@@ -5359,7 +5642,7 @@
       <w:r>
         <w:t>Page</w:t>
       </w:r>
-      <w:bookmarkEnd w:id="11"/>
+      <w:bookmarkEnd w:id="12"/>
     </w:p>
     <w:p>
       <w:pPr>
@@ -5381,9 +5664,9 @@
           <w:szCs w:val="24"/>
         </w:rPr>
       </w:pPr>
-      <w:bookmarkStart w:id="12" w:name="_Loading_Presets"/>
-      <w:bookmarkStart w:id="13" w:name="_Toc222557540"/>
-      <w:bookmarkEnd w:id="12"/>
+      <w:bookmarkStart w:id="13" w:name="_Loading_Presets"/>
+      <w:bookmarkStart w:id="14" w:name="_Toc238395140"/>
+      <w:bookmarkEnd w:id="13"/>
       <w:r>
         <w:rPr>
           <w:b/>
@@ -5393,7 +5676,7 @@
         </w:rPr>
         <w:t>Loading Presets</w:t>
       </w:r>
-      <w:bookmarkEnd w:id="13"/>
+      <w:bookmarkEnd w:id="14"/>
     </w:p>
     <w:p>
       <w:pPr>
@@ -5984,6 +6267,7 @@
           <w:sz w:val="20"/>
           <w:szCs w:val="20"/>
         </w:rPr>
+        <w:lastRenderedPageBreak/>
         <w:t xml:space="preserve">The connected </w:t>
       </w:r>
       <w:r>
@@ -6012,7 +6296,6 @@
           <w:sz w:val="20"/>
           <w:szCs w:val="20"/>
         </w:rPr>
-        <w:lastRenderedPageBreak/>
         <w:t>The Load Presets</w:t>
       </w:r>
       <w:r>
@@ -6352,9 +6635,9 @@
           <w:szCs w:val="24"/>
         </w:rPr>
       </w:pPr>
-      <w:bookmarkStart w:id="14" w:name="_Selecting_Presets"/>
-      <w:bookmarkStart w:id="15" w:name="_Toc222557541"/>
-      <w:bookmarkEnd w:id="14"/>
+      <w:bookmarkStart w:id="15" w:name="_Selecting_Presets"/>
+      <w:bookmarkStart w:id="16" w:name="_Toc238395141"/>
+      <w:bookmarkEnd w:id="15"/>
       <w:r>
         <w:rPr>
           <w:b/>
@@ -6365,7 +6648,7 @@
         </w:rPr>
         <w:t>Selecting Presets</w:t>
       </w:r>
-      <w:bookmarkEnd w:id="15"/>
+      <w:bookmarkEnd w:id="16"/>
     </w:p>
     <w:p>
       <w:pPr>
@@ -6760,7 +7043,7 @@
           <w:szCs w:val="24"/>
         </w:rPr>
       </w:pPr>
-      <w:bookmarkStart w:id="16" w:name="_Toc222557542"/>
+      <w:bookmarkStart w:id="17" w:name="_Toc238395142"/>
       <w:r>
         <w:rPr>
           <w:b/>
@@ -6769,10 +7052,9 @@
           <w:sz w:val="24"/>
           <w:szCs w:val="24"/>
         </w:rPr>
-        <w:lastRenderedPageBreak/>
         <w:t>Storing presets</w:t>
       </w:r>
-      <w:bookmarkEnd w:id="16"/>
+      <w:bookmarkEnd w:id="17"/>
     </w:p>
     <w:p>
       <w:pPr>
@@ -7593,7 +7875,7 @@
           <w:szCs w:val="24"/>
         </w:rPr>
       </w:pPr>
-      <w:bookmarkStart w:id="17" w:name="_Toc222557543"/>
+      <w:bookmarkStart w:id="18" w:name="_Toc238395143"/>
       <w:r>
         <w:rPr>
           <w:b/>
@@ -7604,7 +7886,7 @@
         </w:rPr>
         <w:t>Clearing presets</w:t>
       </w:r>
-      <w:bookmarkEnd w:id="17"/>
+      <w:bookmarkEnd w:id="18"/>
     </w:p>
     <w:p>
       <w:pPr>
@@ -7647,7 +7929,7 @@
           <w:szCs w:val="24"/>
         </w:rPr>
       </w:pPr>
-      <w:bookmarkStart w:id="18" w:name="_Toc222557544"/>
+      <w:bookmarkStart w:id="19" w:name="_Toc238395144"/>
       <w:r>
         <w:rPr>
           <w:b/>
@@ -7658,7 +7940,7 @@
         </w:rPr>
         <w:t>Effects/Pedals Page</w:t>
       </w:r>
-      <w:bookmarkEnd w:id="18"/>
+      <w:bookmarkEnd w:id="19"/>
     </w:p>
     <w:p>
       <w:pPr>
@@ -7738,7 +8020,7 @@
         <w:pStyle w:val="Caption"/>
         <w:spacing w:after="0"/>
       </w:pPr>
-      <w:bookmarkStart w:id="19" w:name="_Toc177205376"/>
+      <w:bookmarkStart w:id="20" w:name="_Toc177205376"/>
       <w:r>
         <w:t xml:space="preserve">Figure </w:t>
       </w:r>
@@ -7753,7 +8035,7 @@
       <w:r>
         <w:t xml:space="preserve"> - Effects and Pedals Page</w:t>
       </w:r>
-      <w:bookmarkEnd w:id="19"/>
+      <w:bookmarkEnd w:id="20"/>
     </w:p>
     <w:p>
       <w:pPr>
@@ -7806,6 +8088,7 @@
           <w:szCs w:val="20"/>
         </w:rPr>
       </w:pPr>
+      <w:proofErr w:type="spellStart"/>
       <w:r>
         <w:rPr>
           <w:b/>
@@ -7813,14 +8096,40 @@
           <w:sz w:val="20"/>
           <w:szCs w:val="20"/>
         </w:rPr>
-        <w:t>Recirculator Type</w:t>
-      </w:r>
-      <w:r>
-        <w:rPr>
-          <w:sz w:val="20"/>
-          <w:szCs w:val="20"/>
-        </w:rPr>
-        <w:t>: Changes the Recirculator settings to one of the reverb or delay options:</w:t>
+        <w:t>Recirculator</w:t>
+      </w:r>
+      <w:proofErr w:type="spellEnd"/>
+      <w:r>
+        <w:rPr>
+          <w:b/>
+          <w:bCs/>
+          <w:sz w:val="20"/>
+          <w:szCs w:val="20"/>
+        </w:rPr>
+        <w:t xml:space="preserve"> Type</w:t>
+      </w:r>
+      <w:r>
+        <w:rPr>
+          <w:sz w:val="20"/>
+          <w:szCs w:val="20"/>
+        </w:rPr>
+        <w:t xml:space="preserve">: Changes the </w:t>
+      </w:r>
+      <w:proofErr w:type="spellStart"/>
+      <w:r>
+        <w:rPr>
+          <w:sz w:val="20"/>
+          <w:szCs w:val="20"/>
+        </w:rPr>
+        <w:t>Recirculator</w:t>
+      </w:r>
+      <w:proofErr w:type="spellEnd"/>
+      <w:r>
+        <w:rPr>
+          <w:sz w:val="20"/>
+          <w:szCs w:val="20"/>
+        </w:rPr>
+        <w:t xml:space="preserve"> settings to one of the reverb or delay options:</w:t>
       </w:r>
     </w:p>
     <w:p>
@@ -7992,6 +8301,7 @@
           <w:szCs w:val="20"/>
         </w:rPr>
       </w:pPr>
+      <w:proofErr w:type="spellStart"/>
       <w:r>
         <w:rPr>
           <w:b/>
@@ -7999,7 +8309,17 @@
           <w:sz w:val="20"/>
           <w:szCs w:val="20"/>
         </w:rPr>
-        <w:t>Recirculator Controls</w:t>
+        <w:t>Recirculator</w:t>
+      </w:r>
+      <w:proofErr w:type="spellEnd"/>
+      <w:r>
+        <w:rPr>
+          <w:b/>
+          <w:bCs/>
+          <w:sz w:val="20"/>
+          <w:szCs w:val="20"/>
+        </w:rPr>
+        <w:t xml:space="preserve"> Controls</w:t>
       </w:r>
       <w:r>
         <w:rPr>
@@ -8013,7 +8333,23 @@
           <w:sz w:val="20"/>
           <w:szCs w:val="20"/>
         </w:rPr>
-        <w:t xml:space="preserve"> The control names are fixed in the Continuum Controller display (Mix, Delay (time), Feedback, Rate and Depth). These change names when using the editor for some of the Recirculator options.</w:t>
+        <w:t xml:space="preserve"> The control names are fixed in the Continuum Controller display (Mix, Delay (time), Feedback, Rate and Depth). These change names when using the editor for some of the </w:t>
+      </w:r>
+      <w:proofErr w:type="spellStart"/>
+      <w:r>
+        <w:rPr>
+          <w:sz w:val="20"/>
+          <w:szCs w:val="20"/>
+        </w:rPr>
+        <w:t>Recirculator</w:t>
+      </w:r>
+      <w:proofErr w:type="spellEnd"/>
+      <w:r>
+        <w:rPr>
+          <w:sz w:val="20"/>
+          <w:szCs w:val="20"/>
+        </w:rPr>
+        <w:t xml:space="preserve"> options.</w:t>
       </w:r>
     </w:p>
     <w:p>
@@ -8256,7 +8592,23 @@
           <w:sz w:val="20"/>
           <w:szCs w:val="20"/>
         </w:rPr>
-        <w:t xml:space="preserve">: This will turn the recirculator off. Make your output totally dry (though it does not affect any programmed delays that might be used in your current preset). This is the same as using the similar function in the Editor’s </w:t>
+        <w:t xml:space="preserve">: This will turn the </w:t>
+      </w:r>
+      <w:proofErr w:type="spellStart"/>
+      <w:r>
+        <w:rPr>
+          <w:sz w:val="20"/>
+          <w:szCs w:val="20"/>
+        </w:rPr>
+        <w:t>recirculator</w:t>
+      </w:r>
+      <w:proofErr w:type="spellEnd"/>
+      <w:r>
+        <w:rPr>
+          <w:sz w:val="20"/>
+          <w:szCs w:val="20"/>
+        </w:rPr>
+        <w:t xml:space="preserve"> off. Make your output totally dry (though it does not affect any programmed delays that might be used in your current preset). This is the same as using the similar function in the Editor’s </w:t>
       </w:r>
       <w:r>
         <w:rPr>
@@ -8293,7 +8645,39 @@
           <w:sz w:val="20"/>
           <w:szCs w:val="20"/>
         </w:rPr>
-        <w:t xml:space="preserve"> page. This will disable the recirculator until it is reenabled with this control or with the similar control in the editor. If you load a preset and it is totally dry and you can’t seem to apply reverb or delay, make sure this control is not set to recirculator off. </w:t>
+        <w:t xml:space="preserve"> page. This will disable the </w:t>
+      </w:r>
+      <w:proofErr w:type="spellStart"/>
+      <w:r>
+        <w:rPr>
+          <w:sz w:val="20"/>
+          <w:szCs w:val="20"/>
+        </w:rPr>
+        <w:t>recirculator</w:t>
+      </w:r>
+      <w:proofErr w:type="spellEnd"/>
+      <w:r>
+        <w:rPr>
+          <w:sz w:val="20"/>
+          <w:szCs w:val="20"/>
+        </w:rPr>
+        <w:t xml:space="preserve"> until it is reenabled with this control or with the similar control in the editor. If you load a preset and it is totally dry and you can’t seem to apply reverb or delay, make sure this control is not set to </w:t>
+      </w:r>
+      <w:proofErr w:type="spellStart"/>
+      <w:r>
+        <w:rPr>
+          <w:sz w:val="20"/>
+          <w:szCs w:val="20"/>
+        </w:rPr>
+        <w:t>recirculator</w:t>
+      </w:r>
+      <w:proofErr w:type="spellEnd"/>
+      <w:r>
+        <w:rPr>
+          <w:sz w:val="20"/>
+          <w:szCs w:val="20"/>
+        </w:rPr>
+        <w:t xml:space="preserve"> off. </w:t>
       </w:r>
     </w:p>
     <w:p>
@@ -9029,7 +9413,7 @@
           <w:szCs w:val="24"/>
         </w:rPr>
       </w:pPr>
-      <w:bookmarkStart w:id="20" w:name="_Toc222557545"/>
+      <w:bookmarkStart w:id="21" w:name="_Toc238395145"/>
       <w:r>
         <w:rPr>
           <w:b/>
@@ -9041,26 +9425,26 @@
         <w:lastRenderedPageBreak/>
         <w:t>Gain and Convolution Page</w:t>
       </w:r>
-      <w:bookmarkEnd w:id="20"/>
-    </w:p>
-    <w:p>
-      <w:pPr>
-        <w:spacing w:after="0"/>
-        <w:rPr>
-          <w:sz w:val="20"/>
-          <w:szCs w:val="20"/>
-        </w:rPr>
-      </w:pPr>
-    </w:p>
-    <w:p>
-      <w:pPr>
-        <w:spacing w:after="0"/>
-        <w:rPr>
-          <w:sz w:val="20"/>
-          <w:szCs w:val="20"/>
-        </w:rPr>
-      </w:pPr>
-      <w:bookmarkStart w:id="21" w:name="_Toc177205377"/>
+      <w:bookmarkEnd w:id="21"/>
+    </w:p>
+    <w:p>
+      <w:pPr>
+        <w:spacing w:after="0"/>
+        <w:rPr>
+          <w:sz w:val="20"/>
+          <w:szCs w:val="20"/>
+        </w:rPr>
+      </w:pPr>
+    </w:p>
+    <w:p>
+      <w:pPr>
+        <w:spacing w:after="0"/>
+        <w:rPr>
+          <w:sz w:val="20"/>
+          <w:szCs w:val="20"/>
+        </w:rPr>
+      </w:pPr>
+      <w:bookmarkStart w:id="22" w:name="_Toc177205377"/>
       <w:r>
         <w:rPr>
           <w:noProof/>
@@ -9138,7 +9522,7 @@
       <w:r>
         <w:t xml:space="preserve"> - Gain and Convolution Page</w:t>
       </w:r>
-      <w:bookmarkEnd w:id="21"/>
+      <w:bookmarkEnd w:id="22"/>
     </w:p>
     <w:p>
       <w:pPr>
@@ -9666,12 +10050,14 @@
         <w:rPr>
           <w:sz w:val="20"/>
           <w:szCs w:val="20"/>
-        </w:rPr>
-      </w:pPr>
-      <w:r>
-        <w:rPr>
-          <w:sz w:val="20"/>
-          <w:szCs w:val="20"/>
+          <w:lang w:val="fr-FR"/>
+        </w:rPr>
+      </w:pPr>
+      <w:r>
+        <w:rPr>
+          <w:sz w:val="20"/>
+          <w:szCs w:val="20"/>
+          <w:lang w:val="fr-FR"/>
         </w:rPr>
         <w:t>LVDL Pyramid</w:t>
       </w:r>
@@ -9679,6 +10065,7 @@
         <w:rPr>
           <w:sz w:val="20"/>
           <w:szCs w:val="20"/>
+          <w:lang w:val="fr-FR"/>
         </w:rPr>
         <w:t xml:space="preserve"> (La Voix du Luthier)</w:t>
       </w:r>
@@ -9952,7 +10339,7 @@
           <w:szCs w:val="24"/>
         </w:rPr>
       </w:pPr>
-      <w:bookmarkStart w:id="22" w:name="_Toc222557546"/>
+      <w:bookmarkStart w:id="23" w:name="_Toc238395146"/>
       <w:r>
         <w:rPr>
           <w:b/>
@@ -9964,7 +10351,7 @@
         <w:lastRenderedPageBreak/>
         <w:t>Transposition Page</w:t>
       </w:r>
-      <w:bookmarkEnd w:id="22"/>
+      <w:bookmarkEnd w:id="23"/>
     </w:p>
     <w:p>
       <w:pPr>
@@ -10052,7 +10439,7 @@
           <w:szCs w:val="20"/>
         </w:rPr>
       </w:pPr>
-      <w:bookmarkStart w:id="23" w:name="_Toc177205378"/>
+      <w:bookmarkStart w:id="24" w:name="_Toc177205378"/>
     </w:p>
     <w:p>
       <w:pPr>
@@ -10073,7 +10460,7 @@
       <w:r>
         <w:t xml:space="preserve"> - Transposition Page</w:t>
       </w:r>
-      <w:bookmarkEnd w:id="23"/>
+      <w:bookmarkEnd w:id="24"/>
     </w:p>
     <w:p>
       <w:pPr>
@@ -10294,7 +10681,6 @@
         <w:spacing w:after="0"/>
       </w:pPr>
       <w:r>
-        <w:lastRenderedPageBreak/>
         <w:t>Instant</w:t>
       </w:r>
     </w:p>
@@ -10368,7 +10754,7 @@
           <w:szCs w:val="24"/>
         </w:rPr>
       </w:pPr>
-      <w:bookmarkStart w:id="24" w:name="_Toc222557547"/>
+      <w:bookmarkStart w:id="25" w:name="_Toc238395147"/>
       <w:r>
         <w:rPr>
           <w:b/>
@@ -10380,26 +10766,26 @@
         <w:lastRenderedPageBreak/>
         <w:t>Rounding and Tuning Page</w:t>
       </w:r>
-      <w:bookmarkEnd w:id="24"/>
-    </w:p>
-    <w:p>
-      <w:pPr>
-        <w:spacing w:after="0"/>
-        <w:rPr>
-          <w:sz w:val="20"/>
-          <w:szCs w:val="20"/>
-        </w:rPr>
-      </w:pPr>
-    </w:p>
-    <w:p>
-      <w:pPr>
-        <w:spacing w:after="0"/>
-        <w:rPr>
-          <w:sz w:val="20"/>
-          <w:szCs w:val="20"/>
-        </w:rPr>
-      </w:pPr>
-      <w:bookmarkStart w:id="25" w:name="_Toc177205379"/>
+      <w:bookmarkEnd w:id="25"/>
+    </w:p>
+    <w:p>
+      <w:pPr>
+        <w:spacing w:after="0"/>
+        <w:rPr>
+          <w:sz w:val="20"/>
+          <w:szCs w:val="20"/>
+        </w:rPr>
+      </w:pPr>
+    </w:p>
+    <w:p>
+      <w:pPr>
+        <w:spacing w:after="0"/>
+        <w:rPr>
+          <w:sz w:val="20"/>
+          <w:szCs w:val="20"/>
+        </w:rPr>
+      </w:pPr>
+      <w:bookmarkStart w:id="26" w:name="_Toc177205379"/>
       <w:r>
         <w:rPr>
           <w:noProof/>
@@ -10477,7 +10863,7 @@
       <w:r>
         <w:t xml:space="preserve"> - Rounding and Tuning Page</w:t>
       </w:r>
-      <w:bookmarkEnd w:id="25"/>
+      <w:bookmarkEnd w:id="26"/>
     </w:p>
     <w:p>
       <w:pPr>
@@ -10989,7 +11375,7 @@
           <w:szCs w:val="24"/>
         </w:rPr>
       </w:pPr>
-      <w:bookmarkStart w:id="26" w:name="_Toc222557548"/>
+      <w:bookmarkStart w:id="27" w:name="_Toc238395148"/>
       <w:r>
         <w:rPr>
           <w:b/>
@@ -11001,7 +11387,7 @@
         <w:lastRenderedPageBreak/>
         <w:t>Info Page</w:t>
       </w:r>
-      <w:bookmarkEnd w:id="26"/>
+      <w:bookmarkEnd w:id="27"/>
     </w:p>
     <w:p>
       <w:pPr>
@@ -11079,7 +11465,7 @@
           <w:szCs w:val="20"/>
         </w:rPr>
       </w:pPr>
-      <w:bookmarkStart w:id="27" w:name="_Toc177205380"/>
+      <w:bookmarkStart w:id="28" w:name="_Toc177205380"/>
     </w:p>
     <w:p>
       <w:pPr>
@@ -11100,7 +11486,7 @@
       <w:r>
         <w:t xml:space="preserve"> - Info Page</w:t>
       </w:r>
-      <w:bookmarkEnd w:id="27"/>
+      <w:bookmarkEnd w:id="28"/>
     </w:p>
     <w:p>
       <w:pPr>
@@ -11417,7 +11803,7 @@
           <w:szCs w:val="28"/>
         </w:rPr>
       </w:pPr>
-      <w:bookmarkStart w:id="28" w:name="_Toc222557549"/>
+      <w:bookmarkStart w:id="29" w:name="_Toc238395149"/>
       <w:r>
         <w:rPr>
           <w:b/>
@@ -11438,7 +11824,7 @@
         </w:rPr>
         <w:t xml:space="preserve"> the Continuum Controller Application</w:t>
       </w:r>
-      <w:bookmarkEnd w:id="28"/>
+      <w:bookmarkEnd w:id="29"/>
     </w:p>
     <w:p>
       <w:pPr>
@@ -11494,7 +11880,23 @@
           <w:sz w:val="20"/>
           <w:szCs w:val="20"/>
         </w:rPr>
-        <w:t xml:space="preserve"> and log into you account, if you have not already.</w:t>
+        <w:t xml:space="preserve"> and log into </w:t>
+      </w:r>
+      <w:proofErr w:type="spellStart"/>
+      <w:r>
+        <w:rPr>
+          <w:sz w:val="20"/>
+          <w:szCs w:val="20"/>
+        </w:rPr>
+        <w:t>you</w:t>
+      </w:r>
+      <w:proofErr w:type="spellEnd"/>
+      <w:r>
+        <w:rPr>
+          <w:sz w:val="20"/>
+          <w:szCs w:val="20"/>
+        </w:rPr>
+        <w:t xml:space="preserve"> account, if you have not already.</w:t>
       </w:r>
       <w:r>
         <w:rPr>
@@ -11799,7 +12201,7 @@
           <w:szCs w:val="20"/>
         </w:rPr>
       </w:pPr>
-      <w:bookmarkStart w:id="29" w:name="_Toc177205381"/>
+      <w:bookmarkStart w:id="30" w:name="_Toc177205381"/>
       <w:r>
         <w:t xml:space="preserve">Figure </w:t>
       </w:r>
@@ -11823,7 +12225,7 @@
       <w:r>
         <w:t xml:space="preserve"> Library</w:t>
       </w:r>
-      <w:bookmarkEnd w:id="29"/>
+      <w:bookmarkEnd w:id="30"/>
     </w:p>
     <w:p>
       <w:pPr>
@@ -11920,7 +12322,7 @@
           <w:szCs w:val="28"/>
         </w:rPr>
       </w:pPr>
-      <w:bookmarkStart w:id="30" w:name="_Toc222557550"/>
+      <w:bookmarkStart w:id="31" w:name="_Toc238395150"/>
       <w:r>
         <w:rPr>
           <w:b/>
@@ -11932,7 +12334,7 @@
         <w:lastRenderedPageBreak/>
         <w:t>When to use the Haken Editor</w:t>
       </w:r>
-      <w:bookmarkEnd w:id="30"/>
+      <w:bookmarkEnd w:id="31"/>
     </w:p>
     <w:p>
       <w:pPr>
@@ -12315,7 +12717,7 @@
           <w:szCs w:val="28"/>
         </w:rPr>
       </w:pPr>
-      <w:bookmarkStart w:id="31" w:name="_Toc222557551"/>
+      <w:bookmarkStart w:id="32" w:name="_Toc238395151"/>
       <w:r>
         <w:rPr>
           <w:b/>
@@ -12336,7 +12738,7 @@
         </w:rPr>
         <w:t xml:space="preserve"> and Feedback</w:t>
       </w:r>
-      <w:bookmarkEnd w:id="31"/>
+      <w:bookmarkEnd w:id="32"/>
     </w:p>
     <w:p>
       <w:pPr>
@@ -12508,7 +12910,7 @@
 </file>
 
 <file path=word/endnotes.xml><?xml version="1.0" encoding="utf-8"?>
-<w:endnotes xmlns:wpc="http://schemas.microsoft.com/office/word/2010/wordprocessingCanvas" xmlns:cx="http://schemas.microsoft.com/office/drawing/2014/chartex" xmlns:cx1="http://schemas.microsoft.com/office/drawing/2015/9/8/chartex" xmlns:cx2="http://schemas.microsoft.com/office/drawing/2015/10/21/chartex" xmlns:cx3="http://schemas.microsoft.com/office/drawing/2016/5/9/chartex" xmlns:cx4="http://schemas.microsoft.com/office/drawing/2016/5/10/chartex" xmlns:cx5="http://schemas.microsoft.com/office/drawing/2016/5/11/chartex" xmlns:cx6="http://schemas.microsoft.com/office/drawing/2016/5/12/chartex" xmlns:cx7="http://schemas.microsoft.com/office/drawing/2016/5/13/chartex" xmlns:cx8="http://schemas.microsoft.com/office/drawing/2016/5/14/chartex" xmlns:mc="http://schemas.openxmlformats.org/markup-compatibility/2006" xmlns:aink="http://schemas.microsoft.com/office/drawing/2016/ink" xmlns:am3d="http://schemas.microsoft.com/office/drawing/2017/model3d" xmlns:o="urn:schemas-microsoft-com:office:office" xmlns:oel="http://schemas.microsoft.com/office/2019/extlst" xmlns:r="http://schemas.openxmlformats.org/officeDocument/2006/relationships" xmlns:m="http://schemas.openxmlformats.org/officeDocument/2006/math" xmlns:v="urn:schemas-microsoft-com:vml" xmlns:wp14="http://schemas.microsoft.com/office/word/2010/wordprocessingDrawing" xmlns:wp="http://schemas.openxmlformats.org/drawingml/2006/wordprocessingDrawing" xmlns:w10="urn:schemas-microsoft-com:office:word" xmlns:w="http://schemas.openxmlformats.org/wordprocessingml/2006/main" xmlns:w14="http://schemas.microsoft.com/office/word/2010/wordml" xmlns:w15="http://schemas.microsoft.com/office/word/2012/wordml" xmlns:w16cex="http://schemas.microsoft.com/office/word/2018/wordml/cex" xmlns:w16cid="http://schemas.microsoft.com/office/word/2016/wordml/cid" xmlns:w16="http://schemas.microsoft.com/office/word/2018/wordml" xmlns:w16du="http://schemas.microsoft.com/office/word/2023/wordml/word16du" xmlns:w16sdtdh="http://schemas.microsoft.com/office/word/2020/wordml/sdtdatahash" xmlns:w16sdtfl="http://schemas.microsoft.com/office/word/2024/wordml/sdtformatlock" xmlns:w16se="http://schemas.microsoft.com/office/word/2015/wordml/symex" xmlns:wpg="http://schemas.microsoft.com/office/word/2010/wordprocessingGroup" xmlns:wpi="http://schemas.microsoft.com/office/word/2010/wordprocessingInk" xmlns:wne="http://schemas.microsoft.com/office/word/2006/wordml" xmlns:wps="http://schemas.microsoft.com/office/word/2010/wordprocessingShape" mc:Ignorable="w14 w15 w16se w16cid w16 w16cex w16sdtdh w16sdtfl w16du wp14">
+<w:endnotes xmlns:wpc="http://schemas.microsoft.com/office/word/2010/wordprocessingCanvas" xmlns:cx="http://schemas.microsoft.com/office/drawing/2014/chartex" xmlns:cx1="http://schemas.microsoft.com/office/drawing/2015/9/8/chartex" xmlns:cx2="http://schemas.microsoft.com/office/drawing/2015/10/21/chartex" xmlns:cx3="http://schemas.microsoft.com/office/drawing/2016/5/9/chartex" xmlns:cx4="http://schemas.microsoft.com/office/drawing/2016/5/10/chartex" xmlns:cx5="http://schemas.microsoft.com/office/drawing/2016/5/11/chartex" xmlns:cx6="http://schemas.microsoft.com/office/drawing/2016/5/12/chartex" xmlns:cx7="http://schemas.microsoft.com/office/drawing/2016/5/13/chartex" xmlns:cx8="http://schemas.microsoft.com/office/drawing/2016/5/14/chartex" xmlns:mc="http://schemas.openxmlformats.org/markup-compatibility/2006" xmlns:aink="http://schemas.microsoft.com/office/drawing/2016/ink" xmlns:am3d="http://schemas.microsoft.com/office/drawing/2017/model3d" xmlns:o="urn:schemas-microsoft-com:office:office" xmlns:oel="http://schemas.microsoft.com/office/2019/extlst" xmlns:r="http://schemas.openxmlformats.org/officeDocument/2006/relationships" xmlns:m="http://schemas.openxmlformats.org/officeDocument/2006/math" xmlns:v="urn:schemas-microsoft-com:vml" xmlns:wp14="http://schemas.microsoft.com/office/word/2010/wordprocessingDrawing" xmlns:wp="http://schemas.openxmlformats.org/drawingml/2006/wordprocessingDrawing" xmlns:w10="urn:schemas-microsoft-com:office:word" xmlns:w="http://schemas.openxmlformats.org/wordprocessingml/2006/main" xmlns:w14="http://schemas.microsoft.com/office/word/2010/wordml" xmlns:w15="http://schemas.microsoft.com/office/word/2012/wordml" xmlns:w16cei="http://schemas.microsoft.com/office/word/2026/wordml/cei" xmlns:w16cex="http://schemas.microsoft.com/office/word/2018/wordml/cex" xmlns:w16cid="http://schemas.microsoft.com/office/word/2016/wordml/cid" xmlns:w16="http://schemas.microsoft.com/office/word/2018/wordml" xmlns:w16du="http://schemas.microsoft.com/office/word/2023/wordml/word16du" xmlns:w16sdtdh="http://schemas.microsoft.com/office/word/2020/wordml/sdtdatahash" xmlns:w16sdtfl="http://schemas.microsoft.com/office/word/2024/wordml/sdtformatlock" xmlns:w16se="http://schemas.microsoft.com/office/word/2015/wordml/symex" xmlns:wpg="http://schemas.microsoft.com/office/word/2010/wordprocessingGroup" xmlns:wpi="http://schemas.microsoft.com/office/word/2010/wordprocessingInk" xmlns:wne="http://schemas.microsoft.com/office/word/2006/wordml" xmlns:wps="http://schemas.microsoft.com/office/word/2010/wordprocessingShape" mc:Ignorable="w14 w15 w16se w16cid w16 w16cex w16sdtdh w16sdtfl w16du wp14">
   <w:endnote w:type="separator" w:id="-1">
     <w:p>
       <w:pPr>
@@ -12533,7 +12935,7 @@
 </file>
 
 <file path=word/footer1.xml><?xml version="1.0" encoding="utf-8"?>
-<w:ftr xmlns:wpc="http://schemas.microsoft.com/office/word/2010/wordprocessingCanvas" xmlns:cx="http://schemas.microsoft.com/office/drawing/2014/chartex" xmlns:cx1="http://schemas.microsoft.com/office/drawing/2015/9/8/chartex" xmlns:cx2="http://schemas.microsoft.com/office/drawing/2015/10/21/chartex" xmlns:cx3="http://schemas.microsoft.com/office/drawing/2016/5/9/chartex" xmlns:cx4="http://schemas.microsoft.com/office/drawing/2016/5/10/chartex" xmlns:cx5="http://schemas.microsoft.com/office/drawing/2016/5/11/chartex" xmlns:cx6="http://schemas.microsoft.com/office/drawing/2016/5/12/chartex" xmlns:cx7="http://schemas.microsoft.com/office/drawing/2016/5/13/chartex" xmlns:cx8="http://schemas.microsoft.com/office/drawing/2016/5/14/chartex" xmlns:mc="http://schemas.openxmlformats.org/markup-compatibility/2006" xmlns:aink="http://schemas.microsoft.com/office/drawing/2016/ink" xmlns:am3d="http://schemas.microsoft.com/office/drawing/2017/model3d" xmlns:o="urn:schemas-microsoft-com:office:office" xmlns:oel="http://schemas.microsoft.com/office/2019/extlst" xmlns:r="http://schemas.openxmlformats.org/officeDocument/2006/relationships" xmlns:m="http://schemas.openxmlformats.org/officeDocument/2006/math" xmlns:v="urn:schemas-microsoft-com:vml" xmlns:wp14="http://schemas.microsoft.com/office/word/2010/wordprocessingDrawing" xmlns:wp="http://schemas.openxmlformats.org/drawingml/2006/wordprocessingDrawing" xmlns:w10="urn:schemas-microsoft-com:office:word" xmlns:w="http://schemas.openxmlformats.org/wordprocessingml/2006/main" xmlns:w14="http://schemas.microsoft.com/office/word/2010/wordml" xmlns:w15="http://schemas.microsoft.com/office/word/2012/wordml" xmlns:w16cex="http://schemas.microsoft.com/office/word/2018/wordml/cex" xmlns:w16cid="http://schemas.microsoft.com/office/word/2016/wordml/cid" xmlns:w16="http://schemas.microsoft.com/office/word/2018/wordml" xmlns:w16du="http://schemas.microsoft.com/office/word/2023/wordml/word16du" xmlns:w16sdtdh="http://schemas.microsoft.com/office/word/2020/wordml/sdtdatahash" xmlns:w16sdtfl="http://schemas.microsoft.com/office/word/2024/wordml/sdtformatlock" xmlns:w16se="http://schemas.microsoft.com/office/word/2015/wordml/symex" xmlns:wpg="http://schemas.microsoft.com/office/word/2010/wordprocessingGroup" xmlns:wpi="http://schemas.microsoft.com/office/word/2010/wordprocessingInk" xmlns:wne="http://schemas.microsoft.com/office/word/2006/wordml" xmlns:wps="http://schemas.microsoft.com/office/word/2010/wordprocessingShape" mc:Ignorable="w14 w15 w16se w16cid w16 w16cex w16sdtdh w16sdtfl w16du wp14">
+<w:ftr xmlns:wpc="http://schemas.microsoft.com/office/word/2010/wordprocessingCanvas" xmlns:cx="http://schemas.microsoft.com/office/drawing/2014/chartex" xmlns:cx1="http://schemas.microsoft.com/office/drawing/2015/9/8/chartex" xmlns:cx2="http://schemas.microsoft.com/office/drawing/2015/10/21/chartex" xmlns:cx3="http://schemas.microsoft.com/office/drawing/2016/5/9/chartex" xmlns:cx4="http://schemas.microsoft.com/office/drawing/2016/5/10/chartex" xmlns:cx5="http://schemas.microsoft.com/office/drawing/2016/5/11/chartex" xmlns:cx6="http://schemas.microsoft.com/office/drawing/2016/5/12/chartex" xmlns:cx7="http://schemas.microsoft.com/office/drawing/2016/5/13/chartex" xmlns:cx8="http://schemas.microsoft.com/office/drawing/2016/5/14/chartex" xmlns:mc="http://schemas.openxmlformats.org/markup-compatibility/2006" xmlns:aink="http://schemas.microsoft.com/office/drawing/2016/ink" xmlns:am3d="http://schemas.microsoft.com/office/drawing/2017/model3d" xmlns:o="urn:schemas-microsoft-com:office:office" xmlns:oel="http://schemas.microsoft.com/office/2019/extlst" xmlns:r="http://schemas.openxmlformats.org/officeDocument/2006/relationships" xmlns:m="http://schemas.openxmlformats.org/officeDocument/2006/math" xmlns:v="urn:schemas-microsoft-com:vml" xmlns:wp14="http://schemas.microsoft.com/office/word/2010/wordprocessingDrawing" xmlns:wp="http://schemas.openxmlformats.org/drawingml/2006/wordprocessingDrawing" xmlns:w10="urn:schemas-microsoft-com:office:word" xmlns:w="http://schemas.openxmlformats.org/wordprocessingml/2006/main" xmlns:w14="http://schemas.microsoft.com/office/word/2010/wordml" xmlns:w15="http://schemas.microsoft.com/office/word/2012/wordml" xmlns:w16cei="http://schemas.microsoft.com/office/word/2026/wordml/cei" xmlns:w16cex="http://schemas.microsoft.com/office/word/2018/wordml/cex" xmlns:w16cid="http://schemas.microsoft.com/office/word/2016/wordml/cid" xmlns:w16="http://schemas.microsoft.com/office/word/2018/wordml" xmlns:w16du="http://schemas.microsoft.com/office/word/2023/wordml/word16du" xmlns:w16sdtdh="http://schemas.microsoft.com/office/word/2020/wordml/sdtdatahash" xmlns:w16sdtfl="http://schemas.microsoft.com/office/word/2024/wordml/sdtformatlock" xmlns:w16se="http://schemas.microsoft.com/office/word/2015/wordml/symex" xmlns:wpg="http://schemas.microsoft.com/office/word/2010/wordprocessingGroup" xmlns:wpi="http://schemas.microsoft.com/office/word/2010/wordprocessingInk" xmlns:wne="http://schemas.microsoft.com/office/word/2006/wordml" xmlns:wps="http://schemas.microsoft.com/office/word/2010/wordprocessingShape" mc:Ignorable="w14 w15 w16se w16cid w16 w16cex w16sdtdh w16sdtfl w16du wp14">
   <w:p>
     <w:pPr>
       <w:pStyle w:val="Footer"/>
@@ -12549,7 +12951,7 @@
 </file>
 
 <file path=word/footer2.xml><?xml version="1.0" encoding="utf-8"?>
-<w:ftr xmlns:wpc="http://schemas.microsoft.com/office/word/2010/wordprocessingCanvas" xmlns:cx="http://schemas.microsoft.com/office/drawing/2014/chartex" xmlns:cx1="http://schemas.microsoft.com/office/drawing/2015/9/8/chartex" xmlns:cx2="http://schemas.microsoft.com/office/drawing/2015/10/21/chartex" xmlns:cx3="http://schemas.microsoft.com/office/drawing/2016/5/9/chartex" xmlns:cx4="http://schemas.microsoft.com/office/drawing/2016/5/10/chartex" xmlns:cx5="http://schemas.microsoft.com/office/drawing/2016/5/11/chartex" xmlns:cx6="http://schemas.microsoft.com/office/drawing/2016/5/12/chartex" xmlns:cx7="http://schemas.microsoft.com/office/drawing/2016/5/13/chartex" xmlns:cx8="http://schemas.microsoft.com/office/drawing/2016/5/14/chartex" xmlns:mc="http://schemas.openxmlformats.org/markup-compatibility/2006" xmlns:aink="http://schemas.microsoft.com/office/drawing/2016/ink" xmlns:am3d="http://schemas.microsoft.com/office/drawing/2017/model3d" xmlns:o="urn:schemas-microsoft-com:office:office" xmlns:oel="http://schemas.microsoft.com/office/2019/extlst" xmlns:r="http://schemas.openxmlformats.org/officeDocument/2006/relationships" xmlns:m="http://schemas.openxmlformats.org/officeDocument/2006/math" xmlns:v="urn:schemas-microsoft-com:vml" xmlns:wp14="http://schemas.microsoft.com/office/word/2010/wordprocessingDrawing" xmlns:wp="http://schemas.openxmlformats.org/drawingml/2006/wordprocessingDrawing" xmlns:w10="urn:schemas-microsoft-com:office:word" xmlns:w="http://schemas.openxmlformats.org/wordprocessingml/2006/main" xmlns:w14="http://schemas.microsoft.com/office/word/2010/wordml" xmlns:w15="http://schemas.microsoft.com/office/word/2012/wordml" xmlns:w16cex="http://schemas.microsoft.com/office/word/2018/wordml/cex" xmlns:w16cid="http://schemas.microsoft.com/office/word/2016/wordml/cid" xmlns:w16="http://schemas.microsoft.com/office/word/2018/wordml" xmlns:w16du="http://schemas.microsoft.com/office/word/2023/wordml/word16du" xmlns:w16sdtdh="http://schemas.microsoft.com/office/word/2020/wordml/sdtdatahash" xmlns:w16sdtfl="http://schemas.microsoft.com/office/word/2024/wordml/sdtformatlock" xmlns:w16se="http://schemas.microsoft.com/office/word/2015/wordml/symex" xmlns:wpg="http://schemas.microsoft.com/office/word/2010/wordprocessingGroup" xmlns:wpi="http://schemas.microsoft.com/office/word/2010/wordprocessingInk" xmlns:wne="http://schemas.microsoft.com/office/word/2006/wordml" xmlns:wps="http://schemas.microsoft.com/office/word/2010/wordprocessingShape" mc:Ignorable="w14 w15 w16se w16cid w16 w16cex w16sdtdh w16sdtfl w16du wp14">
+<w:ftr xmlns:wpc="http://schemas.microsoft.com/office/word/2010/wordprocessingCanvas" xmlns:cx="http://schemas.microsoft.com/office/drawing/2014/chartex" xmlns:cx1="http://schemas.microsoft.com/office/drawing/2015/9/8/chartex" xmlns:cx2="http://schemas.microsoft.com/office/drawing/2015/10/21/chartex" xmlns:cx3="http://schemas.microsoft.com/office/drawing/2016/5/9/chartex" xmlns:cx4="http://schemas.microsoft.com/office/drawing/2016/5/10/chartex" xmlns:cx5="http://schemas.microsoft.com/office/drawing/2016/5/11/chartex" xmlns:cx6="http://schemas.microsoft.com/office/drawing/2016/5/12/chartex" xmlns:cx7="http://schemas.microsoft.com/office/drawing/2016/5/13/chartex" xmlns:cx8="http://schemas.microsoft.com/office/drawing/2016/5/14/chartex" xmlns:mc="http://schemas.openxmlformats.org/markup-compatibility/2006" xmlns:aink="http://schemas.microsoft.com/office/drawing/2016/ink" xmlns:am3d="http://schemas.microsoft.com/office/drawing/2017/model3d" xmlns:o="urn:schemas-microsoft-com:office:office" xmlns:oel="http://schemas.microsoft.com/office/2019/extlst" xmlns:r="http://schemas.openxmlformats.org/officeDocument/2006/relationships" xmlns:m="http://schemas.openxmlformats.org/officeDocument/2006/math" xmlns:v="urn:schemas-microsoft-com:vml" xmlns:wp14="http://schemas.microsoft.com/office/word/2010/wordprocessingDrawing" xmlns:wp="http://schemas.openxmlformats.org/drawingml/2006/wordprocessingDrawing" xmlns:w10="urn:schemas-microsoft-com:office:word" xmlns:w="http://schemas.openxmlformats.org/wordprocessingml/2006/main" xmlns:w14="http://schemas.microsoft.com/office/word/2010/wordml" xmlns:w15="http://schemas.microsoft.com/office/word/2012/wordml" xmlns:w16cei="http://schemas.microsoft.com/office/word/2026/wordml/cei" xmlns:w16cex="http://schemas.microsoft.com/office/word/2018/wordml/cex" xmlns:w16cid="http://schemas.microsoft.com/office/word/2016/wordml/cid" xmlns:w16="http://schemas.microsoft.com/office/word/2018/wordml" xmlns:w16du="http://schemas.microsoft.com/office/word/2023/wordml/word16du" xmlns:w16sdtdh="http://schemas.microsoft.com/office/word/2020/wordml/sdtdatahash" xmlns:w16sdtfl="http://schemas.microsoft.com/office/word/2024/wordml/sdtformatlock" xmlns:w16se="http://schemas.microsoft.com/office/word/2015/wordml/symex" xmlns:wpg="http://schemas.microsoft.com/office/word/2010/wordprocessingGroup" xmlns:wpi="http://schemas.microsoft.com/office/word/2010/wordprocessingInk" xmlns:wne="http://schemas.microsoft.com/office/word/2006/wordml" xmlns:wps="http://schemas.microsoft.com/office/word/2010/wordprocessingShape" mc:Ignorable="w14 w15 w16se w16cid w16 w16cex w16sdtdh w16sdtfl w16du wp14">
   <w:p>
     <w:pPr>
       <w:pStyle w:val="Footer"/>
@@ -12605,7 +13007,7 @@
 </file>
 
 <file path=word/footnotes.xml><?xml version="1.0" encoding="utf-8"?>
-<w:footnotes xmlns:wpc="http://schemas.microsoft.com/office/word/2010/wordprocessingCanvas" xmlns:cx="http://schemas.microsoft.com/office/drawing/2014/chartex" xmlns:cx1="http://schemas.microsoft.com/office/drawing/2015/9/8/chartex" xmlns:cx2="http://schemas.microsoft.com/office/drawing/2015/10/21/chartex" xmlns:cx3="http://schemas.microsoft.com/office/drawing/2016/5/9/chartex" xmlns:cx4="http://schemas.microsoft.com/office/drawing/2016/5/10/chartex" xmlns:cx5="http://schemas.microsoft.com/office/drawing/2016/5/11/chartex" xmlns:cx6="http://schemas.microsoft.com/office/drawing/2016/5/12/chartex" xmlns:cx7="http://schemas.microsoft.com/office/drawing/2016/5/13/chartex" xmlns:cx8="http://schemas.microsoft.com/office/drawing/2016/5/14/chartex" xmlns:mc="http://schemas.openxmlformats.org/markup-compatibility/2006" xmlns:aink="http://schemas.microsoft.com/office/drawing/2016/ink" xmlns:am3d="http://schemas.microsoft.com/office/drawing/2017/model3d" xmlns:o="urn:schemas-microsoft-com:office:office" xmlns:oel="http://schemas.microsoft.com/office/2019/extlst" xmlns:r="http://schemas.openxmlformats.org/officeDocument/2006/relationships" xmlns:m="http://schemas.openxmlformats.org/officeDocument/2006/math" xmlns:v="urn:schemas-microsoft-com:vml" xmlns:wp14="http://schemas.microsoft.com/office/word/2010/wordprocessingDrawing" xmlns:wp="http://schemas.openxmlformats.org/drawingml/2006/wordprocessingDrawing" xmlns:w10="urn:schemas-microsoft-com:office:word" xmlns:w="http://schemas.openxmlformats.org/wordprocessingml/2006/main" xmlns:w14="http://schemas.microsoft.com/office/word/2010/wordml" xmlns:w15="http://schemas.microsoft.com/office/word/2012/wordml" xmlns:w16cex="http://schemas.microsoft.com/office/word/2018/wordml/cex" xmlns:w16cid="http://schemas.microsoft.com/office/word/2016/wordml/cid" xmlns:w16="http://schemas.microsoft.com/office/word/2018/wordml" xmlns:w16du="http://schemas.microsoft.com/office/word/2023/wordml/word16du" xmlns:w16sdtdh="http://schemas.microsoft.com/office/word/2020/wordml/sdtdatahash" xmlns:w16sdtfl="http://schemas.microsoft.com/office/word/2024/wordml/sdtformatlock" xmlns:w16se="http://schemas.microsoft.com/office/word/2015/wordml/symex" xmlns:wpg="http://schemas.microsoft.com/office/word/2010/wordprocessingGroup" xmlns:wpi="http://schemas.microsoft.com/office/word/2010/wordprocessingInk" xmlns:wne="http://schemas.microsoft.com/office/word/2006/wordml" xmlns:wps="http://schemas.microsoft.com/office/word/2010/wordprocessingShape" mc:Ignorable="w14 w15 w16se w16cid w16 w16cex w16sdtdh w16sdtfl w16du wp14">
+<w:footnotes xmlns:wpc="http://schemas.microsoft.com/office/word/2010/wordprocessingCanvas" xmlns:cx="http://schemas.microsoft.com/office/drawing/2014/chartex" xmlns:cx1="http://schemas.microsoft.com/office/drawing/2015/9/8/chartex" xmlns:cx2="http://schemas.microsoft.com/office/drawing/2015/10/21/chartex" xmlns:cx3="http://schemas.microsoft.com/office/drawing/2016/5/9/chartex" xmlns:cx4="http://schemas.microsoft.com/office/drawing/2016/5/10/chartex" xmlns:cx5="http://schemas.microsoft.com/office/drawing/2016/5/11/chartex" xmlns:cx6="http://schemas.microsoft.com/office/drawing/2016/5/12/chartex" xmlns:cx7="http://schemas.microsoft.com/office/drawing/2016/5/13/chartex" xmlns:cx8="http://schemas.microsoft.com/office/drawing/2016/5/14/chartex" xmlns:mc="http://schemas.openxmlformats.org/markup-compatibility/2006" xmlns:aink="http://schemas.microsoft.com/office/drawing/2016/ink" xmlns:am3d="http://schemas.microsoft.com/office/drawing/2017/model3d" xmlns:o="urn:schemas-microsoft-com:office:office" xmlns:oel="http://schemas.microsoft.com/office/2019/extlst" xmlns:r="http://schemas.openxmlformats.org/officeDocument/2006/relationships" xmlns:m="http://schemas.openxmlformats.org/officeDocument/2006/math" xmlns:v="urn:schemas-microsoft-com:vml" xmlns:wp14="http://schemas.microsoft.com/office/word/2010/wordprocessingDrawing" xmlns:wp="http://schemas.openxmlformats.org/drawingml/2006/wordprocessingDrawing" xmlns:w10="urn:schemas-microsoft-com:office:word" xmlns:w="http://schemas.openxmlformats.org/wordprocessingml/2006/main" xmlns:w14="http://schemas.microsoft.com/office/word/2010/wordml" xmlns:w15="http://schemas.microsoft.com/office/word/2012/wordml" xmlns:w16cei="http://schemas.microsoft.com/office/word/2026/wordml/cei" xmlns:w16cex="http://schemas.microsoft.com/office/word/2018/wordml/cex" xmlns:w16cid="http://schemas.microsoft.com/office/word/2016/wordml/cid" xmlns:w16="http://schemas.microsoft.com/office/word/2018/wordml" xmlns:w16du="http://schemas.microsoft.com/office/word/2023/wordml/word16du" xmlns:w16sdtdh="http://schemas.microsoft.com/office/word/2020/wordml/sdtdatahash" xmlns:w16sdtfl="http://schemas.microsoft.com/office/word/2024/wordml/sdtformatlock" xmlns:w16se="http://schemas.microsoft.com/office/word/2015/wordml/symex" xmlns:wpg="http://schemas.microsoft.com/office/word/2010/wordprocessingGroup" xmlns:wpi="http://schemas.microsoft.com/office/word/2010/wordprocessingInk" xmlns:wne="http://schemas.microsoft.com/office/word/2006/wordml" xmlns:wps="http://schemas.microsoft.com/office/word/2010/wordprocessingShape" mc:Ignorable="w14 w15 w16se w16cid w16 w16cex w16sdtdh w16sdtfl w16du wp14">
   <w:footnote w:type="separator" w:id="-1">
     <w:p>
       <w:pPr>
@@ -12630,7 +13032,7 @@
 </file>
 
 <file path=word/header1.xml><?xml version="1.0" encoding="utf-8"?>
-<w:hdr xmlns:wpc="http://schemas.microsoft.com/office/word/2010/wordprocessingCanvas" xmlns:cx="http://schemas.microsoft.com/office/drawing/2014/chartex" xmlns:cx1="http://schemas.microsoft.com/office/drawing/2015/9/8/chartex" xmlns:cx2="http://schemas.microsoft.com/office/drawing/2015/10/21/chartex" xmlns:cx3="http://schemas.microsoft.com/office/drawing/2016/5/9/chartex" xmlns:cx4="http://schemas.microsoft.com/office/drawing/2016/5/10/chartex" xmlns:cx5="http://schemas.microsoft.com/office/drawing/2016/5/11/chartex" xmlns:cx6="http://schemas.microsoft.com/office/drawing/2016/5/12/chartex" xmlns:cx7="http://schemas.microsoft.com/office/drawing/2016/5/13/chartex" xmlns:cx8="http://schemas.microsoft.com/office/drawing/2016/5/14/chartex" xmlns:mc="http://schemas.openxmlformats.org/markup-compatibility/2006" xmlns:aink="http://schemas.microsoft.com/office/drawing/2016/ink" xmlns:am3d="http://schemas.microsoft.com/office/drawing/2017/model3d" xmlns:o="urn:schemas-microsoft-com:office:office" xmlns:oel="http://schemas.microsoft.com/office/2019/extlst" xmlns:r="http://schemas.openxmlformats.org/officeDocument/2006/relationships" xmlns:m="http://schemas.openxmlformats.org/officeDocument/2006/math" xmlns:v="urn:schemas-microsoft-com:vml" xmlns:wp14="http://schemas.microsoft.com/office/word/2010/wordprocessingDrawing" xmlns:wp="http://schemas.openxmlformats.org/drawingml/2006/wordprocessingDrawing" xmlns:w10="urn:schemas-microsoft-com:office:word" xmlns:w="http://schemas.openxmlformats.org/wordprocessingml/2006/main" xmlns:w14="http://schemas.microsoft.com/office/word/2010/wordml" xmlns:w15="http://schemas.microsoft.com/office/word/2012/wordml" xmlns:w16cex="http://schemas.microsoft.com/office/word/2018/wordml/cex" xmlns:w16cid="http://schemas.microsoft.com/office/word/2016/wordml/cid" xmlns:w16="http://schemas.microsoft.com/office/word/2018/wordml" xmlns:w16du="http://schemas.microsoft.com/office/word/2023/wordml/word16du" xmlns:w16sdtdh="http://schemas.microsoft.com/office/word/2020/wordml/sdtdatahash" xmlns:w16sdtfl="http://schemas.microsoft.com/office/word/2024/wordml/sdtformatlock" xmlns:w16se="http://schemas.microsoft.com/office/word/2015/wordml/symex" xmlns:wpg="http://schemas.microsoft.com/office/word/2010/wordprocessingGroup" xmlns:wpi="http://schemas.microsoft.com/office/word/2010/wordprocessingInk" xmlns:wne="http://schemas.microsoft.com/office/word/2006/wordml" xmlns:wps="http://schemas.microsoft.com/office/word/2010/wordprocessingShape" mc:Ignorable="w14 w15 w16se w16cid w16 w16cex w16sdtdh w16sdtfl w16du wp14">
+<w:hdr xmlns:wpc="http://schemas.microsoft.com/office/word/2010/wordprocessingCanvas" xmlns:cx="http://schemas.microsoft.com/office/drawing/2014/chartex" xmlns:cx1="http://schemas.microsoft.com/office/drawing/2015/9/8/chartex" xmlns:cx2="http://schemas.microsoft.com/office/drawing/2015/10/21/chartex" xmlns:cx3="http://schemas.microsoft.com/office/drawing/2016/5/9/chartex" xmlns:cx4="http://schemas.microsoft.com/office/drawing/2016/5/10/chartex" xmlns:cx5="http://schemas.microsoft.com/office/drawing/2016/5/11/chartex" xmlns:cx6="http://schemas.microsoft.com/office/drawing/2016/5/12/chartex" xmlns:cx7="http://schemas.microsoft.com/office/drawing/2016/5/13/chartex" xmlns:cx8="http://schemas.microsoft.com/office/drawing/2016/5/14/chartex" xmlns:mc="http://schemas.openxmlformats.org/markup-compatibility/2006" xmlns:aink="http://schemas.microsoft.com/office/drawing/2016/ink" xmlns:am3d="http://schemas.microsoft.com/office/drawing/2017/model3d" xmlns:o="urn:schemas-microsoft-com:office:office" xmlns:oel="http://schemas.microsoft.com/office/2019/extlst" xmlns:r="http://schemas.openxmlformats.org/officeDocument/2006/relationships" xmlns:m="http://schemas.openxmlformats.org/officeDocument/2006/math" xmlns:v="urn:schemas-microsoft-com:vml" xmlns:wp14="http://schemas.microsoft.com/office/word/2010/wordprocessingDrawing" xmlns:wp="http://schemas.openxmlformats.org/drawingml/2006/wordprocessingDrawing" xmlns:w10="urn:schemas-microsoft-com:office:word" xmlns:w="http://schemas.openxmlformats.org/wordprocessingml/2006/main" xmlns:w14="http://schemas.microsoft.com/office/word/2010/wordml" xmlns:w15="http://schemas.microsoft.com/office/word/2012/wordml" xmlns:w16cei="http://schemas.microsoft.com/office/word/2026/wordml/cei" xmlns:w16cex="http://schemas.microsoft.com/office/word/2018/wordml/cex" xmlns:w16cid="http://schemas.microsoft.com/office/word/2016/wordml/cid" xmlns:w16="http://schemas.microsoft.com/office/word/2018/wordml" xmlns:w16du="http://schemas.microsoft.com/office/word/2023/wordml/word16du" xmlns:w16sdtdh="http://schemas.microsoft.com/office/word/2020/wordml/sdtdatahash" xmlns:w16sdtfl="http://schemas.microsoft.com/office/word/2024/wordml/sdtformatlock" xmlns:w16se="http://schemas.microsoft.com/office/word/2015/wordml/symex" xmlns:wpg="http://schemas.microsoft.com/office/word/2010/wordprocessingGroup" xmlns:wpi="http://schemas.microsoft.com/office/word/2010/wordprocessingInk" xmlns:wne="http://schemas.microsoft.com/office/word/2006/wordml" xmlns:wps="http://schemas.microsoft.com/office/word/2010/wordprocessingShape" mc:Ignorable="w14 w15 w16se w16cid w16 w16cex w16sdtdh w16sdtfl w16du wp14">
   <w:p>
     <w:pPr>
       <w:pStyle w:val="Header"/>
@@ -12650,7 +13052,7 @@
 </file>
 
 <file path=word/numbering.xml><?xml version="1.0" encoding="utf-8"?>
-<w:numbering xmlns:wpc="http://schemas.microsoft.com/office/word/2010/wordprocessingCanvas" xmlns:cx="http://schemas.microsoft.com/office/drawing/2014/chartex" xmlns:cx1="http://schemas.microsoft.com/office/drawing/2015/9/8/chartex" xmlns:cx2="http://schemas.microsoft.com/office/drawing/2015/10/21/chartex" xmlns:cx3="http://schemas.microsoft.com/office/drawing/2016/5/9/chartex" xmlns:cx4="http://schemas.microsoft.com/office/drawing/2016/5/10/chartex" xmlns:cx5="http://schemas.microsoft.com/office/drawing/2016/5/11/chartex" xmlns:cx6="http://schemas.microsoft.com/office/drawing/2016/5/12/chartex" xmlns:cx7="http://schemas.microsoft.com/office/drawing/2016/5/13/chartex" xmlns:cx8="http://schemas.microsoft.com/office/drawing/2016/5/14/chartex" xmlns:mc="http://schemas.openxmlformats.org/markup-compatibility/2006" xmlns:aink="http://schemas.microsoft.com/office/drawing/2016/ink" xmlns:am3d="http://schemas.microsoft.com/office/drawing/2017/model3d" xmlns:o="urn:schemas-microsoft-com:office:office" xmlns:oel="http://schemas.microsoft.com/office/2019/extlst" xmlns:r="http://schemas.openxmlformats.org/officeDocument/2006/relationships" xmlns:m="http://schemas.openxmlformats.org/officeDocument/2006/math" xmlns:v="urn:schemas-microsoft-com:vml" xmlns:wp14="http://schemas.microsoft.com/office/word/2010/wordprocessingDrawing" xmlns:wp="http://schemas.openxmlformats.org/drawingml/2006/wordprocessingDrawing" xmlns:w10="urn:schemas-microsoft-com:office:word" xmlns:w="http://schemas.openxmlformats.org/wordprocessingml/2006/main" xmlns:w14="http://schemas.microsoft.com/office/word/2010/wordml" xmlns:w15="http://schemas.microsoft.com/office/word/2012/wordml" xmlns:w16cex="http://schemas.microsoft.com/office/word/2018/wordml/cex" xmlns:w16cid="http://schemas.microsoft.com/office/word/2016/wordml/cid" xmlns:w16="http://schemas.microsoft.com/office/word/2018/wordml" xmlns:w16du="http://schemas.microsoft.com/office/word/2023/wordml/word16du" xmlns:w16sdtdh="http://schemas.microsoft.com/office/word/2020/wordml/sdtdatahash" xmlns:w16sdtfl="http://schemas.microsoft.com/office/word/2024/wordml/sdtformatlock" xmlns:w16se="http://schemas.microsoft.com/office/word/2015/wordml/symex" xmlns:wpg="http://schemas.microsoft.com/office/word/2010/wordprocessingGroup" xmlns:wpi="http://schemas.microsoft.com/office/word/2010/wordprocessingInk" xmlns:wne="http://schemas.microsoft.com/office/word/2006/wordml" xmlns:wps="http://schemas.microsoft.com/office/word/2010/wordprocessingShape" mc:Ignorable="w14 w15 w16se w16cid w16 w16cex w16sdtdh w16sdtfl w16du wp14">
+<w:numbering xmlns:wpc="http://schemas.microsoft.com/office/word/2010/wordprocessingCanvas" xmlns:cx="http://schemas.microsoft.com/office/drawing/2014/chartex" xmlns:cx1="http://schemas.microsoft.com/office/drawing/2015/9/8/chartex" xmlns:cx2="http://schemas.microsoft.com/office/drawing/2015/10/21/chartex" xmlns:cx3="http://schemas.microsoft.com/office/drawing/2016/5/9/chartex" xmlns:cx4="http://schemas.microsoft.com/office/drawing/2016/5/10/chartex" xmlns:cx5="http://schemas.microsoft.com/office/drawing/2016/5/11/chartex" xmlns:cx6="http://schemas.microsoft.com/office/drawing/2016/5/12/chartex" xmlns:cx7="http://schemas.microsoft.com/office/drawing/2016/5/13/chartex" xmlns:cx8="http://schemas.microsoft.com/office/drawing/2016/5/14/chartex" xmlns:mc="http://schemas.openxmlformats.org/markup-compatibility/2006" xmlns:aink="http://schemas.microsoft.com/office/drawing/2016/ink" xmlns:am3d="http://schemas.microsoft.com/office/drawing/2017/model3d" xmlns:o="urn:schemas-microsoft-com:office:office" xmlns:oel="http://schemas.microsoft.com/office/2019/extlst" xmlns:r="http://schemas.openxmlformats.org/officeDocument/2006/relationships" xmlns:m="http://schemas.openxmlformats.org/officeDocument/2006/math" xmlns:v="urn:schemas-microsoft-com:vml" xmlns:wp14="http://schemas.microsoft.com/office/word/2010/wordprocessingDrawing" xmlns:wp="http://schemas.openxmlformats.org/drawingml/2006/wordprocessingDrawing" xmlns:w10="urn:schemas-microsoft-com:office:word" xmlns:w="http://schemas.openxmlformats.org/wordprocessingml/2006/main" xmlns:w14="http://schemas.microsoft.com/office/word/2010/wordml" xmlns:w15="http://schemas.microsoft.com/office/word/2012/wordml" xmlns:w16cei="http://schemas.microsoft.com/office/word/2026/wordml/cei" xmlns:w16cex="http://schemas.microsoft.com/office/word/2018/wordml/cex" xmlns:w16cid="http://schemas.microsoft.com/office/word/2016/wordml/cid" xmlns:w16="http://schemas.microsoft.com/office/word/2018/wordml" xmlns:w16du="http://schemas.microsoft.com/office/word/2023/wordml/word16du" xmlns:w16sdtdh="http://schemas.microsoft.com/office/word/2020/wordml/sdtdatahash" xmlns:w16sdtfl="http://schemas.microsoft.com/office/word/2024/wordml/sdtformatlock" xmlns:w16se="http://schemas.microsoft.com/office/word/2015/wordml/symex" xmlns:wpg="http://schemas.microsoft.com/office/word/2010/wordprocessingGroup" xmlns:wpi="http://schemas.microsoft.com/office/word/2010/wordprocessingInk" xmlns:wne="http://schemas.microsoft.com/office/word/2006/wordml" xmlns:wps="http://schemas.microsoft.com/office/word/2010/wordprocessingShape" mc:Ignorable="w14 w15 w16se w16cid w16 w16cex w16sdtdh w16sdtfl w16du wp14">
   <w:abstractNum w:abstractNumId="0" w15:restartNumberingAfterBreak="0">
     <w:nsid w:val="0055775C"/>
     <w:multiLevelType w:val="hybridMultilevel"/>

</xml_diff>

<commit_message>
Version 2.1. Activate top control set when the loaded user preset's macros have been shown.
</commit_message>
<xml_diff>
--- a/Using the Electra One Continuum Controller Application.docx
+++ b/Using the Electra One Continuum Controller Application.docx
@@ -1,6 +1,6 @@
 
 <file path=word/document.xml><?xml version="1.0" encoding="utf-8"?>
-<w:document xmlns:wpc="http://schemas.microsoft.com/office/word/2010/wordprocessingCanvas" xmlns:cx="http://schemas.microsoft.com/office/drawing/2014/chartex" xmlns:cx1="http://schemas.microsoft.com/office/drawing/2015/9/8/chartex" xmlns:cx2="http://schemas.microsoft.com/office/drawing/2015/10/21/chartex" xmlns:cx3="http://schemas.microsoft.com/office/drawing/2016/5/9/chartex" xmlns:cx4="http://schemas.microsoft.com/office/drawing/2016/5/10/chartex" xmlns:cx5="http://schemas.microsoft.com/office/drawing/2016/5/11/chartex" xmlns:cx6="http://schemas.microsoft.com/office/drawing/2016/5/12/chartex" xmlns:cx7="http://schemas.microsoft.com/office/drawing/2016/5/13/chartex" xmlns:cx8="http://schemas.microsoft.com/office/drawing/2016/5/14/chartex" xmlns:mc="http://schemas.openxmlformats.org/markup-compatibility/2006" xmlns:aink="http://schemas.microsoft.com/office/drawing/2016/ink" xmlns:am3d="http://schemas.microsoft.com/office/drawing/2017/model3d" xmlns:o="urn:schemas-microsoft-com:office:office" xmlns:oel="http://schemas.microsoft.com/office/2019/extlst" xmlns:r="http://schemas.openxmlformats.org/officeDocument/2006/relationships" xmlns:m="http://schemas.openxmlformats.org/officeDocument/2006/math" xmlns:v="urn:schemas-microsoft-com:vml" xmlns:wp14="http://schemas.microsoft.com/office/word/2010/wordprocessingDrawing" xmlns:wp="http://schemas.openxmlformats.org/drawingml/2006/wordprocessingDrawing" xmlns:w10="urn:schemas-microsoft-com:office:word" xmlns:w="http://schemas.openxmlformats.org/wordprocessingml/2006/main" xmlns:w14="http://schemas.microsoft.com/office/word/2010/wordml" xmlns:w15="http://schemas.microsoft.com/office/word/2012/wordml" xmlns:w16cei="http://schemas.microsoft.com/office/word/2026/wordml/cei" xmlns:w16cex="http://schemas.microsoft.com/office/word/2018/wordml/cex" xmlns:w16cid="http://schemas.microsoft.com/office/word/2016/wordml/cid" xmlns:w16="http://schemas.microsoft.com/office/word/2018/wordml" xmlns:w16du="http://schemas.microsoft.com/office/word/2023/wordml/word16du" xmlns:w16sdtdh="http://schemas.microsoft.com/office/word/2020/wordml/sdtdatahash" xmlns:w16sdtfl="http://schemas.microsoft.com/office/word/2024/wordml/sdtformatlock" xmlns:w16se="http://schemas.microsoft.com/office/word/2015/wordml/symex" xmlns:wpg="http://schemas.microsoft.com/office/word/2010/wordprocessingGroup" xmlns:wpi="http://schemas.microsoft.com/office/word/2010/wordprocessingInk" xmlns:wne="http://schemas.microsoft.com/office/word/2006/wordml" xmlns:wps="http://schemas.microsoft.com/office/word/2010/wordprocessingShape" mc:Ignorable="w14 w15 w16se w16cid w16 w16cex w16sdtdh w16sdtfl w16du wp14">
+<w:document xmlns:wpc="http://schemas.microsoft.com/office/word/2010/wordprocessingCanvas" xmlns:cx="http://schemas.microsoft.com/office/drawing/2014/chartex" xmlns:cx1="http://schemas.microsoft.com/office/drawing/2015/9/8/chartex" xmlns:cx2="http://schemas.microsoft.com/office/drawing/2015/10/21/chartex" xmlns:cx3="http://schemas.microsoft.com/office/drawing/2016/5/9/chartex" xmlns:cx4="http://schemas.microsoft.com/office/drawing/2016/5/10/chartex" xmlns:cx5="http://schemas.microsoft.com/office/drawing/2016/5/11/chartex" xmlns:cx6="http://schemas.microsoft.com/office/drawing/2016/5/12/chartex" xmlns:cx7="http://schemas.microsoft.com/office/drawing/2016/5/13/chartex" xmlns:cx8="http://schemas.microsoft.com/office/drawing/2016/5/14/chartex" xmlns:mc="http://schemas.openxmlformats.org/markup-compatibility/2006" xmlns:aink="http://schemas.microsoft.com/office/drawing/2016/ink" xmlns:am3d="http://schemas.microsoft.com/office/drawing/2017/model3d" xmlns:o="urn:schemas-microsoft-com:office:office" xmlns:oel="http://schemas.microsoft.com/office/2019/extlst" xmlns:r="http://schemas.openxmlformats.org/officeDocument/2006/relationships" xmlns:m="http://schemas.openxmlformats.org/officeDocument/2006/math" xmlns:v="urn:schemas-microsoft-com:vml" xmlns:wp14="http://schemas.microsoft.com/office/word/2010/wordprocessingDrawing" xmlns:wp="http://schemas.openxmlformats.org/drawingml/2006/wordprocessingDrawing" xmlns:w10="urn:schemas-microsoft-com:office:word" xmlns:w="http://schemas.openxmlformats.org/wordprocessingml/2006/main" xmlns:w14="http://schemas.microsoft.com/office/word/2010/wordml" xmlns:w15="http://schemas.microsoft.com/office/word/2012/wordml" xmlns:w16cex="http://schemas.microsoft.com/office/word/2018/wordml/cex" xmlns:w16cid="http://schemas.microsoft.com/office/word/2016/wordml/cid" xmlns:w16="http://schemas.microsoft.com/office/word/2018/wordml" xmlns:w16du="http://schemas.microsoft.com/office/word/2023/wordml/word16du" xmlns:w16sdtdh="http://schemas.microsoft.com/office/word/2020/wordml/sdtdatahash" xmlns:w16sdtfl="http://schemas.microsoft.com/office/word/2024/wordml/sdtformatlock" xmlns:w16se="http://schemas.microsoft.com/office/word/2015/wordml/symex" xmlns:wpg="http://schemas.microsoft.com/office/word/2010/wordprocessingGroup" xmlns:wpi="http://schemas.microsoft.com/office/word/2010/wordprocessingInk" xmlns:wne="http://schemas.microsoft.com/office/word/2006/wordml" xmlns:wps="http://schemas.microsoft.com/office/word/2010/wordprocessingShape" mc:Ignorable="w14 w15 w16se w16cid w16 w16cex w16sdtdh w16sdtfl w16du wp14">
   <w:body>
     <w:p>
       <w:pPr>
@@ -62,7 +62,7 @@
           <w:sz w:val="24"/>
           <w:szCs w:val="24"/>
         </w:rPr>
-        <w:t>.0</w:t>
+        <w:t>.</w:t>
       </w:r>
       <w:r>
         <w:rPr>
@@ -71,7 +71,7 @@
           <w:sz w:val="24"/>
           <w:szCs w:val="24"/>
         </w:rPr>
-        <w:t>.2</w:t>
+        <w:t>1</w:t>
       </w:r>
     </w:p>
     <w:p>
@@ -119,7 +119,7 @@
           <w:sz w:val="24"/>
           <w:szCs w:val="24"/>
         </w:rPr>
-        <w:t>3</w:t>
+        <w:t>4</w:t>
       </w:r>
       <w:r>
         <w:rPr>
@@ -228,7 +228,7 @@
           <w:r>
             <w:fldChar w:fldCharType="separate"/>
           </w:r>
-          <w:hyperlink w:anchor="_Toc238395131" w:history="1">
+          <w:hyperlink w:anchor="_Toc238461183" w:history="1">
             <w:r>
               <w:rPr>
                 <w:rStyle w:val="Hyperlink"/>
@@ -236,7 +236,7 @@
                 <w:bCs/>
                 <w:noProof/>
               </w:rPr>
-              <w:t>What's New in Version 2.0.2</w:t>
+              <w:t>What's New in Version 2.1</w:t>
             </w:r>
             <w:r>
               <w:rPr>
@@ -257,7 +257,7 @@
                 <w:noProof/>
                 <w:webHidden/>
               </w:rPr>
-              <w:instrText xml:space="preserve"> PAGEREF _Toc238395131 \h </w:instrText>
+              <w:instrText xml:space="preserve"> PAGEREF _Toc238461183 \h </w:instrText>
             </w:r>
             <w:r>
               <w:rPr>
@@ -302,7 +302,7 @@
               <w:lang w:val="en-NZ" w:eastAsia="en-NZ"/>
             </w:rPr>
           </w:pPr>
-          <w:hyperlink w:anchor="_Toc238395132" w:history="1">
+          <w:hyperlink w:anchor="_Toc238461184" w:history="1">
             <w:r>
               <w:rPr>
                 <w:rStyle w:val="Hyperlink"/>
@@ -310,7 +310,7 @@
                 <w:bCs/>
                 <w:noProof/>
               </w:rPr>
-              <w:t>What's New in Version 2.0</w:t>
+              <w:t>What's New in Version 2.0.2</w:t>
             </w:r>
             <w:r>
               <w:rPr>
@@ -331,7 +331,7 @@
                 <w:noProof/>
                 <w:webHidden/>
               </w:rPr>
-              <w:instrText xml:space="preserve"> PAGEREF _Toc238395132 \h </w:instrText>
+              <w:instrText xml:space="preserve"> PAGEREF _Toc238461184 \h </w:instrText>
             </w:r>
             <w:r>
               <w:rPr>
@@ -376,7 +376,7 @@
               <w:lang w:val="en-NZ" w:eastAsia="en-NZ"/>
             </w:rPr>
           </w:pPr>
-          <w:hyperlink w:anchor="_Toc238395133" w:history="1">
+          <w:hyperlink w:anchor="_Toc238461185" w:history="1">
             <w:r>
               <w:rPr>
                 <w:rStyle w:val="Hyperlink"/>
@@ -384,7 +384,7 @@
                 <w:bCs/>
                 <w:noProof/>
               </w:rPr>
-              <w:t>Overview</w:t>
+              <w:t>What's New in Version 2.0</w:t>
             </w:r>
             <w:r>
               <w:rPr>
@@ -405,7 +405,7 @@
                 <w:noProof/>
                 <w:webHidden/>
               </w:rPr>
-              <w:instrText xml:space="preserve"> PAGEREF _Toc238395133 \h </w:instrText>
+              <w:instrText xml:space="preserve"> PAGEREF _Toc238461185 \h </w:instrText>
             </w:r>
             <w:r>
               <w:rPr>
@@ -450,7 +450,81 @@
               <w:lang w:val="en-NZ" w:eastAsia="en-NZ"/>
             </w:rPr>
           </w:pPr>
-          <w:hyperlink w:anchor="_Toc238395134" w:history="1">
+          <w:hyperlink w:anchor="_Toc238461186" w:history="1">
+            <w:r>
+              <w:rPr>
+                <w:rStyle w:val="Hyperlink"/>
+                <w:b/>
+                <w:bCs/>
+                <w:noProof/>
+              </w:rPr>
+              <w:t>Overview</w:t>
+            </w:r>
+            <w:r>
+              <w:rPr>
+                <w:noProof/>
+                <w:webHidden/>
+              </w:rPr>
+              <w:tab/>
+            </w:r>
+            <w:r>
+              <w:rPr>
+                <w:noProof/>
+                <w:webHidden/>
+              </w:rPr>
+              <w:fldChar w:fldCharType="begin"/>
+            </w:r>
+            <w:r>
+              <w:rPr>
+                <w:noProof/>
+                <w:webHidden/>
+              </w:rPr>
+              <w:instrText xml:space="preserve"> PAGEREF _Toc238461186 \h </w:instrText>
+            </w:r>
+            <w:r>
+              <w:rPr>
+                <w:noProof/>
+                <w:webHidden/>
+              </w:rPr>
+            </w:r>
+            <w:r>
+              <w:rPr>
+                <w:noProof/>
+                <w:webHidden/>
+              </w:rPr>
+              <w:fldChar w:fldCharType="separate"/>
+            </w:r>
+            <w:r>
+              <w:rPr>
+                <w:noProof/>
+                <w:webHidden/>
+              </w:rPr>
+              <w:t>2</w:t>
+            </w:r>
+            <w:r>
+              <w:rPr>
+                <w:noProof/>
+                <w:webHidden/>
+              </w:rPr>
+              <w:fldChar w:fldCharType="end"/>
+            </w:r>
+          </w:hyperlink>
+        </w:p>
+        <w:p>
+          <w:pPr>
+            <w:pStyle w:val="TOC1"/>
+            <w:tabs>
+              <w:tab w:val="right" w:leader="dot" w:pos="9350"/>
+            </w:tabs>
+            <w:rPr>
+              <w:rFonts w:eastAsiaTheme="minorEastAsia"/>
+              <w:noProof/>
+              <w:sz w:val="24"/>
+              <w:szCs w:val="24"/>
+              <w:lang w:val="en-NZ" w:eastAsia="en-NZ"/>
+            </w:rPr>
+          </w:pPr>
+          <w:hyperlink w:anchor="_Toc238461187" w:history="1">
             <w:r>
               <w:rPr>
                 <w:rStyle w:val="Hyperlink"/>
@@ -479,7 +553,7 @@
                 <w:noProof/>
                 <w:webHidden/>
               </w:rPr>
-              <w:instrText xml:space="preserve"> PAGEREF _Toc238395134 \h </w:instrText>
+              <w:instrText xml:space="preserve"> PAGEREF _Toc238461187 \h </w:instrText>
             </w:r>
             <w:r>
               <w:rPr>
@@ -524,7 +598,7 @@
               <w:lang w:val="en-NZ" w:eastAsia="en-NZ"/>
             </w:rPr>
           </w:pPr>
-          <w:hyperlink w:anchor="_Toc238395135" w:history="1">
+          <w:hyperlink w:anchor="_Toc238461188" w:history="1">
             <w:r>
               <w:rPr>
                 <w:rStyle w:val="Hyperlink"/>
@@ -553,7 +627,7 @@
                 <w:noProof/>
                 <w:webHidden/>
               </w:rPr>
-              <w:instrText xml:space="preserve"> PAGEREF _Toc238395135 \h </w:instrText>
+              <w:instrText xml:space="preserve"> PAGEREF _Toc238461188 \h </w:instrText>
             </w:r>
             <w:r>
               <w:rPr>
@@ -598,7 +672,7 @@
               <w:lang w:val="en-NZ" w:eastAsia="en-NZ"/>
             </w:rPr>
           </w:pPr>
-          <w:hyperlink w:anchor="_Toc238395136" w:history="1">
+          <w:hyperlink w:anchor="_Toc238461189" w:history="1">
             <w:r>
               <w:rPr>
                 <w:rStyle w:val="Hyperlink"/>
@@ -627,7 +701,7 @@
                 <w:noProof/>
                 <w:webHidden/>
               </w:rPr>
-              <w:instrText xml:space="preserve"> PAGEREF _Toc238395136 \h </w:instrText>
+              <w:instrText xml:space="preserve"> PAGEREF _Toc238461189 \h </w:instrText>
             </w:r>
             <w:r>
               <w:rPr>
@@ -672,7 +746,7 @@
               <w:lang w:val="en-NZ" w:eastAsia="en-NZ"/>
             </w:rPr>
           </w:pPr>
-          <w:hyperlink w:anchor="_Toc238395137" w:history="1">
+          <w:hyperlink w:anchor="_Toc238461190" w:history="1">
             <w:r>
               <w:rPr>
                 <w:rStyle w:val="Hyperlink"/>
@@ -701,7 +775,7 @@
                 <w:noProof/>
                 <w:webHidden/>
               </w:rPr>
-              <w:instrText xml:space="preserve"> PAGEREF _Toc238395137 \h </w:instrText>
+              <w:instrText xml:space="preserve"> PAGEREF _Toc238461190 \h </w:instrText>
             </w:r>
             <w:r>
               <w:rPr>
@@ -746,7 +820,7 @@
               <w:lang w:val="en-NZ" w:eastAsia="en-NZ"/>
             </w:rPr>
           </w:pPr>
-          <w:hyperlink w:anchor="_Toc238395138" w:history="1">
+          <w:hyperlink w:anchor="_Toc238461191" w:history="1">
             <w:r>
               <w:rPr>
                 <w:rStyle w:val="Hyperlink"/>
@@ -775,7 +849,7 @@
                 <w:noProof/>
                 <w:webHidden/>
               </w:rPr>
-              <w:instrText xml:space="preserve"> PAGEREF _Toc238395138 \h </w:instrText>
+              <w:instrText xml:space="preserve"> PAGEREF _Toc238461191 \h </w:instrText>
             </w:r>
             <w:r>
               <w:rPr>
@@ -820,7 +894,7 @@
               <w:lang w:val="en-NZ" w:eastAsia="en-NZ"/>
             </w:rPr>
           </w:pPr>
-          <w:hyperlink w:anchor="_Toc238395139" w:history="1">
+          <w:hyperlink w:anchor="_Toc238461192" w:history="1">
             <w:r>
               <w:rPr>
                 <w:rStyle w:val="Hyperlink"/>
@@ -849,7 +923,7 @@
                 <w:noProof/>
                 <w:webHidden/>
               </w:rPr>
-              <w:instrText xml:space="preserve"> PAGEREF _Toc238395139 \h </w:instrText>
+              <w:instrText xml:space="preserve"> PAGEREF _Toc238461192 \h </w:instrText>
             </w:r>
             <w:r>
               <w:rPr>
@@ -894,7 +968,7 @@
               <w:lang w:val="en-NZ" w:eastAsia="en-NZ"/>
             </w:rPr>
           </w:pPr>
-          <w:hyperlink w:anchor="_Toc238395140" w:history="1">
+          <w:hyperlink w:anchor="_Toc238461193" w:history="1">
             <w:r>
               <w:rPr>
                 <w:rStyle w:val="Hyperlink"/>
@@ -922,7 +996,7 @@
                 <w:noProof/>
                 <w:webHidden/>
               </w:rPr>
-              <w:instrText xml:space="preserve"> PAGEREF _Toc238395140 \h </w:instrText>
+              <w:instrText xml:space="preserve"> PAGEREF _Toc238461193 \h </w:instrText>
             </w:r>
             <w:r>
               <w:rPr>
@@ -967,7 +1041,7 @@
               <w:lang w:val="en-NZ" w:eastAsia="en-NZ"/>
             </w:rPr>
           </w:pPr>
-          <w:hyperlink w:anchor="_Toc238395141" w:history="1">
+          <w:hyperlink w:anchor="_Toc238461194" w:history="1">
             <w:r>
               <w:rPr>
                 <w:rStyle w:val="Hyperlink"/>
@@ -996,7 +1070,7 @@
                 <w:noProof/>
                 <w:webHidden/>
               </w:rPr>
-              <w:instrText xml:space="preserve"> PAGEREF _Toc238395141 \h </w:instrText>
+              <w:instrText xml:space="preserve"> PAGEREF _Toc238461194 \h </w:instrText>
             </w:r>
             <w:r>
               <w:rPr>
@@ -1041,7 +1115,7 @@
               <w:lang w:val="en-NZ" w:eastAsia="en-NZ"/>
             </w:rPr>
           </w:pPr>
-          <w:hyperlink w:anchor="_Toc238395142" w:history="1">
+          <w:hyperlink w:anchor="_Toc238461195" w:history="1">
             <w:r>
               <w:rPr>
                 <w:rStyle w:val="Hyperlink"/>
@@ -1070,7 +1144,7 @@
                 <w:noProof/>
                 <w:webHidden/>
               </w:rPr>
-              <w:instrText xml:space="preserve"> PAGEREF _Toc238395142 \h </w:instrText>
+              <w:instrText xml:space="preserve"> PAGEREF _Toc238461195 \h </w:instrText>
             </w:r>
             <w:r>
               <w:rPr>
@@ -1115,7 +1189,7 @@
               <w:lang w:val="en-NZ" w:eastAsia="en-NZ"/>
             </w:rPr>
           </w:pPr>
-          <w:hyperlink w:anchor="_Toc238395143" w:history="1">
+          <w:hyperlink w:anchor="_Toc238461196" w:history="1">
             <w:r>
               <w:rPr>
                 <w:rStyle w:val="Hyperlink"/>
@@ -1144,7 +1218,7 @@
                 <w:noProof/>
                 <w:webHidden/>
               </w:rPr>
-              <w:instrText xml:space="preserve"> PAGEREF _Toc238395143 \h </w:instrText>
+              <w:instrText xml:space="preserve"> PAGEREF _Toc238461196 \h </w:instrText>
             </w:r>
             <w:r>
               <w:rPr>
@@ -1189,7 +1263,7 @@
               <w:lang w:val="en-NZ" w:eastAsia="en-NZ"/>
             </w:rPr>
           </w:pPr>
-          <w:hyperlink w:anchor="_Toc238395144" w:history="1">
+          <w:hyperlink w:anchor="_Toc238461197" w:history="1">
             <w:r>
               <w:rPr>
                 <w:rStyle w:val="Hyperlink"/>
@@ -1218,7 +1292,7 @@
                 <w:noProof/>
                 <w:webHidden/>
               </w:rPr>
-              <w:instrText xml:space="preserve"> PAGEREF _Toc238395144 \h </w:instrText>
+              <w:instrText xml:space="preserve"> PAGEREF _Toc238461197 \h </w:instrText>
             </w:r>
             <w:r>
               <w:rPr>
@@ -1263,7 +1337,7 @@
               <w:lang w:val="en-NZ" w:eastAsia="en-NZ"/>
             </w:rPr>
           </w:pPr>
-          <w:hyperlink w:anchor="_Toc238395145" w:history="1">
+          <w:hyperlink w:anchor="_Toc238461198" w:history="1">
             <w:r>
               <w:rPr>
                 <w:rStyle w:val="Hyperlink"/>
@@ -1292,7 +1366,7 @@
                 <w:noProof/>
                 <w:webHidden/>
               </w:rPr>
-              <w:instrText xml:space="preserve"> PAGEREF _Toc238395145 \h </w:instrText>
+              <w:instrText xml:space="preserve"> PAGEREF _Toc238461198 \h </w:instrText>
             </w:r>
             <w:r>
               <w:rPr>
@@ -1337,7 +1411,7 @@
               <w:lang w:val="en-NZ" w:eastAsia="en-NZ"/>
             </w:rPr>
           </w:pPr>
-          <w:hyperlink w:anchor="_Toc238395146" w:history="1">
+          <w:hyperlink w:anchor="_Toc238461199" w:history="1">
             <w:r>
               <w:rPr>
                 <w:rStyle w:val="Hyperlink"/>
@@ -1366,7 +1440,7 @@
                 <w:noProof/>
                 <w:webHidden/>
               </w:rPr>
-              <w:instrText xml:space="preserve"> PAGEREF _Toc238395146 \h </w:instrText>
+              <w:instrText xml:space="preserve"> PAGEREF _Toc238461199 \h </w:instrText>
             </w:r>
             <w:r>
               <w:rPr>
@@ -1411,7 +1485,7 @@
               <w:lang w:val="en-NZ" w:eastAsia="en-NZ"/>
             </w:rPr>
           </w:pPr>
-          <w:hyperlink w:anchor="_Toc238395147" w:history="1">
+          <w:hyperlink w:anchor="_Toc238461200" w:history="1">
             <w:r>
               <w:rPr>
                 <w:rStyle w:val="Hyperlink"/>
@@ -1440,7 +1514,7 @@
                 <w:noProof/>
                 <w:webHidden/>
               </w:rPr>
-              <w:instrText xml:space="preserve"> PAGEREF _Toc238395147 \h </w:instrText>
+              <w:instrText xml:space="preserve"> PAGEREF _Toc238461200 \h </w:instrText>
             </w:r>
             <w:r>
               <w:rPr>
@@ -1485,7 +1559,7 @@
               <w:lang w:val="en-NZ" w:eastAsia="en-NZ"/>
             </w:rPr>
           </w:pPr>
-          <w:hyperlink w:anchor="_Toc238395148" w:history="1">
+          <w:hyperlink w:anchor="_Toc238461201" w:history="1">
             <w:r>
               <w:rPr>
                 <w:rStyle w:val="Hyperlink"/>
@@ -1514,7 +1588,7 @@
                 <w:noProof/>
                 <w:webHidden/>
               </w:rPr>
-              <w:instrText xml:space="preserve"> PAGEREF _Toc238395148 \h </w:instrText>
+              <w:instrText xml:space="preserve"> PAGEREF _Toc238461201 \h </w:instrText>
             </w:r>
             <w:r>
               <w:rPr>
@@ -1559,7 +1633,7 @@
               <w:lang w:val="en-NZ" w:eastAsia="en-NZ"/>
             </w:rPr>
           </w:pPr>
-          <w:hyperlink w:anchor="_Toc238395149" w:history="1">
+          <w:hyperlink w:anchor="_Toc238461202" w:history="1">
             <w:r>
               <w:rPr>
                 <w:rStyle w:val="Hyperlink"/>
@@ -1596,7 +1670,7 @@
                 <w:noProof/>
                 <w:webHidden/>
               </w:rPr>
-              <w:instrText xml:space="preserve"> PAGEREF _Toc238395149 \h </w:instrText>
+              <w:instrText xml:space="preserve"> PAGEREF _Toc238461202 \h </w:instrText>
             </w:r>
             <w:r>
               <w:rPr>
@@ -1641,7 +1715,7 @@
               <w:lang w:val="en-NZ" w:eastAsia="en-NZ"/>
             </w:rPr>
           </w:pPr>
-          <w:hyperlink w:anchor="_Toc238395150" w:history="1">
+          <w:hyperlink w:anchor="_Toc238461203" w:history="1">
             <w:r>
               <w:rPr>
                 <w:rStyle w:val="Hyperlink"/>
@@ -1670,7 +1744,7 @@
                 <w:noProof/>
                 <w:webHidden/>
               </w:rPr>
-              <w:instrText xml:space="preserve"> PAGEREF _Toc238395150 \h </w:instrText>
+              <w:instrText xml:space="preserve"> PAGEREF _Toc238461203 \h </w:instrText>
             </w:r>
             <w:r>
               <w:rPr>
@@ -1715,7 +1789,7 @@
               <w:lang w:val="en-NZ" w:eastAsia="en-NZ"/>
             </w:rPr>
           </w:pPr>
-          <w:hyperlink w:anchor="_Toc238395151" w:history="1">
+          <w:hyperlink w:anchor="_Toc238461204" w:history="1">
             <w:r>
               <w:rPr>
                 <w:rStyle w:val="Hyperlink"/>
@@ -1744,7 +1818,7 @@
                 <w:noProof/>
                 <w:webHidden/>
               </w:rPr>
-              <w:instrText xml:space="preserve"> PAGEREF _Toc238395151 \h </w:instrText>
+              <w:instrText xml:space="preserve"> PAGEREF _Toc238461204 \h </w:instrText>
             </w:r>
             <w:r>
               <w:rPr>
@@ -1850,7 +1924,7 @@
           <w:szCs w:val="28"/>
         </w:rPr>
       </w:pPr>
-      <w:bookmarkStart w:id="0" w:name="_Toc238395131"/>
+      <w:bookmarkStart w:id="0" w:name="_Toc238461183"/>
       <w:r>
         <w:rPr>
           <w:b/>
@@ -1860,7 +1934,7 @@
           <w:szCs w:val="28"/>
         </w:rPr>
         <w:lastRenderedPageBreak/>
-        <w:t>What's New in Version 2.0</w:t>
+        <w:t>What's New in Version 2.</w:t>
       </w:r>
       <w:r>
         <w:rPr>
@@ -1870,7 +1944,7 @@
           <w:sz w:val="28"/>
           <w:szCs w:val="28"/>
         </w:rPr>
-        <w:t>.2</w:t>
+        <w:t>1</w:t>
       </w:r>
       <w:bookmarkEnd w:id="0"/>
     </w:p>
@@ -1896,60 +1970,81 @@
           <w:sz w:val="20"/>
           <w:szCs w:val="20"/>
         </w:rPr>
-        <w:t>For display on E1 buttons, added more short names for system presets with names longer than 14 characters.  The short system preset names are no</w:t>
-      </w:r>
-      <w:r>
-        <w:rPr>
-          <w:sz w:val="20"/>
-          <w:szCs w:val="20"/>
-        </w:rPr>
-        <w:t>w</w:t>
-      </w:r>
-      <w:r>
-        <w:rPr>
-          <w:sz w:val="20"/>
-          <w:szCs w:val="20"/>
-        </w:rPr>
-        <w:t xml:space="preserve"> up to date as at firmware version 10.77.</w:t>
-      </w:r>
-    </w:p>
-    <w:p>
-      <w:pPr>
-        <w:spacing w:after="0"/>
-        <w:rPr>
-          <w:sz w:val="20"/>
-          <w:szCs w:val="20"/>
-        </w:rPr>
-      </w:pPr>
-    </w:p>
-    <w:p>
-      <w:pPr>
-        <w:spacing w:after="0"/>
-        <w:rPr>
-          <w:sz w:val="20"/>
-          <w:szCs w:val="20"/>
-        </w:rPr>
-      </w:pPr>
-      <w:r>
-        <w:rPr>
-          <w:sz w:val="20"/>
-          <w:szCs w:val="20"/>
-        </w:rPr>
-        <w:t>Fixed firmware version 10.77</w:t>
-      </w:r>
-      <w:r>
-        <w:rPr>
-          <w:sz w:val="20"/>
-          <w:szCs w:val="20"/>
-        </w:rPr>
-        <w:t xml:space="preserve"> </w:t>
-      </w:r>
-      <w:r>
-        <w:rPr>
-          <w:sz w:val="20"/>
-          <w:szCs w:val="20"/>
-        </w:rPr>
-        <w:t>compatibility issues.</w:t>
+        <w:t xml:space="preserve">When a user preset button is pressed to load </w:t>
+      </w:r>
+      <w:r>
+        <w:rPr>
+          <w:sz w:val="20"/>
+          <w:szCs w:val="20"/>
+        </w:rPr>
+        <w:t>a new user preset</w:t>
+      </w:r>
+      <w:r>
+        <w:rPr>
+          <w:sz w:val="20"/>
+          <w:szCs w:val="20"/>
+        </w:rPr>
+        <w:t>, and once</w:t>
+      </w:r>
+      <w:r>
+        <w:rPr>
+          <w:sz w:val="20"/>
+          <w:szCs w:val="20"/>
+        </w:rPr>
+        <w:t xml:space="preserve"> the </w:t>
+      </w:r>
+      <w:r>
+        <w:rPr>
+          <w:sz w:val="20"/>
+          <w:szCs w:val="20"/>
+        </w:rPr>
+        <w:t xml:space="preserve">new </w:t>
+      </w:r>
+      <w:r>
+        <w:rPr>
+          <w:sz w:val="20"/>
+          <w:szCs w:val="20"/>
+        </w:rPr>
+        <w:t>preset's macros are shown, the top control set is automatically activated (focused). So the top row of physical knobs will now control macro values without the player having to first press the left-top physical button.</w:t>
+      </w:r>
+      <w:r>
+        <w:rPr>
+          <w:sz w:val="20"/>
+          <w:szCs w:val="20"/>
+        </w:rPr>
+        <w:t xml:space="preserve">  (See </w:t>
+      </w:r>
+      <w:r>
+        <w:rPr>
+          <w:b/>
+          <w:bCs/>
+          <w:sz w:val="20"/>
+          <w:szCs w:val="20"/>
+        </w:rPr>
+        <w:t>Active Control Set</w:t>
+      </w:r>
+      <w:r>
+        <w:rPr>
+          <w:sz w:val="20"/>
+          <w:szCs w:val="20"/>
+        </w:rPr>
+        <w:t xml:space="preserve"> in </w:t>
+      </w:r>
+      <w:r>
+        <w:rPr>
+          <w:i/>
+          <w:iCs/>
+          <w:sz w:val="20"/>
+          <w:szCs w:val="20"/>
+        </w:rPr>
+        <w:t>Electra One User Guide</w:t>
+      </w:r>
+      <w:r>
+        <w:rPr>
+          <w:sz w:val="20"/>
+          <w:szCs w:val="20"/>
+        </w:rPr>
+        <w:t>.)</w:t>
       </w:r>
     </w:p>
     <w:p>
@@ -1973,7 +2068,7 @@
           <w:szCs w:val="28"/>
         </w:rPr>
       </w:pPr>
-      <w:bookmarkStart w:id="1" w:name="_Toc238395132"/>
+      <w:bookmarkStart w:id="1" w:name="_Toc238461184"/>
       <w:r>
         <w:rPr>
           <w:b/>
@@ -1982,7 +2077,7 @@
           <w:sz w:val="28"/>
           <w:szCs w:val="28"/>
         </w:rPr>
-        <w:t>What's New</w:t>
+        <w:t>What's New in Version 2.0</w:t>
       </w:r>
       <w:r>
         <w:rPr>
@@ -1992,9 +2087,152 @@
           <w:sz w:val="28"/>
           <w:szCs w:val="28"/>
         </w:rPr>
+        <w:t>.2</w:t>
+      </w:r>
+      <w:bookmarkEnd w:id="1"/>
+    </w:p>
+    <w:p>
+      <w:pPr>
+        <w:spacing w:after="0"/>
+        <w:rPr>
+          <w:sz w:val="20"/>
+          <w:szCs w:val="20"/>
+        </w:rPr>
+      </w:pPr>
+    </w:p>
+    <w:p>
+      <w:pPr>
+        <w:spacing w:after="0"/>
+        <w:rPr>
+          <w:sz w:val="20"/>
+          <w:szCs w:val="20"/>
+        </w:rPr>
+      </w:pPr>
+      <w:r>
+        <w:rPr>
+          <w:sz w:val="20"/>
+          <w:szCs w:val="20"/>
+        </w:rPr>
+        <w:t>For display on E1 buttons, added more short names for system presets with names longer than 14 characters.  The short system preset names are no</w:t>
+      </w:r>
+      <w:r>
+        <w:rPr>
+          <w:sz w:val="20"/>
+          <w:szCs w:val="20"/>
+        </w:rPr>
+        <w:t>w</w:t>
+      </w:r>
+      <w:r>
+        <w:rPr>
+          <w:sz w:val="20"/>
+          <w:szCs w:val="20"/>
+        </w:rPr>
+        <w:t xml:space="preserve"> up to date as at firmware version 10.77.</w:t>
+      </w:r>
+    </w:p>
+    <w:p>
+      <w:pPr>
+        <w:spacing w:after="0"/>
+        <w:rPr>
+          <w:sz w:val="20"/>
+          <w:szCs w:val="20"/>
+        </w:rPr>
+      </w:pPr>
+    </w:p>
+    <w:p>
+      <w:pPr>
+        <w:spacing w:after="0"/>
+        <w:rPr>
+          <w:sz w:val="20"/>
+          <w:szCs w:val="20"/>
+        </w:rPr>
+      </w:pPr>
+      <w:r>
+        <w:rPr>
+          <w:sz w:val="20"/>
+          <w:szCs w:val="20"/>
+        </w:rPr>
+        <w:t>Backward-compatible f</w:t>
+      </w:r>
+      <w:r>
+        <w:rPr>
+          <w:sz w:val="20"/>
+          <w:szCs w:val="20"/>
+        </w:rPr>
+        <w:t>ixe</w:t>
+      </w:r>
+      <w:r>
+        <w:rPr>
+          <w:sz w:val="20"/>
+          <w:szCs w:val="20"/>
+        </w:rPr>
+        <w:t>s for</w:t>
+      </w:r>
+      <w:r>
+        <w:rPr>
+          <w:sz w:val="20"/>
+          <w:szCs w:val="20"/>
+        </w:rPr>
+        <w:t xml:space="preserve"> firmware version 10.77</w:t>
+      </w:r>
+      <w:r>
+        <w:rPr>
+          <w:sz w:val="20"/>
+          <w:szCs w:val="20"/>
+        </w:rPr>
+        <w:t xml:space="preserve"> </w:t>
+      </w:r>
+      <w:r>
+        <w:rPr>
+          <w:sz w:val="20"/>
+          <w:szCs w:val="20"/>
+        </w:rPr>
+        <w:t>compatibility issues.</w:t>
+      </w:r>
+    </w:p>
+    <w:p>
+      <w:pPr>
+        <w:spacing w:after="0"/>
+        <w:rPr>
+          <w:sz w:val="20"/>
+          <w:szCs w:val="20"/>
+        </w:rPr>
+      </w:pPr>
+    </w:p>
+    <w:p>
+      <w:pPr>
+        <w:pStyle w:val="Heading1"/>
+        <w:spacing w:before="0" w:after="0"/>
+        <w:rPr>
+          <w:b/>
+          <w:bCs/>
+          <w:color w:val="auto"/>
+          <w:sz w:val="28"/>
+          <w:szCs w:val="28"/>
+        </w:rPr>
+      </w:pPr>
+      <w:bookmarkStart w:id="2" w:name="_Toc238461185"/>
+      <w:r>
+        <w:rPr>
+          <w:b/>
+          <w:bCs/>
+          <w:color w:val="auto"/>
+          <w:sz w:val="28"/>
+          <w:szCs w:val="28"/>
+        </w:rPr>
+        <w:t>What's New</w:t>
+      </w:r>
+      <w:r>
+        <w:rPr>
+          <w:b/>
+          <w:bCs/>
+          <w:color w:val="auto"/>
+          <w:sz w:val="28"/>
+          <w:szCs w:val="28"/>
+        </w:rPr>
         <w:t xml:space="preserve"> in Version 2.0</w:t>
       </w:r>
-      <w:bookmarkEnd w:id="1"/>
+      <w:bookmarkEnd w:id="2"/>
     </w:p>
     <w:p>
       <w:pPr>
@@ -2321,7 +2559,7 @@
           <w:szCs w:val="28"/>
         </w:rPr>
       </w:pPr>
-      <w:bookmarkStart w:id="2" w:name="_Toc238395133"/>
+      <w:bookmarkStart w:id="3" w:name="_Toc238461186"/>
       <w:r>
         <w:rPr>
           <w:b/>
@@ -2332,7 +2570,7 @@
         </w:rPr>
         <w:t>Overview</w:t>
       </w:r>
-      <w:bookmarkEnd w:id="2"/>
+      <w:bookmarkEnd w:id="3"/>
     </w:p>
     <w:p>
       <w:pPr>
@@ -2543,7 +2781,6 @@
           <w:i/>
           <w:iCs/>
         </w:rPr>
-        <w:lastRenderedPageBreak/>
         <w:t>Continuum Controller is not a Haken Audio product. Please do not raise Haken Audio tickets.</w:t>
       </w:r>
     </w:p>
@@ -2564,7 +2801,7 @@
           <w:szCs w:val="28"/>
         </w:rPr>
       </w:pPr>
-      <w:bookmarkStart w:id="3" w:name="_Toc238395134"/>
+      <w:bookmarkStart w:id="4" w:name="_Toc238461187"/>
       <w:r>
         <w:rPr>
           <w:b/>
@@ -2575,7 +2812,7 @@
         </w:rPr>
         <w:t>Version Compatibility</w:t>
       </w:r>
-      <w:bookmarkEnd w:id="3"/>
+      <w:bookmarkEnd w:id="4"/>
     </w:p>
     <w:p>
       <w:pPr>
@@ -2611,7 +2848,7 @@
           <w:szCs w:val="20"/>
         </w:rPr>
       </w:pPr>
-      <w:bookmarkStart w:id="4" w:name="_Hlk218004482"/>
+      <w:bookmarkStart w:id="5" w:name="_Hlk218004482"/>
       <w:r>
         <w:rPr>
           <w:sz w:val="20"/>
@@ -2700,7 +2937,7 @@
         <w:t>Firmware: 4.0 or later</w:t>
       </w:r>
     </w:p>
-    <w:bookmarkEnd w:id="4"/>
+    <w:bookmarkEnd w:id="5"/>
     <w:p>
       <w:pPr>
         <w:spacing w:after="0"/>
@@ -3036,7 +3273,7 @@
           <w:szCs w:val="28"/>
         </w:rPr>
       </w:pPr>
-      <w:bookmarkStart w:id="5" w:name="_Toc238395135"/>
+      <w:bookmarkStart w:id="6" w:name="_Toc238461188"/>
       <w:r>
         <w:rPr>
           <w:b/>
@@ -3048,7 +3285,7 @@
         <w:lastRenderedPageBreak/>
         <w:t>Connecting the Electra One to the Haken Continuum</w:t>
       </w:r>
-      <w:bookmarkEnd w:id="5"/>
+      <w:bookmarkEnd w:id="6"/>
       <w:r>
         <w:rPr>
           <w:b/>
@@ -3184,7 +3421,7 @@
           <w:szCs w:val="20"/>
         </w:rPr>
       </w:pPr>
-      <w:bookmarkStart w:id="6" w:name="_Toc177205373"/>
+      <w:bookmarkStart w:id="7" w:name="_Toc177205373"/>
       <w:r>
         <w:t xml:space="preserve">Figure </w:t>
       </w:r>
@@ -3199,7 +3436,7 @@
       <w:r>
         <w:t>- Connecting the Electra One to the Haken Slim Continuum</w:t>
       </w:r>
-      <w:bookmarkEnd w:id="6"/>
+      <w:bookmarkEnd w:id="7"/>
     </w:p>
     <w:p>
       <w:pPr>
@@ -3257,7 +3494,7 @@
           <w:szCs w:val="24"/>
         </w:rPr>
       </w:pPr>
-      <w:bookmarkStart w:id="7" w:name="_Toc238395136"/>
+      <w:bookmarkStart w:id="8" w:name="_Toc238461189"/>
       <w:r>
         <w:rPr>
           <w:b/>
@@ -3288,7 +3525,7 @@
         </w:rPr>
         <w:t>Continuum Controller</w:t>
       </w:r>
-      <w:bookmarkEnd w:id="7"/>
+      <w:bookmarkEnd w:id="8"/>
     </w:p>
     <w:p>
       <w:pPr>
@@ -3581,7 +3818,7 @@
           <w:szCs w:val="28"/>
         </w:rPr>
       </w:pPr>
-      <w:bookmarkStart w:id="8" w:name="_Toc238395137"/>
+      <w:bookmarkStart w:id="9" w:name="_Toc238461190"/>
       <w:r>
         <w:rPr>
           <w:b/>
@@ -3593,7 +3830,7 @@
         <w:lastRenderedPageBreak/>
         <w:t>Electra One Controller Navigation</w:t>
       </w:r>
-      <w:bookmarkEnd w:id="8"/>
+      <w:bookmarkEnd w:id="9"/>
     </w:p>
     <w:p>
       <w:pPr>
@@ -3718,7 +3955,7 @@
           <w:szCs w:val="20"/>
         </w:rPr>
       </w:pPr>
-      <w:bookmarkStart w:id="9" w:name="_Toc177205374"/>
+      <w:bookmarkStart w:id="10" w:name="_Toc177205374"/>
       <w:r>
         <w:t xml:space="preserve">Figure </w:t>
       </w:r>
@@ -3733,7 +3970,7 @@
       <w:r>
         <w:t xml:space="preserve"> - Basic Electra One Navigation</w:t>
       </w:r>
-      <w:bookmarkEnd w:id="9"/>
+      <w:bookmarkEnd w:id="10"/>
     </w:p>
     <w:p>
       <w:pPr>
@@ -3756,7 +3993,7 @@
           <w:szCs w:val="28"/>
         </w:rPr>
       </w:pPr>
-      <w:bookmarkStart w:id="10" w:name="_Toc238395138"/>
+      <w:bookmarkStart w:id="11" w:name="_Toc238461191"/>
       <w:r>
         <w:rPr>
           <w:b/>
@@ -3767,7 +4004,7 @@
         </w:rPr>
         <w:t>Continuum Controller Pages</w:t>
       </w:r>
-      <w:bookmarkEnd w:id="10"/>
+      <w:bookmarkEnd w:id="11"/>
     </w:p>
     <w:p>
       <w:pPr>
@@ -5067,7 +5304,7 @@
           <w:szCs w:val="24"/>
         </w:rPr>
       </w:pPr>
-      <w:bookmarkStart w:id="11" w:name="_Toc238395139"/>
+      <w:bookmarkStart w:id="12" w:name="_Toc238461192"/>
       <w:r>
         <w:rPr>
           <w:b/>
@@ -5099,7 +5336,7 @@
         </w:rPr>
         <w:t xml:space="preserve"> and Macros Page</w:t>
       </w:r>
-      <w:bookmarkEnd w:id="11"/>
+      <w:bookmarkEnd w:id="12"/>
     </w:p>
     <w:p>
       <w:pPr>
@@ -5612,7 +5849,7 @@
           <w:szCs w:val="20"/>
         </w:rPr>
       </w:pPr>
-      <w:bookmarkStart w:id="12" w:name="_Toc177205375"/>
+      <w:bookmarkStart w:id="13" w:name="_Toc177205375"/>
     </w:p>
     <w:p>
       <w:pPr>
@@ -5642,7 +5879,7 @@
       <w:r>
         <w:t>Page</w:t>
       </w:r>
-      <w:bookmarkEnd w:id="12"/>
+      <w:bookmarkEnd w:id="13"/>
     </w:p>
     <w:p>
       <w:pPr>
@@ -5664,9 +5901,9 @@
           <w:szCs w:val="24"/>
         </w:rPr>
       </w:pPr>
-      <w:bookmarkStart w:id="13" w:name="_Loading_Presets"/>
-      <w:bookmarkStart w:id="14" w:name="_Toc238395140"/>
-      <w:bookmarkEnd w:id="13"/>
+      <w:bookmarkStart w:id="14" w:name="_Loading_Presets"/>
+      <w:bookmarkStart w:id="15" w:name="_Toc238461193"/>
+      <w:bookmarkEnd w:id="14"/>
       <w:r>
         <w:rPr>
           <w:b/>
@@ -5676,7 +5913,7 @@
         </w:rPr>
         <w:t>Loading Presets</w:t>
       </w:r>
-      <w:bookmarkEnd w:id="14"/>
+      <w:bookmarkEnd w:id="15"/>
     </w:p>
     <w:p>
       <w:pPr>
@@ -6635,9 +6872,9 @@
           <w:szCs w:val="24"/>
         </w:rPr>
       </w:pPr>
-      <w:bookmarkStart w:id="15" w:name="_Selecting_Presets"/>
-      <w:bookmarkStart w:id="16" w:name="_Toc238395141"/>
-      <w:bookmarkEnd w:id="15"/>
+      <w:bookmarkStart w:id="16" w:name="_Selecting_Presets"/>
+      <w:bookmarkStart w:id="17" w:name="_Toc238461194"/>
+      <w:bookmarkEnd w:id="16"/>
       <w:r>
         <w:rPr>
           <w:b/>
@@ -6648,7 +6885,7 @@
         </w:rPr>
         <w:t>Selecting Presets</w:t>
       </w:r>
-      <w:bookmarkEnd w:id="16"/>
+      <w:bookmarkEnd w:id="17"/>
     </w:p>
     <w:p>
       <w:pPr>
@@ -7043,7 +7280,7 @@
           <w:szCs w:val="24"/>
         </w:rPr>
       </w:pPr>
-      <w:bookmarkStart w:id="17" w:name="_Toc238395142"/>
+      <w:bookmarkStart w:id="18" w:name="_Toc238461195"/>
       <w:r>
         <w:rPr>
           <w:b/>
@@ -7054,7 +7291,7 @@
         </w:rPr>
         <w:t>Storing presets</w:t>
       </w:r>
-      <w:bookmarkEnd w:id="17"/>
+      <w:bookmarkEnd w:id="18"/>
     </w:p>
     <w:p>
       <w:pPr>
@@ -7875,7 +8112,7 @@
           <w:szCs w:val="24"/>
         </w:rPr>
       </w:pPr>
-      <w:bookmarkStart w:id="18" w:name="_Toc238395143"/>
+      <w:bookmarkStart w:id="19" w:name="_Toc238461196"/>
       <w:r>
         <w:rPr>
           <w:b/>
@@ -7886,7 +8123,7 @@
         </w:rPr>
         <w:t>Clearing presets</w:t>
       </w:r>
-      <w:bookmarkEnd w:id="18"/>
+      <w:bookmarkEnd w:id="19"/>
     </w:p>
     <w:p>
       <w:pPr>
@@ -7929,7 +8166,7 @@
           <w:szCs w:val="24"/>
         </w:rPr>
       </w:pPr>
-      <w:bookmarkStart w:id="19" w:name="_Toc238395144"/>
+      <w:bookmarkStart w:id="20" w:name="_Toc238461197"/>
       <w:r>
         <w:rPr>
           <w:b/>
@@ -7940,7 +8177,7 @@
         </w:rPr>
         <w:t>Effects/Pedals Page</w:t>
       </w:r>
-      <w:bookmarkEnd w:id="19"/>
+      <w:bookmarkEnd w:id="20"/>
     </w:p>
     <w:p>
       <w:pPr>
@@ -8020,7 +8257,7 @@
         <w:pStyle w:val="Caption"/>
         <w:spacing w:after="0"/>
       </w:pPr>
-      <w:bookmarkStart w:id="20" w:name="_Toc177205376"/>
+      <w:bookmarkStart w:id="21" w:name="_Toc177205376"/>
       <w:r>
         <w:t xml:space="preserve">Figure </w:t>
       </w:r>
@@ -8035,7 +8272,7 @@
       <w:r>
         <w:t xml:space="preserve"> - Effects and Pedals Page</w:t>
       </w:r>
-      <w:bookmarkEnd w:id="20"/>
+      <w:bookmarkEnd w:id="21"/>
     </w:p>
     <w:p>
       <w:pPr>
@@ -9413,7 +9650,7 @@
           <w:szCs w:val="24"/>
         </w:rPr>
       </w:pPr>
-      <w:bookmarkStart w:id="21" w:name="_Toc238395145"/>
+      <w:bookmarkStart w:id="22" w:name="_Toc238461198"/>
       <w:r>
         <w:rPr>
           <w:b/>
@@ -9425,26 +9662,26 @@
         <w:lastRenderedPageBreak/>
         <w:t>Gain and Convolution Page</w:t>
       </w:r>
-      <w:bookmarkEnd w:id="21"/>
-    </w:p>
-    <w:p>
-      <w:pPr>
-        <w:spacing w:after="0"/>
-        <w:rPr>
-          <w:sz w:val="20"/>
-          <w:szCs w:val="20"/>
-        </w:rPr>
-      </w:pPr>
-    </w:p>
-    <w:p>
-      <w:pPr>
-        <w:spacing w:after="0"/>
-        <w:rPr>
-          <w:sz w:val="20"/>
-          <w:szCs w:val="20"/>
-        </w:rPr>
-      </w:pPr>
-      <w:bookmarkStart w:id="22" w:name="_Toc177205377"/>
+      <w:bookmarkEnd w:id="22"/>
+    </w:p>
+    <w:p>
+      <w:pPr>
+        <w:spacing w:after="0"/>
+        <w:rPr>
+          <w:sz w:val="20"/>
+          <w:szCs w:val="20"/>
+        </w:rPr>
+      </w:pPr>
+    </w:p>
+    <w:p>
+      <w:pPr>
+        <w:spacing w:after="0"/>
+        <w:rPr>
+          <w:sz w:val="20"/>
+          <w:szCs w:val="20"/>
+        </w:rPr>
+      </w:pPr>
+      <w:bookmarkStart w:id="23" w:name="_Toc177205377"/>
       <w:r>
         <w:rPr>
           <w:noProof/>
@@ -9522,7 +9759,7 @@
       <w:r>
         <w:t xml:space="preserve"> - Gain and Convolution Page</w:t>
       </w:r>
-      <w:bookmarkEnd w:id="22"/>
+      <w:bookmarkEnd w:id="23"/>
     </w:p>
     <w:p>
       <w:pPr>
@@ -10339,7 +10576,7 @@
           <w:szCs w:val="24"/>
         </w:rPr>
       </w:pPr>
-      <w:bookmarkStart w:id="23" w:name="_Toc238395146"/>
+      <w:bookmarkStart w:id="24" w:name="_Toc238461199"/>
       <w:r>
         <w:rPr>
           <w:b/>
@@ -10351,7 +10588,7 @@
         <w:lastRenderedPageBreak/>
         <w:t>Transposition Page</w:t>
       </w:r>
-      <w:bookmarkEnd w:id="23"/>
+      <w:bookmarkEnd w:id="24"/>
     </w:p>
     <w:p>
       <w:pPr>
@@ -10439,7 +10676,7 @@
           <w:szCs w:val="20"/>
         </w:rPr>
       </w:pPr>
-      <w:bookmarkStart w:id="24" w:name="_Toc177205378"/>
+      <w:bookmarkStart w:id="25" w:name="_Toc177205378"/>
     </w:p>
     <w:p>
       <w:pPr>
@@ -10460,7 +10697,7 @@
       <w:r>
         <w:t xml:space="preserve"> - Transposition Page</w:t>
       </w:r>
-      <w:bookmarkEnd w:id="24"/>
+      <w:bookmarkEnd w:id="25"/>
     </w:p>
     <w:p>
       <w:pPr>
@@ -10754,7 +10991,7 @@
           <w:szCs w:val="24"/>
         </w:rPr>
       </w:pPr>
-      <w:bookmarkStart w:id="25" w:name="_Toc238395147"/>
+      <w:bookmarkStart w:id="26" w:name="_Toc238461200"/>
       <w:r>
         <w:rPr>
           <w:b/>
@@ -10766,26 +11003,26 @@
         <w:lastRenderedPageBreak/>
         <w:t>Rounding and Tuning Page</w:t>
       </w:r>
-      <w:bookmarkEnd w:id="25"/>
-    </w:p>
-    <w:p>
-      <w:pPr>
-        <w:spacing w:after="0"/>
-        <w:rPr>
-          <w:sz w:val="20"/>
-          <w:szCs w:val="20"/>
-        </w:rPr>
-      </w:pPr>
-    </w:p>
-    <w:p>
-      <w:pPr>
-        <w:spacing w:after="0"/>
-        <w:rPr>
-          <w:sz w:val="20"/>
-          <w:szCs w:val="20"/>
-        </w:rPr>
-      </w:pPr>
-      <w:bookmarkStart w:id="26" w:name="_Toc177205379"/>
+      <w:bookmarkEnd w:id="26"/>
+    </w:p>
+    <w:p>
+      <w:pPr>
+        <w:spacing w:after="0"/>
+        <w:rPr>
+          <w:sz w:val="20"/>
+          <w:szCs w:val="20"/>
+        </w:rPr>
+      </w:pPr>
+    </w:p>
+    <w:p>
+      <w:pPr>
+        <w:spacing w:after="0"/>
+        <w:rPr>
+          <w:sz w:val="20"/>
+          <w:szCs w:val="20"/>
+        </w:rPr>
+      </w:pPr>
+      <w:bookmarkStart w:id="27" w:name="_Toc177205379"/>
       <w:r>
         <w:rPr>
           <w:noProof/>
@@ -10863,7 +11100,7 @@
       <w:r>
         <w:t xml:space="preserve"> - Rounding and Tuning Page</w:t>
       </w:r>
-      <w:bookmarkEnd w:id="26"/>
+      <w:bookmarkEnd w:id="27"/>
     </w:p>
     <w:p>
       <w:pPr>
@@ -11375,7 +11612,7 @@
           <w:szCs w:val="24"/>
         </w:rPr>
       </w:pPr>
-      <w:bookmarkStart w:id="27" w:name="_Toc238395148"/>
+      <w:bookmarkStart w:id="28" w:name="_Toc238461201"/>
       <w:r>
         <w:rPr>
           <w:b/>
@@ -11387,7 +11624,7 @@
         <w:lastRenderedPageBreak/>
         <w:t>Info Page</w:t>
       </w:r>
-      <w:bookmarkEnd w:id="27"/>
+      <w:bookmarkEnd w:id="28"/>
     </w:p>
     <w:p>
       <w:pPr>
@@ -11465,7 +11702,7 @@
           <w:szCs w:val="20"/>
         </w:rPr>
       </w:pPr>
-      <w:bookmarkStart w:id="28" w:name="_Toc177205380"/>
+      <w:bookmarkStart w:id="29" w:name="_Toc177205380"/>
     </w:p>
     <w:p>
       <w:pPr>
@@ -11486,7 +11723,7 @@
       <w:r>
         <w:t xml:space="preserve"> - Info Page</w:t>
       </w:r>
-      <w:bookmarkEnd w:id="28"/>
+      <w:bookmarkEnd w:id="29"/>
     </w:p>
     <w:p>
       <w:pPr>
@@ -11803,7 +12040,7 @@
           <w:szCs w:val="28"/>
         </w:rPr>
       </w:pPr>
-      <w:bookmarkStart w:id="29" w:name="_Toc238395149"/>
+      <w:bookmarkStart w:id="30" w:name="_Toc238461202"/>
       <w:r>
         <w:rPr>
           <w:b/>
@@ -11824,7 +12061,7 @@
         </w:rPr>
         <w:t xml:space="preserve"> the Continuum Controller Application</w:t>
       </w:r>
-      <w:bookmarkEnd w:id="29"/>
+      <w:bookmarkEnd w:id="30"/>
     </w:p>
     <w:p>
       <w:pPr>
@@ -12201,7 +12438,7 @@
           <w:szCs w:val="20"/>
         </w:rPr>
       </w:pPr>
-      <w:bookmarkStart w:id="30" w:name="_Toc177205381"/>
+      <w:bookmarkStart w:id="31" w:name="_Toc177205381"/>
       <w:r>
         <w:t xml:space="preserve">Figure </w:t>
       </w:r>
@@ -12225,7 +12462,7 @@
       <w:r>
         <w:t xml:space="preserve"> Library</w:t>
       </w:r>
-      <w:bookmarkEnd w:id="30"/>
+      <w:bookmarkEnd w:id="31"/>
     </w:p>
     <w:p>
       <w:pPr>
@@ -12322,7 +12559,7 @@
           <w:szCs w:val="28"/>
         </w:rPr>
       </w:pPr>
-      <w:bookmarkStart w:id="31" w:name="_Toc238395150"/>
+      <w:bookmarkStart w:id="32" w:name="_Toc238461203"/>
       <w:r>
         <w:rPr>
           <w:b/>
@@ -12334,7 +12571,7 @@
         <w:lastRenderedPageBreak/>
         <w:t>When to use the Haken Editor</w:t>
       </w:r>
-      <w:bookmarkEnd w:id="31"/>
+      <w:bookmarkEnd w:id="32"/>
     </w:p>
     <w:p>
       <w:pPr>
@@ -12717,7 +12954,7 @@
           <w:szCs w:val="28"/>
         </w:rPr>
       </w:pPr>
-      <w:bookmarkStart w:id="32" w:name="_Toc238395151"/>
+      <w:bookmarkStart w:id="33" w:name="_Toc238461204"/>
       <w:r>
         <w:rPr>
           <w:b/>
@@ -12738,7 +12975,7 @@
         </w:rPr>
         <w:t xml:space="preserve"> and Feedback</w:t>
       </w:r>
-      <w:bookmarkEnd w:id="32"/>
+      <w:bookmarkEnd w:id="33"/>
     </w:p>
     <w:p>
       <w:pPr>
@@ -12910,7 +13147,7 @@
 </file>
 
 <file path=word/endnotes.xml><?xml version="1.0" encoding="utf-8"?>
-<w:endnotes xmlns:wpc="http://schemas.microsoft.com/office/word/2010/wordprocessingCanvas" xmlns:cx="http://schemas.microsoft.com/office/drawing/2014/chartex" xmlns:cx1="http://schemas.microsoft.com/office/drawing/2015/9/8/chartex" xmlns:cx2="http://schemas.microsoft.com/office/drawing/2015/10/21/chartex" xmlns:cx3="http://schemas.microsoft.com/office/drawing/2016/5/9/chartex" xmlns:cx4="http://schemas.microsoft.com/office/drawing/2016/5/10/chartex" xmlns:cx5="http://schemas.microsoft.com/office/drawing/2016/5/11/chartex" xmlns:cx6="http://schemas.microsoft.com/office/drawing/2016/5/12/chartex" xmlns:cx7="http://schemas.microsoft.com/office/drawing/2016/5/13/chartex" xmlns:cx8="http://schemas.microsoft.com/office/drawing/2016/5/14/chartex" xmlns:mc="http://schemas.openxmlformats.org/markup-compatibility/2006" xmlns:aink="http://schemas.microsoft.com/office/drawing/2016/ink" xmlns:am3d="http://schemas.microsoft.com/office/drawing/2017/model3d" xmlns:o="urn:schemas-microsoft-com:office:office" xmlns:oel="http://schemas.microsoft.com/office/2019/extlst" xmlns:r="http://schemas.openxmlformats.org/officeDocument/2006/relationships" xmlns:m="http://schemas.openxmlformats.org/officeDocument/2006/math" xmlns:v="urn:schemas-microsoft-com:vml" xmlns:wp14="http://schemas.microsoft.com/office/word/2010/wordprocessingDrawing" xmlns:wp="http://schemas.openxmlformats.org/drawingml/2006/wordprocessingDrawing" xmlns:w10="urn:schemas-microsoft-com:office:word" xmlns:w="http://schemas.openxmlformats.org/wordprocessingml/2006/main" xmlns:w14="http://schemas.microsoft.com/office/word/2010/wordml" xmlns:w15="http://schemas.microsoft.com/office/word/2012/wordml" xmlns:w16cei="http://schemas.microsoft.com/office/word/2026/wordml/cei" xmlns:w16cex="http://schemas.microsoft.com/office/word/2018/wordml/cex" xmlns:w16cid="http://schemas.microsoft.com/office/word/2016/wordml/cid" xmlns:w16="http://schemas.microsoft.com/office/word/2018/wordml" xmlns:w16du="http://schemas.microsoft.com/office/word/2023/wordml/word16du" xmlns:w16sdtdh="http://schemas.microsoft.com/office/word/2020/wordml/sdtdatahash" xmlns:w16sdtfl="http://schemas.microsoft.com/office/word/2024/wordml/sdtformatlock" xmlns:w16se="http://schemas.microsoft.com/office/word/2015/wordml/symex" xmlns:wpg="http://schemas.microsoft.com/office/word/2010/wordprocessingGroup" xmlns:wpi="http://schemas.microsoft.com/office/word/2010/wordprocessingInk" xmlns:wne="http://schemas.microsoft.com/office/word/2006/wordml" xmlns:wps="http://schemas.microsoft.com/office/word/2010/wordprocessingShape" mc:Ignorable="w14 w15 w16se w16cid w16 w16cex w16sdtdh w16sdtfl w16du wp14">
+<w:endnotes xmlns:wpc="http://schemas.microsoft.com/office/word/2010/wordprocessingCanvas" xmlns:cx="http://schemas.microsoft.com/office/drawing/2014/chartex" xmlns:cx1="http://schemas.microsoft.com/office/drawing/2015/9/8/chartex" xmlns:cx2="http://schemas.microsoft.com/office/drawing/2015/10/21/chartex" xmlns:cx3="http://schemas.microsoft.com/office/drawing/2016/5/9/chartex" xmlns:cx4="http://schemas.microsoft.com/office/drawing/2016/5/10/chartex" xmlns:cx5="http://schemas.microsoft.com/office/drawing/2016/5/11/chartex" xmlns:cx6="http://schemas.microsoft.com/office/drawing/2016/5/12/chartex" xmlns:cx7="http://schemas.microsoft.com/office/drawing/2016/5/13/chartex" xmlns:cx8="http://schemas.microsoft.com/office/drawing/2016/5/14/chartex" xmlns:mc="http://schemas.openxmlformats.org/markup-compatibility/2006" xmlns:aink="http://schemas.microsoft.com/office/drawing/2016/ink" xmlns:am3d="http://schemas.microsoft.com/office/drawing/2017/model3d" xmlns:o="urn:schemas-microsoft-com:office:office" xmlns:oel="http://schemas.microsoft.com/office/2019/extlst" xmlns:r="http://schemas.openxmlformats.org/officeDocument/2006/relationships" xmlns:m="http://schemas.openxmlformats.org/officeDocument/2006/math" xmlns:v="urn:schemas-microsoft-com:vml" xmlns:wp14="http://schemas.microsoft.com/office/word/2010/wordprocessingDrawing" xmlns:wp="http://schemas.openxmlformats.org/drawingml/2006/wordprocessingDrawing" xmlns:w10="urn:schemas-microsoft-com:office:word" xmlns:w="http://schemas.openxmlformats.org/wordprocessingml/2006/main" xmlns:w14="http://schemas.microsoft.com/office/word/2010/wordml" xmlns:w15="http://schemas.microsoft.com/office/word/2012/wordml" xmlns:w16cex="http://schemas.microsoft.com/office/word/2018/wordml/cex" xmlns:w16cid="http://schemas.microsoft.com/office/word/2016/wordml/cid" xmlns:w16="http://schemas.microsoft.com/office/word/2018/wordml" xmlns:w16du="http://schemas.microsoft.com/office/word/2023/wordml/word16du" xmlns:w16sdtdh="http://schemas.microsoft.com/office/word/2020/wordml/sdtdatahash" xmlns:w16sdtfl="http://schemas.microsoft.com/office/word/2024/wordml/sdtformatlock" xmlns:w16se="http://schemas.microsoft.com/office/word/2015/wordml/symex" xmlns:wpg="http://schemas.microsoft.com/office/word/2010/wordprocessingGroup" xmlns:wpi="http://schemas.microsoft.com/office/word/2010/wordprocessingInk" xmlns:wne="http://schemas.microsoft.com/office/word/2006/wordml" xmlns:wps="http://schemas.microsoft.com/office/word/2010/wordprocessingShape" mc:Ignorable="w14 w15 w16se w16cid w16 w16cex w16sdtdh w16sdtfl w16du wp14">
   <w:endnote w:type="separator" w:id="-1">
     <w:p>
       <w:pPr>
@@ -12935,7 +13172,7 @@
 </file>
 
 <file path=word/footer1.xml><?xml version="1.0" encoding="utf-8"?>
-<w:ftr xmlns:wpc="http://schemas.microsoft.com/office/word/2010/wordprocessingCanvas" xmlns:cx="http://schemas.microsoft.com/office/drawing/2014/chartex" xmlns:cx1="http://schemas.microsoft.com/office/drawing/2015/9/8/chartex" xmlns:cx2="http://schemas.microsoft.com/office/drawing/2015/10/21/chartex" xmlns:cx3="http://schemas.microsoft.com/office/drawing/2016/5/9/chartex" xmlns:cx4="http://schemas.microsoft.com/office/drawing/2016/5/10/chartex" xmlns:cx5="http://schemas.microsoft.com/office/drawing/2016/5/11/chartex" xmlns:cx6="http://schemas.microsoft.com/office/drawing/2016/5/12/chartex" xmlns:cx7="http://schemas.microsoft.com/office/drawing/2016/5/13/chartex" xmlns:cx8="http://schemas.microsoft.com/office/drawing/2016/5/14/chartex" xmlns:mc="http://schemas.openxmlformats.org/markup-compatibility/2006" xmlns:aink="http://schemas.microsoft.com/office/drawing/2016/ink" xmlns:am3d="http://schemas.microsoft.com/office/drawing/2017/model3d" xmlns:o="urn:schemas-microsoft-com:office:office" xmlns:oel="http://schemas.microsoft.com/office/2019/extlst" xmlns:r="http://schemas.openxmlformats.org/officeDocument/2006/relationships" xmlns:m="http://schemas.openxmlformats.org/officeDocument/2006/math" xmlns:v="urn:schemas-microsoft-com:vml" xmlns:wp14="http://schemas.microsoft.com/office/word/2010/wordprocessingDrawing" xmlns:wp="http://schemas.openxmlformats.org/drawingml/2006/wordprocessingDrawing" xmlns:w10="urn:schemas-microsoft-com:office:word" xmlns:w="http://schemas.openxmlformats.org/wordprocessingml/2006/main" xmlns:w14="http://schemas.microsoft.com/office/word/2010/wordml" xmlns:w15="http://schemas.microsoft.com/office/word/2012/wordml" xmlns:w16cei="http://schemas.microsoft.com/office/word/2026/wordml/cei" xmlns:w16cex="http://schemas.microsoft.com/office/word/2018/wordml/cex" xmlns:w16cid="http://schemas.microsoft.com/office/word/2016/wordml/cid" xmlns:w16="http://schemas.microsoft.com/office/word/2018/wordml" xmlns:w16du="http://schemas.microsoft.com/office/word/2023/wordml/word16du" xmlns:w16sdtdh="http://schemas.microsoft.com/office/word/2020/wordml/sdtdatahash" xmlns:w16sdtfl="http://schemas.microsoft.com/office/word/2024/wordml/sdtformatlock" xmlns:w16se="http://schemas.microsoft.com/office/word/2015/wordml/symex" xmlns:wpg="http://schemas.microsoft.com/office/word/2010/wordprocessingGroup" xmlns:wpi="http://schemas.microsoft.com/office/word/2010/wordprocessingInk" xmlns:wne="http://schemas.microsoft.com/office/word/2006/wordml" xmlns:wps="http://schemas.microsoft.com/office/word/2010/wordprocessingShape" mc:Ignorable="w14 w15 w16se w16cid w16 w16cex w16sdtdh w16sdtfl w16du wp14">
+<w:ftr xmlns:wpc="http://schemas.microsoft.com/office/word/2010/wordprocessingCanvas" xmlns:cx="http://schemas.microsoft.com/office/drawing/2014/chartex" xmlns:cx1="http://schemas.microsoft.com/office/drawing/2015/9/8/chartex" xmlns:cx2="http://schemas.microsoft.com/office/drawing/2015/10/21/chartex" xmlns:cx3="http://schemas.microsoft.com/office/drawing/2016/5/9/chartex" xmlns:cx4="http://schemas.microsoft.com/office/drawing/2016/5/10/chartex" xmlns:cx5="http://schemas.microsoft.com/office/drawing/2016/5/11/chartex" xmlns:cx6="http://schemas.microsoft.com/office/drawing/2016/5/12/chartex" xmlns:cx7="http://schemas.microsoft.com/office/drawing/2016/5/13/chartex" xmlns:cx8="http://schemas.microsoft.com/office/drawing/2016/5/14/chartex" xmlns:mc="http://schemas.openxmlformats.org/markup-compatibility/2006" xmlns:aink="http://schemas.microsoft.com/office/drawing/2016/ink" xmlns:am3d="http://schemas.microsoft.com/office/drawing/2017/model3d" xmlns:o="urn:schemas-microsoft-com:office:office" xmlns:oel="http://schemas.microsoft.com/office/2019/extlst" xmlns:r="http://schemas.openxmlformats.org/officeDocument/2006/relationships" xmlns:m="http://schemas.openxmlformats.org/officeDocument/2006/math" xmlns:v="urn:schemas-microsoft-com:vml" xmlns:wp14="http://schemas.microsoft.com/office/word/2010/wordprocessingDrawing" xmlns:wp="http://schemas.openxmlformats.org/drawingml/2006/wordprocessingDrawing" xmlns:w10="urn:schemas-microsoft-com:office:word" xmlns:w="http://schemas.openxmlformats.org/wordprocessingml/2006/main" xmlns:w14="http://schemas.microsoft.com/office/word/2010/wordml" xmlns:w15="http://schemas.microsoft.com/office/word/2012/wordml" xmlns:w16cex="http://schemas.microsoft.com/office/word/2018/wordml/cex" xmlns:w16cid="http://schemas.microsoft.com/office/word/2016/wordml/cid" xmlns:w16="http://schemas.microsoft.com/office/word/2018/wordml" xmlns:w16du="http://schemas.microsoft.com/office/word/2023/wordml/word16du" xmlns:w16sdtdh="http://schemas.microsoft.com/office/word/2020/wordml/sdtdatahash" xmlns:w16sdtfl="http://schemas.microsoft.com/office/word/2024/wordml/sdtformatlock" xmlns:w16se="http://schemas.microsoft.com/office/word/2015/wordml/symex" xmlns:wpg="http://schemas.microsoft.com/office/word/2010/wordprocessingGroup" xmlns:wpi="http://schemas.microsoft.com/office/word/2010/wordprocessingInk" xmlns:wne="http://schemas.microsoft.com/office/word/2006/wordml" xmlns:wps="http://schemas.microsoft.com/office/word/2010/wordprocessingShape" mc:Ignorable="w14 w15 w16se w16cid w16 w16cex w16sdtdh w16sdtfl w16du wp14">
   <w:p>
     <w:pPr>
       <w:pStyle w:val="Footer"/>
@@ -12951,7 +13188,7 @@
 </file>
 
 <file path=word/footer2.xml><?xml version="1.0" encoding="utf-8"?>
-<w:ftr xmlns:wpc="http://schemas.microsoft.com/office/word/2010/wordprocessingCanvas" xmlns:cx="http://schemas.microsoft.com/office/drawing/2014/chartex" xmlns:cx1="http://schemas.microsoft.com/office/drawing/2015/9/8/chartex" xmlns:cx2="http://schemas.microsoft.com/office/drawing/2015/10/21/chartex" xmlns:cx3="http://schemas.microsoft.com/office/drawing/2016/5/9/chartex" xmlns:cx4="http://schemas.microsoft.com/office/drawing/2016/5/10/chartex" xmlns:cx5="http://schemas.microsoft.com/office/drawing/2016/5/11/chartex" xmlns:cx6="http://schemas.microsoft.com/office/drawing/2016/5/12/chartex" xmlns:cx7="http://schemas.microsoft.com/office/drawing/2016/5/13/chartex" xmlns:cx8="http://schemas.microsoft.com/office/drawing/2016/5/14/chartex" xmlns:mc="http://schemas.openxmlformats.org/markup-compatibility/2006" xmlns:aink="http://schemas.microsoft.com/office/drawing/2016/ink" xmlns:am3d="http://schemas.microsoft.com/office/drawing/2017/model3d" xmlns:o="urn:schemas-microsoft-com:office:office" xmlns:oel="http://schemas.microsoft.com/office/2019/extlst" xmlns:r="http://schemas.openxmlformats.org/officeDocument/2006/relationships" xmlns:m="http://schemas.openxmlformats.org/officeDocument/2006/math" xmlns:v="urn:schemas-microsoft-com:vml" xmlns:wp14="http://schemas.microsoft.com/office/word/2010/wordprocessingDrawing" xmlns:wp="http://schemas.openxmlformats.org/drawingml/2006/wordprocessingDrawing" xmlns:w10="urn:schemas-microsoft-com:office:word" xmlns:w="http://schemas.openxmlformats.org/wordprocessingml/2006/main" xmlns:w14="http://schemas.microsoft.com/office/word/2010/wordml" xmlns:w15="http://schemas.microsoft.com/office/word/2012/wordml" xmlns:w16cei="http://schemas.microsoft.com/office/word/2026/wordml/cei" xmlns:w16cex="http://schemas.microsoft.com/office/word/2018/wordml/cex" xmlns:w16cid="http://schemas.microsoft.com/office/word/2016/wordml/cid" xmlns:w16="http://schemas.microsoft.com/office/word/2018/wordml" xmlns:w16du="http://schemas.microsoft.com/office/word/2023/wordml/word16du" xmlns:w16sdtdh="http://schemas.microsoft.com/office/word/2020/wordml/sdtdatahash" xmlns:w16sdtfl="http://schemas.microsoft.com/office/word/2024/wordml/sdtformatlock" xmlns:w16se="http://schemas.microsoft.com/office/word/2015/wordml/symex" xmlns:wpg="http://schemas.microsoft.com/office/word/2010/wordprocessingGroup" xmlns:wpi="http://schemas.microsoft.com/office/word/2010/wordprocessingInk" xmlns:wne="http://schemas.microsoft.com/office/word/2006/wordml" xmlns:wps="http://schemas.microsoft.com/office/word/2010/wordprocessingShape" mc:Ignorable="w14 w15 w16se w16cid w16 w16cex w16sdtdh w16sdtfl w16du wp14">
+<w:ftr xmlns:wpc="http://schemas.microsoft.com/office/word/2010/wordprocessingCanvas" xmlns:cx="http://schemas.microsoft.com/office/drawing/2014/chartex" xmlns:cx1="http://schemas.microsoft.com/office/drawing/2015/9/8/chartex" xmlns:cx2="http://schemas.microsoft.com/office/drawing/2015/10/21/chartex" xmlns:cx3="http://schemas.microsoft.com/office/drawing/2016/5/9/chartex" xmlns:cx4="http://schemas.microsoft.com/office/drawing/2016/5/10/chartex" xmlns:cx5="http://schemas.microsoft.com/office/drawing/2016/5/11/chartex" xmlns:cx6="http://schemas.microsoft.com/office/drawing/2016/5/12/chartex" xmlns:cx7="http://schemas.microsoft.com/office/drawing/2016/5/13/chartex" xmlns:cx8="http://schemas.microsoft.com/office/drawing/2016/5/14/chartex" xmlns:mc="http://schemas.openxmlformats.org/markup-compatibility/2006" xmlns:aink="http://schemas.microsoft.com/office/drawing/2016/ink" xmlns:am3d="http://schemas.microsoft.com/office/drawing/2017/model3d" xmlns:o="urn:schemas-microsoft-com:office:office" xmlns:oel="http://schemas.microsoft.com/office/2019/extlst" xmlns:r="http://schemas.openxmlformats.org/officeDocument/2006/relationships" xmlns:m="http://schemas.openxmlformats.org/officeDocument/2006/math" xmlns:v="urn:schemas-microsoft-com:vml" xmlns:wp14="http://schemas.microsoft.com/office/word/2010/wordprocessingDrawing" xmlns:wp="http://schemas.openxmlformats.org/drawingml/2006/wordprocessingDrawing" xmlns:w10="urn:schemas-microsoft-com:office:word" xmlns:w="http://schemas.openxmlformats.org/wordprocessingml/2006/main" xmlns:w14="http://schemas.microsoft.com/office/word/2010/wordml" xmlns:w15="http://schemas.microsoft.com/office/word/2012/wordml" xmlns:w16cex="http://schemas.microsoft.com/office/word/2018/wordml/cex" xmlns:w16cid="http://schemas.microsoft.com/office/word/2016/wordml/cid" xmlns:w16="http://schemas.microsoft.com/office/word/2018/wordml" xmlns:w16du="http://schemas.microsoft.com/office/word/2023/wordml/word16du" xmlns:w16sdtdh="http://schemas.microsoft.com/office/word/2020/wordml/sdtdatahash" xmlns:w16sdtfl="http://schemas.microsoft.com/office/word/2024/wordml/sdtformatlock" xmlns:w16se="http://schemas.microsoft.com/office/word/2015/wordml/symex" xmlns:wpg="http://schemas.microsoft.com/office/word/2010/wordprocessingGroup" xmlns:wpi="http://schemas.microsoft.com/office/word/2010/wordprocessingInk" xmlns:wne="http://schemas.microsoft.com/office/word/2006/wordml" xmlns:wps="http://schemas.microsoft.com/office/word/2010/wordprocessingShape" mc:Ignorable="w14 w15 w16se w16cid w16 w16cex w16sdtdh w16sdtfl w16du wp14">
   <w:p>
     <w:pPr>
       <w:pStyle w:val="Footer"/>
@@ -13007,7 +13244,7 @@
 </file>
 
 <file path=word/footnotes.xml><?xml version="1.0" encoding="utf-8"?>
-<w:footnotes xmlns:wpc="http://schemas.microsoft.com/office/word/2010/wordprocessingCanvas" xmlns:cx="http://schemas.microsoft.com/office/drawing/2014/chartex" xmlns:cx1="http://schemas.microsoft.com/office/drawing/2015/9/8/chartex" xmlns:cx2="http://schemas.microsoft.com/office/drawing/2015/10/21/chartex" xmlns:cx3="http://schemas.microsoft.com/office/drawing/2016/5/9/chartex" xmlns:cx4="http://schemas.microsoft.com/office/drawing/2016/5/10/chartex" xmlns:cx5="http://schemas.microsoft.com/office/drawing/2016/5/11/chartex" xmlns:cx6="http://schemas.microsoft.com/office/drawing/2016/5/12/chartex" xmlns:cx7="http://schemas.microsoft.com/office/drawing/2016/5/13/chartex" xmlns:cx8="http://schemas.microsoft.com/office/drawing/2016/5/14/chartex" xmlns:mc="http://schemas.openxmlformats.org/markup-compatibility/2006" xmlns:aink="http://schemas.microsoft.com/office/drawing/2016/ink" xmlns:am3d="http://schemas.microsoft.com/office/drawing/2017/model3d" xmlns:o="urn:schemas-microsoft-com:office:office" xmlns:oel="http://schemas.microsoft.com/office/2019/extlst" xmlns:r="http://schemas.openxmlformats.org/officeDocument/2006/relationships" xmlns:m="http://schemas.openxmlformats.org/officeDocument/2006/math" xmlns:v="urn:schemas-microsoft-com:vml" xmlns:wp14="http://schemas.microsoft.com/office/word/2010/wordprocessingDrawing" xmlns:wp="http://schemas.openxmlformats.org/drawingml/2006/wordprocessingDrawing" xmlns:w10="urn:schemas-microsoft-com:office:word" xmlns:w="http://schemas.openxmlformats.org/wordprocessingml/2006/main" xmlns:w14="http://schemas.microsoft.com/office/word/2010/wordml" xmlns:w15="http://schemas.microsoft.com/office/word/2012/wordml" xmlns:w16cei="http://schemas.microsoft.com/office/word/2026/wordml/cei" xmlns:w16cex="http://schemas.microsoft.com/office/word/2018/wordml/cex" xmlns:w16cid="http://schemas.microsoft.com/office/word/2016/wordml/cid" xmlns:w16="http://schemas.microsoft.com/office/word/2018/wordml" xmlns:w16du="http://schemas.microsoft.com/office/word/2023/wordml/word16du" xmlns:w16sdtdh="http://schemas.microsoft.com/office/word/2020/wordml/sdtdatahash" xmlns:w16sdtfl="http://schemas.microsoft.com/office/word/2024/wordml/sdtformatlock" xmlns:w16se="http://schemas.microsoft.com/office/word/2015/wordml/symex" xmlns:wpg="http://schemas.microsoft.com/office/word/2010/wordprocessingGroup" xmlns:wpi="http://schemas.microsoft.com/office/word/2010/wordprocessingInk" xmlns:wne="http://schemas.microsoft.com/office/word/2006/wordml" xmlns:wps="http://schemas.microsoft.com/office/word/2010/wordprocessingShape" mc:Ignorable="w14 w15 w16se w16cid w16 w16cex w16sdtdh w16sdtfl w16du wp14">
+<w:footnotes xmlns:wpc="http://schemas.microsoft.com/office/word/2010/wordprocessingCanvas" xmlns:cx="http://schemas.microsoft.com/office/drawing/2014/chartex" xmlns:cx1="http://schemas.microsoft.com/office/drawing/2015/9/8/chartex" xmlns:cx2="http://schemas.microsoft.com/office/drawing/2015/10/21/chartex" xmlns:cx3="http://schemas.microsoft.com/office/drawing/2016/5/9/chartex" xmlns:cx4="http://schemas.microsoft.com/office/drawing/2016/5/10/chartex" xmlns:cx5="http://schemas.microsoft.com/office/drawing/2016/5/11/chartex" xmlns:cx6="http://schemas.microsoft.com/office/drawing/2016/5/12/chartex" xmlns:cx7="http://schemas.microsoft.com/office/drawing/2016/5/13/chartex" xmlns:cx8="http://schemas.microsoft.com/office/drawing/2016/5/14/chartex" xmlns:mc="http://schemas.openxmlformats.org/markup-compatibility/2006" xmlns:aink="http://schemas.microsoft.com/office/drawing/2016/ink" xmlns:am3d="http://schemas.microsoft.com/office/drawing/2017/model3d" xmlns:o="urn:schemas-microsoft-com:office:office" xmlns:oel="http://schemas.microsoft.com/office/2019/extlst" xmlns:r="http://schemas.openxmlformats.org/officeDocument/2006/relationships" xmlns:m="http://schemas.openxmlformats.org/officeDocument/2006/math" xmlns:v="urn:schemas-microsoft-com:vml" xmlns:wp14="http://schemas.microsoft.com/office/word/2010/wordprocessingDrawing" xmlns:wp="http://schemas.openxmlformats.org/drawingml/2006/wordprocessingDrawing" xmlns:w10="urn:schemas-microsoft-com:office:word" xmlns:w="http://schemas.openxmlformats.org/wordprocessingml/2006/main" xmlns:w14="http://schemas.microsoft.com/office/word/2010/wordml" xmlns:w15="http://schemas.microsoft.com/office/word/2012/wordml" xmlns:w16cex="http://schemas.microsoft.com/office/word/2018/wordml/cex" xmlns:w16cid="http://schemas.microsoft.com/office/word/2016/wordml/cid" xmlns:w16="http://schemas.microsoft.com/office/word/2018/wordml" xmlns:w16du="http://schemas.microsoft.com/office/word/2023/wordml/word16du" xmlns:w16sdtdh="http://schemas.microsoft.com/office/word/2020/wordml/sdtdatahash" xmlns:w16sdtfl="http://schemas.microsoft.com/office/word/2024/wordml/sdtformatlock" xmlns:w16se="http://schemas.microsoft.com/office/word/2015/wordml/symex" xmlns:wpg="http://schemas.microsoft.com/office/word/2010/wordprocessingGroup" xmlns:wpi="http://schemas.microsoft.com/office/word/2010/wordprocessingInk" xmlns:wne="http://schemas.microsoft.com/office/word/2006/wordml" xmlns:wps="http://schemas.microsoft.com/office/word/2010/wordprocessingShape" mc:Ignorable="w14 w15 w16se w16cid w16 w16cex w16sdtdh w16sdtfl w16du wp14">
   <w:footnote w:type="separator" w:id="-1">
     <w:p>
       <w:pPr>
@@ -13032,7 +13269,7 @@
 </file>
 
 <file path=word/header1.xml><?xml version="1.0" encoding="utf-8"?>
-<w:hdr xmlns:wpc="http://schemas.microsoft.com/office/word/2010/wordprocessingCanvas" xmlns:cx="http://schemas.microsoft.com/office/drawing/2014/chartex" xmlns:cx1="http://schemas.microsoft.com/office/drawing/2015/9/8/chartex" xmlns:cx2="http://schemas.microsoft.com/office/drawing/2015/10/21/chartex" xmlns:cx3="http://schemas.microsoft.com/office/drawing/2016/5/9/chartex" xmlns:cx4="http://schemas.microsoft.com/office/drawing/2016/5/10/chartex" xmlns:cx5="http://schemas.microsoft.com/office/drawing/2016/5/11/chartex" xmlns:cx6="http://schemas.microsoft.com/office/drawing/2016/5/12/chartex" xmlns:cx7="http://schemas.microsoft.com/office/drawing/2016/5/13/chartex" xmlns:cx8="http://schemas.microsoft.com/office/drawing/2016/5/14/chartex" xmlns:mc="http://schemas.openxmlformats.org/markup-compatibility/2006" xmlns:aink="http://schemas.microsoft.com/office/drawing/2016/ink" xmlns:am3d="http://schemas.microsoft.com/office/drawing/2017/model3d" xmlns:o="urn:schemas-microsoft-com:office:office" xmlns:oel="http://schemas.microsoft.com/office/2019/extlst" xmlns:r="http://schemas.openxmlformats.org/officeDocument/2006/relationships" xmlns:m="http://schemas.openxmlformats.org/officeDocument/2006/math" xmlns:v="urn:schemas-microsoft-com:vml" xmlns:wp14="http://schemas.microsoft.com/office/word/2010/wordprocessingDrawing" xmlns:wp="http://schemas.openxmlformats.org/drawingml/2006/wordprocessingDrawing" xmlns:w10="urn:schemas-microsoft-com:office:word" xmlns:w="http://schemas.openxmlformats.org/wordprocessingml/2006/main" xmlns:w14="http://schemas.microsoft.com/office/word/2010/wordml" xmlns:w15="http://schemas.microsoft.com/office/word/2012/wordml" xmlns:w16cei="http://schemas.microsoft.com/office/word/2026/wordml/cei" xmlns:w16cex="http://schemas.microsoft.com/office/word/2018/wordml/cex" xmlns:w16cid="http://schemas.microsoft.com/office/word/2016/wordml/cid" xmlns:w16="http://schemas.microsoft.com/office/word/2018/wordml" xmlns:w16du="http://schemas.microsoft.com/office/word/2023/wordml/word16du" xmlns:w16sdtdh="http://schemas.microsoft.com/office/word/2020/wordml/sdtdatahash" xmlns:w16sdtfl="http://schemas.microsoft.com/office/word/2024/wordml/sdtformatlock" xmlns:w16se="http://schemas.microsoft.com/office/word/2015/wordml/symex" xmlns:wpg="http://schemas.microsoft.com/office/word/2010/wordprocessingGroup" xmlns:wpi="http://schemas.microsoft.com/office/word/2010/wordprocessingInk" xmlns:wne="http://schemas.microsoft.com/office/word/2006/wordml" xmlns:wps="http://schemas.microsoft.com/office/word/2010/wordprocessingShape" mc:Ignorable="w14 w15 w16se w16cid w16 w16cex w16sdtdh w16sdtfl w16du wp14">
+<w:hdr xmlns:wpc="http://schemas.microsoft.com/office/word/2010/wordprocessingCanvas" xmlns:cx="http://schemas.microsoft.com/office/drawing/2014/chartex" xmlns:cx1="http://schemas.microsoft.com/office/drawing/2015/9/8/chartex" xmlns:cx2="http://schemas.microsoft.com/office/drawing/2015/10/21/chartex" xmlns:cx3="http://schemas.microsoft.com/office/drawing/2016/5/9/chartex" xmlns:cx4="http://schemas.microsoft.com/office/drawing/2016/5/10/chartex" xmlns:cx5="http://schemas.microsoft.com/office/drawing/2016/5/11/chartex" xmlns:cx6="http://schemas.microsoft.com/office/drawing/2016/5/12/chartex" xmlns:cx7="http://schemas.microsoft.com/office/drawing/2016/5/13/chartex" xmlns:cx8="http://schemas.microsoft.com/office/drawing/2016/5/14/chartex" xmlns:mc="http://schemas.openxmlformats.org/markup-compatibility/2006" xmlns:aink="http://schemas.microsoft.com/office/drawing/2016/ink" xmlns:am3d="http://schemas.microsoft.com/office/drawing/2017/model3d" xmlns:o="urn:schemas-microsoft-com:office:office" xmlns:oel="http://schemas.microsoft.com/office/2019/extlst" xmlns:r="http://schemas.openxmlformats.org/officeDocument/2006/relationships" xmlns:m="http://schemas.openxmlformats.org/officeDocument/2006/math" xmlns:v="urn:schemas-microsoft-com:vml" xmlns:wp14="http://schemas.microsoft.com/office/word/2010/wordprocessingDrawing" xmlns:wp="http://schemas.openxmlformats.org/drawingml/2006/wordprocessingDrawing" xmlns:w10="urn:schemas-microsoft-com:office:word" xmlns:w="http://schemas.openxmlformats.org/wordprocessingml/2006/main" xmlns:w14="http://schemas.microsoft.com/office/word/2010/wordml" xmlns:w15="http://schemas.microsoft.com/office/word/2012/wordml" xmlns:w16cex="http://schemas.microsoft.com/office/word/2018/wordml/cex" xmlns:w16cid="http://schemas.microsoft.com/office/word/2016/wordml/cid" xmlns:w16="http://schemas.microsoft.com/office/word/2018/wordml" xmlns:w16du="http://schemas.microsoft.com/office/word/2023/wordml/word16du" xmlns:w16sdtdh="http://schemas.microsoft.com/office/word/2020/wordml/sdtdatahash" xmlns:w16sdtfl="http://schemas.microsoft.com/office/word/2024/wordml/sdtformatlock" xmlns:w16se="http://schemas.microsoft.com/office/word/2015/wordml/symex" xmlns:wpg="http://schemas.microsoft.com/office/word/2010/wordprocessingGroup" xmlns:wpi="http://schemas.microsoft.com/office/word/2010/wordprocessingInk" xmlns:wne="http://schemas.microsoft.com/office/word/2006/wordml" xmlns:wps="http://schemas.microsoft.com/office/word/2010/wordprocessingShape" mc:Ignorable="w14 w15 w16se w16cid w16 w16cex w16sdtdh w16sdtfl w16du wp14">
   <w:p>
     <w:pPr>
       <w:pStyle w:val="Header"/>
@@ -13052,7 +13289,7 @@
 </file>
 
 <file path=word/numbering.xml><?xml version="1.0" encoding="utf-8"?>
-<w:numbering xmlns:wpc="http://schemas.microsoft.com/office/word/2010/wordprocessingCanvas" xmlns:cx="http://schemas.microsoft.com/office/drawing/2014/chartex" xmlns:cx1="http://schemas.microsoft.com/office/drawing/2015/9/8/chartex" xmlns:cx2="http://schemas.microsoft.com/office/drawing/2015/10/21/chartex" xmlns:cx3="http://schemas.microsoft.com/office/drawing/2016/5/9/chartex" xmlns:cx4="http://schemas.microsoft.com/office/drawing/2016/5/10/chartex" xmlns:cx5="http://schemas.microsoft.com/office/drawing/2016/5/11/chartex" xmlns:cx6="http://schemas.microsoft.com/office/drawing/2016/5/12/chartex" xmlns:cx7="http://schemas.microsoft.com/office/drawing/2016/5/13/chartex" xmlns:cx8="http://schemas.microsoft.com/office/drawing/2016/5/14/chartex" xmlns:mc="http://schemas.openxmlformats.org/markup-compatibility/2006" xmlns:aink="http://schemas.microsoft.com/office/drawing/2016/ink" xmlns:am3d="http://schemas.microsoft.com/office/drawing/2017/model3d" xmlns:o="urn:schemas-microsoft-com:office:office" xmlns:oel="http://schemas.microsoft.com/office/2019/extlst" xmlns:r="http://schemas.openxmlformats.org/officeDocument/2006/relationships" xmlns:m="http://schemas.openxmlformats.org/officeDocument/2006/math" xmlns:v="urn:schemas-microsoft-com:vml" xmlns:wp14="http://schemas.microsoft.com/office/word/2010/wordprocessingDrawing" xmlns:wp="http://schemas.openxmlformats.org/drawingml/2006/wordprocessingDrawing" xmlns:w10="urn:schemas-microsoft-com:office:word" xmlns:w="http://schemas.openxmlformats.org/wordprocessingml/2006/main" xmlns:w14="http://schemas.microsoft.com/office/word/2010/wordml" xmlns:w15="http://schemas.microsoft.com/office/word/2012/wordml" xmlns:w16cei="http://schemas.microsoft.com/office/word/2026/wordml/cei" xmlns:w16cex="http://schemas.microsoft.com/office/word/2018/wordml/cex" xmlns:w16cid="http://schemas.microsoft.com/office/word/2016/wordml/cid" xmlns:w16="http://schemas.microsoft.com/office/word/2018/wordml" xmlns:w16du="http://schemas.microsoft.com/office/word/2023/wordml/word16du" xmlns:w16sdtdh="http://schemas.microsoft.com/office/word/2020/wordml/sdtdatahash" xmlns:w16sdtfl="http://schemas.microsoft.com/office/word/2024/wordml/sdtformatlock" xmlns:w16se="http://schemas.microsoft.com/office/word/2015/wordml/symex" xmlns:wpg="http://schemas.microsoft.com/office/word/2010/wordprocessingGroup" xmlns:wpi="http://schemas.microsoft.com/office/word/2010/wordprocessingInk" xmlns:wne="http://schemas.microsoft.com/office/word/2006/wordml" xmlns:wps="http://schemas.microsoft.com/office/word/2010/wordprocessingShape" mc:Ignorable="w14 w15 w16se w16cid w16 w16cex w16sdtdh w16sdtfl w16du wp14">
+<w:numbering xmlns:wpc="http://schemas.microsoft.com/office/word/2010/wordprocessingCanvas" xmlns:cx="http://schemas.microsoft.com/office/drawing/2014/chartex" xmlns:cx1="http://schemas.microsoft.com/office/drawing/2015/9/8/chartex" xmlns:cx2="http://schemas.microsoft.com/office/drawing/2015/10/21/chartex" xmlns:cx3="http://schemas.microsoft.com/office/drawing/2016/5/9/chartex" xmlns:cx4="http://schemas.microsoft.com/office/drawing/2016/5/10/chartex" xmlns:cx5="http://schemas.microsoft.com/office/drawing/2016/5/11/chartex" xmlns:cx6="http://schemas.microsoft.com/office/drawing/2016/5/12/chartex" xmlns:cx7="http://schemas.microsoft.com/office/drawing/2016/5/13/chartex" xmlns:cx8="http://schemas.microsoft.com/office/drawing/2016/5/14/chartex" xmlns:mc="http://schemas.openxmlformats.org/markup-compatibility/2006" xmlns:aink="http://schemas.microsoft.com/office/drawing/2016/ink" xmlns:am3d="http://schemas.microsoft.com/office/drawing/2017/model3d" xmlns:o="urn:schemas-microsoft-com:office:office" xmlns:oel="http://schemas.microsoft.com/office/2019/extlst" xmlns:r="http://schemas.openxmlformats.org/officeDocument/2006/relationships" xmlns:m="http://schemas.openxmlformats.org/officeDocument/2006/math" xmlns:v="urn:schemas-microsoft-com:vml" xmlns:wp14="http://schemas.microsoft.com/office/word/2010/wordprocessingDrawing" xmlns:wp="http://schemas.openxmlformats.org/drawingml/2006/wordprocessingDrawing" xmlns:w10="urn:schemas-microsoft-com:office:word" xmlns:w="http://schemas.openxmlformats.org/wordprocessingml/2006/main" xmlns:w14="http://schemas.microsoft.com/office/word/2010/wordml" xmlns:w15="http://schemas.microsoft.com/office/word/2012/wordml" xmlns:w16cex="http://schemas.microsoft.com/office/word/2018/wordml/cex" xmlns:w16cid="http://schemas.microsoft.com/office/word/2016/wordml/cid" xmlns:w16="http://schemas.microsoft.com/office/word/2018/wordml" xmlns:w16du="http://schemas.microsoft.com/office/word/2023/wordml/word16du" xmlns:w16sdtdh="http://schemas.microsoft.com/office/word/2020/wordml/sdtdatahash" xmlns:w16sdtfl="http://schemas.microsoft.com/office/word/2024/wordml/sdtformatlock" xmlns:w16se="http://schemas.microsoft.com/office/word/2015/wordml/symex" xmlns:wpg="http://schemas.microsoft.com/office/word/2010/wordprocessingGroup" xmlns:wpi="http://schemas.microsoft.com/office/word/2010/wordprocessingInk" xmlns:wne="http://schemas.microsoft.com/office/word/2006/wordml" xmlns:wps="http://schemas.microsoft.com/office/word/2010/wordprocessingShape" mc:Ignorable="w14 w15 w16se w16cid w16 w16cex w16sdtdh w16sdtfl w16du wp14">
   <w:abstractNum w:abstractNumId="0" w15:restartNumberingAfterBreak="0">
     <w:nsid w:val="0055775C"/>
     <w:multiLevelType w:val="hybridMultilevel"/>

</xml_diff>